<commit_message>
Add Database for Products, News, Orders & Cart
</commit_message>
<xml_diff>
--- a/Информационный сайт отдела.docx
+++ b/Информационный сайт отдела.docx
@@ -74,7 +74,6 @@
         </w:rPr>
         <w:t xml:space="preserve"> (чат в </w:t>
       </w:r>
-      <w:proofErr w:type="spellStart"/>
       <w:r>
         <w:rPr>
           <w:sz w:val="32"/>
@@ -83,7 +82,6 @@
         </w:rPr>
         <w:t>Qwen</w:t>
       </w:r>
-      <w:proofErr w:type="spellEnd"/>
       <w:r>
         <w:rPr>
           <w:sz w:val="32"/>
@@ -112,43 +110,89 @@
           <w:sz w:val="32"/>
           <w:szCs w:val="32"/>
         </w:rPr>
-        <w:t xml:space="preserve">Создать </w:t>
-      </w:r>
-      <w:r>
-        <w:rPr>
-          <w:sz w:val="32"/>
-          <w:szCs w:val="32"/>
-        </w:rPr>
-        <w:t>БД для сайта (таблицу для товаров</w:t>
-      </w:r>
-      <w:r>
-        <w:rPr>
-          <w:sz w:val="32"/>
-          <w:szCs w:val="32"/>
-        </w:rPr>
-        <w:t>, новинок, новостей</w:t>
-      </w:r>
-      <w:r>
-        <w:rPr>
-          <w:sz w:val="32"/>
-          <w:szCs w:val="32"/>
-        </w:rPr>
-        <w:t xml:space="preserve">, для пользователей (если будем делать авторизацию/регистрацию), </w:t>
-      </w:r>
-      <w:r>
-        <w:rPr>
-          <w:sz w:val="32"/>
-          <w:szCs w:val="32"/>
-          <w:highlight w:val="yellow"/>
-        </w:rPr>
-        <w:t>для корзины, для избранного, для сравнения (под вопросом)</w:t>
-      </w:r>
-      <w:r>
-        <w:rPr>
-          <w:sz w:val="32"/>
-          <w:szCs w:val="32"/>
-        </w:rPr>
-        <w:t>)</w:t>
+        <w:t xml:space="preserve">Создать БД </w:t>
+      </w:r>
+      <w:r>
+        <w:rPr>
+          <w:sz w:val="32"/>
+          <w:szCs w:val="32"/>
+        </w:rPr>
+        <w:t xml:space="preserve">для сайта (таблицу для </w:t>
+      </w:r>
+      <w:r>
+        <w:rPr>
+          <w:color w:val="00B050"/>
+          <w:sz w:val="32"/>
+          <w:szCs w:val="32"/>
+        </w:rPr>
+        <w:t>товаров</w:t>
+      </w:r>
+      <w:r>
+        <w:rPr>
+          <w:sz w:val="32"/>
+          <w:szCs w:val="32"/>
+        </w:rPr>
+        <w:t>,</w:t>
+      </w:r>
+      <w:r>
+        <w:rPr>
+          <w:sz w:val="32"/>
+          <w:szCs w:val="32"/>
+        </w:rPr>
+        <w:t xml:space="preserve"> </w:t>
+      </w:r>
+      <w:r>
+        <w:rPr>
+          <w:color w:val="00B050"/>
+          <w:sz w:val="32"/>
+          <w:szCs w:val="32"/>
+        </w:rPr>
+        <w:t>корзины</w:t>
+      </w:r>
+      <w:r>
+        <w:rPr>
+          <w:color w:val="00B050"/>
+          <w:sz w:val="32"/>
+          <w:szCs w:val="32"/>
+        </w:rPr>
+        <w:t>,</w:t>
+      </w:r>
+      <w:r>
+        <w:rPr>
+          <w:color w:val="00B050"/>
+          <w:sz w:val="32"/>
+          <w:szCs w:val="32"/>
+        </w:rPr>
+        <w:t xml:space="preserve"> </w:t>
+      </w:r>
+      <w:r>
+        <w:rPr>
+          <w:color w:val="00B050"/>
+          <w:sz w:val="32"/>
+          <w:szCs w:val="32"/>
+        </w:rPr>
+        <w:t>новостей</w:t>
+      </w:r>
+      <w:r>
+        <w:rPr>
+          <w:sz w:val="32"/>
+          <w:szCs w:val="32"/>
+        </w:rPr>
+        <w:t xml:space="preserve"> новинок</w:t>
+      </w:r>
+      <w:r>
+        <w:rPr>
+          <w:sz w:val="32"/>
+          <w:szCs w:val="32"/>
+        </w:rPr>
+        <w:t>, для пользователей (если будем делать авторизацию/регистрацию)</w:t>
+      </w:r>
+      <w:r>
+        <w:rPr>
+          <w:sz w:val="32"/>
+          <w:szCs w:val="32"/>
+        </w:rPr>
+        <w:t>))</w:t>
       </w:r>
     </w:p>
     <w:p>
@@ -161,7 +205,6 @@
         <w:spacing w:after="0" w:line="360" w:lineRule="auto"/>
         <w:jc w:val="both"/>
         <w:rPr>
-          <w:color w:val="00B050"/>
           <w:sz w:val="32"/>
           <w:szCs w:val="32"/>
         </w:rPr>
@@ -185,23 +228,51 @@
         <w:spacing w:after="0" w:line="360" w:lineRule="auto"/>
         <w:jc w:val="both"/>
         <w:rPr>
-          <w:sz w:val="32"/>
-          <w:szCs w:val="32"/>
-        </w:rPr>
-      </w:pPr>
-      <w:r>
-        <w:rPr>
-          <w:sz w:val="32"/>
-          <w:szCs w:val="32"/>
-        </w:rPr>
-        <w:t xml:space="preserve">Сделать </w:t>
-      </w:r>
-      <w:r>
-        <w:rPr>
-          <w:sz w:val="32"/>
-          <w:szCs w:val="32"/>
-        </w:rPr>
-        <w:t>нажатие на новость с главной страницы</w:t>
+          <w:color w:val="FF0000"/>
+          <w:sz w:val="32"/>
+          <w:szCs w:val="32"/>
+        </w:rPr>
+      </w:pPr>
+      <w:r>
+        <w:rPr>
+          <w:sz w:val="32"/>
+          <w:szCs w:val="32"/>
+          <w:highlight w:val="yellow"/>
+        </w:rPr>
+        <w:t>В хедере добавить кнопки типа услуг, контактов, продукции и т.д.</w:t>
+      </w:r>
+      <w:r>
+        <w:rPr>
+          <w:sz w:val="32"/>
+          <w:szCs w:val="32"/>
+          <w:highlight w:val="yellow"/>
+        </w:rPr>
+        <w:t xml:space="preserve"> (см. </w:t>
+      </w:r>
+      <w:r>
+        <w:rPr>
+          <w:sz w:val="32"/>
+          <w:szCs w:val="32"/>
+          <w:highlight w:val="yellow"/>
+          <w:lang w:val="en-US"/>
+        </w:rPr>
+        <w:t>INWAVE</w:t>
+      </w:r>
+      <w:r>
+        <w:rPr>
+          <w:sz w:val="32"/>
+          <w:szCs w:val="32"/>
+          <w:highlight w:val="yellow"/>
+        </w:rPr>
+        <w:t>)</w:t>
+      </w:r>
+      <w:r>
+        <w:rPr>
+          <w:sz w:val="32"/>
+          <w:szCs w:val="32"/>
+          <w:highlight w:val="yellow"/>
+        </w:rPr>
+        <w:t xml:space="preserve"> (обговорить)</w:t>
       </w:r>
     </w:p>
     <w:p>
@@ -221,44 +292,27 @@
       </w:pPr>
       <w:r>
         <w:rPr>
-          <w:sz w:val="32"/>
-          <w:szCs w:val="32"/>
-          <w:highlight w:val="yellow"/>
-        </w:rPr>
-        <w:t>В хедере добавить кнопки типа услуг, контактов, продукции и т.д.</w:t>
-      </w:r>
-      <w:r>
-        <w:rPr>
-          <w:sz w:val="32"/>
-          <w:szCs w:val="32"/>
-          <w:highlight w:val="yellow"/>
-        </w:rPr>
-        <w:t xml:space="preserve"> (см. </w:t>
-      </w:r>
-      <w:r>
-        <w:rPr>
-          <w:sz w:val="32"/>
-          <w:szCs w:val="32"/>
-          <w:highlight w:val="yellow"/>
-          <w:lang w:val="en-US"/>
-        </w:rPr>
-        <w:t>INWAVE</w:t>
-      </w:r>
-      <w:r>
-        <w:rPr>
-          <w:sz w:val="32"/>
-          <w:szCs w:val="32"/>
-          <w:highlight w:val="yellow"/>
-        </w:rPr>
-        <w:t>)</w:t>
-      </w:r>
-      <w:r>
-        <w:rPr>
-          <w:sz w:val="32"/>
-          <w:szCs w:val="32"/>
-          <w:highlight w:val="yellow"/>
-        </w:rPr>
-        <w:t xml:space="preserve"> (обговорить)</w:t>
+          <w:color w:val="FF0000"/>
+          <w:sz w:val="32"/>
+          <w:szCs w:val="32"/>
+        </w:rPr>
+        <w:t xml:space="preserve">В </w:t>
+      </w:r>
+      <w:r>
+        <w:rPr>
+          <w:color w:val="FF0000"/>
+          <w:sz w:val="32"/>
+          <w:szCs w:val="32"/>
+        </w:rPr>
+        <w:t>телеграм-</w:t>
+      </w:r>
+      <w:r>
+        <w:rPr>
+          <w:color w:val="FF0000"/>
+          <w:sz w:val="32"/>
+          <w:szCs w:val="32"/>
+        </w:rPr>
+        <w:t>бота добавить пару функций (услуги и прочее)</w:t>
       </w:r>
     </w:p>
     <w:p>
@@ -271,36 +325,40 @@
         <w:spacing w:after="0" w:line="360" w:lineRule="auto"/>
         <w:jc w:val="both"/>
         <w:rPr>
+          <w:szCs w:val="24"/>
+        </w:rPr>
+      </w:pPr>
+      <w:r>
+        <w:rPr>
           <w:color w:val="FF0000"/>
           <w:sz w:val="32"/>
           <w:szCs w:val="32"/>
         </w:rPr>
-      </w:pPr>
+        <w:t>Не должно быть</w:t>
+      </w:r>
       <w:r>
         <w:rPr>
           <w:color w:val="FF0000"/>
           <w:sz w:val="32"/>
           <w:szCs w:val="32"/>
         </w:rPr>
-        <w:t xml:space="preserve">В </w:t>
-      </w:r>
-      <w:proofErr w:type="spellStart"/>
+        <w:t xml:space="preserve"> битых ссылок</w:t>
+      </w:r>
       <w:r>
         <w:rPr>
           <w:color w:val="FF0000"/>
           <w:sz w:val="32"/>
           <w:szCs w:val="32"/>
         </w:rPr>
-        <w:t>телеграм</w:t>
-      </w:r>
-      <w:proofErr w:type="spellEnd"/>
+        <w:t xml:space="preserve"> (</w:t>
+      </w:r>
       <w:r>
         <w:rPr>
           <w:color w:val="FF0000"/>
           <w:sz w:val="32"/>
           <w:szCs w:val="32"/>
         </w:rPr>
-        <w:t>-</w:t>
+        <w:t xml:space="preserve">страницы «О </w:t>
       </w:r>
       <w:r>
         <w:rPr>
@@ -308,29 +366,15 @@
           <w:sz w:val="32"/>
           <w:szCs w:val="32"/>
         </w:rPr>
-        <w:t>бота добавить пару функций (услуги и прочее)</w:t>
-      </w:r>
-    </w:p>
-    <w:p>
-      <w:pPr>
-        <w:pStyle w:val="a3"/>
-        <w:numPr>
-          <w:ilvl w:val="0"/>
-          <w:numId w:val="4"/>
-        </w:numPr>
-        <w:spacing w:after="0" w:line="360" w:lineRule="auto"/>
-        <w:jc w:val="both"/>
-        <w:rPr>
-          <w:szCs w:val="24"/>
-        </w:rPr>
-      </w:pPr>
+        <w:t>компании»</w:t>
+      </w:r>
       <w:r>
         <w:rPr>
           <w:color w:val="FF0000"/>
           <w:sz w:val="32"/>
           <w:szCs w:val="32"/>
         </w:rPr>
-        <w:t>Доделать сайт до того, чтобы не было битых ссылок</w:t>
+        <w:t>, «Услуги», «Доставка», «Сервис», «Служба поддержки»</w:t>
       </w:r>
       <w:r>
         <w:rPr>
@@ -338,207 +382,166 @@
           <w:sz w:val="32"/>
           <w:szCs w:val="32"/>
         </w:rPr>
+        <w:t xml:space="preserve">, </w:t>
+      </w:r>
+      <w:r>
+        <w:rPr>
+          <w:color w:val="FF0000"/>
+          <w:sz w:val="32"/>
+          <w:szCs w:val="32"/>
+        </w:rPr>
+        <w:t>а также ссылки на категории товаров из хедера</w:t>
+      </w:r>
+      <w:r>
+        <w:rPr>
+          <w:color w:val="FF0000"/>
+          <w:sz w:val="32"/>
+          <w:szCs w:val="32"/>
+        </w:rPr>
+        <w:t>)</w:t>
+      </w:r>
+    </w:p>
+    <w:p>
+      <w:pPr>
+        <w:spacing w:after="0" w:line="360" w:lineRule="auto"/>
+        <w:jc w:val="both"/>
+        <w:rPr>
+          <w:szCs w:val="24"/>
+        </w:rPr>
+      </w:pPr>
+    </w:p>
+    <w:p>
+      <w:pPr>
+        <w:spacing w:after="0" w:line="360" w:lineRule="auto"/>
+        <w:jc w:val="both"/>
+        <w:rPr>
+          <w:szCs w:val="24"/>
+        </w:rPr>
+      </w:pPr>
+      <w:r>
+        <w:rPr>
+          <w:szCs w:val="24"/>
+        </w:rPr>
+        <w:t>Страницы:</w:t>
+      </w:r>
+    </w:p>
+    <w:p>
+      <w:pPr>
+        <w:spacing w:after="0" w:line="360" w:lineRule="auto"/>
+        <w:jc w:val="both"/>
+        <w:rPr>
+          <w:color w:val="00B050"/>
+          <w:szCs w:val="24"/>
+        </w:rPr>
+      </w:pPr>
+      <w:r>
+        <w:rPr>
+          <w:color w:val="00B050"/>
+          <w:szCs w:val="24"/>
+        </w:rPr>
+        <w:t>Главная страница</w:t>
+      </w:r>
+    </w:p>
+    <w:p>
+      <w:pPr>
+        <w:spacing w:after="0" w:line="360" w:lineRule="auto"/>
+        <w:jc w:val="both"/>
+        <w:rPr>
+          <w:color w:val="00B050"/>
+          <w:szCs w:val="24"/>
+        </w:rPr>
+      </w:pPr>
+      <w:r>
+        <w:rPr>
+          <w:color w:val="00B050"/>
+          <w:szCs w:val="24"/>
+        </w:rPr>
+        <w:t>Каталог товаров</w:t>
+      </w:r>
+      <w:r>
+        <w:rPr>
+          <w:color w:val="00B050"/>
+          <w:szCs w:val="24"/>
+        </w:rPr>
         <w:t xml:space="preserve"> (</w:t>
       </w:r>
       <w:r>
         <w:rPr>
-          <w:color w:val="FF0000"/>
-          <w:sz w:val="32"/>
-          <w:szCs w:val="32"/>
-        </w:rPr>
-        <w:t xml:space="preserve">страницы «О </w:t>
-      </w:r>
-      <w:r>
-        <w:rPr>
-          <w:color w:val="FF0000"/>
-          <w:sz w:val="32"/>
-          <w:szCs w:val="32"/>
-        </w:rPr>
-        <w:t>компании»</w:t>
-      </w:r>
-      <w:r>
-        <w:rPr>
-          <w:color w:val="FF0000"/>
-          <w:sz w:val="32"/>
-          <w:szCs w:val="32"/>
-        </w:rPr>
-        <w:t>, «Услуги», «Доставка», «Сервис», «Служба поддержки»</w:t>
-      </w:r>
-      <w:r>
-        <w:rPr>
-          <w:color w:val="FF0000"/>
-          <w:sz w:val="32"/>
-          <w:szCs w:val="32"/>
-        </w:rPr>
-        <w:t xml:space="preserve">, </w:t>
-      </w:r>
-      <w:r>
-        <w:rPr>
-          <w:color w:val="FF0000"/>
-          <w:sz w:val="32"/>
-          <w:szCs w:val="32"/>
-        </w:rPr>
-        <w:t>а также ссылки на категории товаров из хедера</w:t>
-      </w:r>
-      <w:r>
-        <w:rPr>
-          <w:color w:val="FF0000"/>
-          <w:sz w:val="32"/>
-          <w:szCs w:val="32"/>
+          <w:color w:val="00B050"/>
+          <w:szCs w:val="24"/>
+          <w:lang w:val="en-US"/>
+        </w:rPr>
+        <w:t>webtest</w:t>
+      </w:r>
+      <w:r>
+        <w:rPr>
+          <w:color w:val="00B050"/>
+          <w:szCs w:val="24"/>
+        </w:rPr>
+        <w:t xml:space="preserve"> – </w:t>
+      </w:r>
+      <w:r>
+        <w:rPr>
+          <w:color w:val="00B050"/>
+          <w:szCs w:val="24"/>
+          <w:lang w:val="en-US"/>
+        </w:rPr>
+        <w:t>views</w:t>
+      </w:r>
+      <w:r>
+        <w:rPr>
+          <w:color w:val="00B050"/>
+          <w:szCs w:val="24"/>
+        </w:rPr>
+        <w:t xml:space="preserve"> – </w:t>
+      </w:r>
+      <w:r>
+        <w:rPr>
+          <w:color w:val="00B050"/>
+          <w:szCs w:val="24"/>
+          <w:lang w:val="en-US"/>
+        </w:rPr>
+        <w:t>product</w:t>
+      </w:r>
+      <w:r>
+        <w:rPr>
+          <w:color w:val="00B050"/>
+          <w:szCs w:val="24"/>
+        </w:rPr>
+        <w:t xml:space="preserve"> – </w:t>
+      </w:r>
+      <w:r>
+        <w:rPr>
+          <w:color w:val="00B050"/>
+          <w:szCs w:val="24"/>
+          <w:lang w:val="en-US"/>
+        </w:rPr>
+        <w:t>index</w:t>
+      </w:r>
+      <w:r>
+        <w:rPr>
+          <w:color w:val="00B050"/>
+          <w:szCs w:val="24"/>
         </w:rPr>
         <w:t>)</w:t>
       </w:r>
     </w:p>
     <w:p>
       <w:pPr>
-        <w:pStyle w:val="a3"/>
-        <w:numPr>
-          <w:ilvl w:val="0"/>
-          <w:numId w:val="4"/>
-        </w:numPr>
-        <w:spacing w:after="0" w:line="360" w:lineRule="auto"/>
-        <w:jc w:val="both"/>
-        <w:rPr>
-          <w:szCs w:val="24"/>
-        </w:rPr>
-      </w:pPr>
-      <w:r>
-        <w:rPr>
-          <w:sz w:val="32"/>
-          <w:szCs w:val="32"/>
-        </w:rPr>
-        <w:t xml:space="preserve">Забивание корзины товарами на сайте с последующей отправкой её боту для </w:t>
-      </w:r>
-      <w:r>
-        <w:rPr>
-          <w:sz w:val="32"/>
-          <w:szCs w:val="32"/>
-        </w:rPr>
-        <w:t xml:space="preserve">отправки </w:t>
-      </w:r>
-      <w:r>
-        <w:rPr>
-          <w:sz w:val="32"/>
-          <w:szCs w:val="32"/>
-        </w:rPr>
-        <w:t xml:space="preserve">заявки </w:t>
-      </w:r>
-      <w:r>
-        <w:rPr>
-          <w:sz w:val="32"/>
-          <w:szCs w:val="32"/>
-        </w:rPr>
-        <w:t xml:space="preserve">админам </w:t>
-      </w:r>
-      <w:r>
-        <w:rPr>
-          <w:sz w:val="32"/>
-          <w:szCs w:val="32"/>
-        </w:rPr>
-        <w:t>(</w:t>
-      </w:r>
-      <w:r>
-        <w:rPr>
-          <w:sz w:val="32"/>
-          <w:szCs w:val="32"/>
-        </w:rPr>
-        <w:t>в боте нажимать оставить заявку, затем переходить в каталог товаров, далее в корзину, потом а-ля оформить заказ, затем в боте заявка принята (свяжитесь со специалистом для уточнения деталей заказа)</w:t>
-      </w:r>
-      <w:r>
-        <w:rPr>
-          <w:sz w:val="32"/>
-          <w:szCs w:val="32"/>
-        </w:rPr>
-        <w:t xml:space="preserve"> и переход в чат со специалистом</w:t>
-      </w:r>
-      <w:r>
-        <w:rPr>
-          <w:sz w:val="32"/>
-          <w:szCs w:val="32"/>
-        </w:rPr>
-        <w:t>)</w:t>
-      </w:r>
-    </w:p>
-    <w:p>
-      <w:pPr>
-        <w:spacing w:after="0" w:line="360" w:lineRule="auto"/>
-        <w:jc w:val="both"/>
-        <w:rPr>
-          <w:szCs w:val="24"/>
-        </w:rPr>
-      </w:pPr>
-    </w:p>
-    <w:p>
-      <w:pPr>
-        <w:spacing w:after="0" w:line="360" w:lineRule="auto"/>
-        <w:jc w:val="both"/>
-        <w:rPr>
-          <w:szCs w:val="24"/>
-        </w:rPr>
-      </w:pPr>
-      <w:r>
-        <w:rPr>
-          <w:szCs w:val="24"/>
-        </w:rPr>
-        <w:t>Страницы:</w:t>
-      </w:r>
-    </w:p>
-    <w:p>
-      <w:pPr>
-        <w:spacing w:after="0" w:line="360" w:lineRule="auto"/>
-        <w:jc w:val="both"/>
-        <w:rPr>
-          <w:color w:val="00B050"/>
-          <w:szCs w:val="24"/>
-        </w:rPr>
-      </w:pPr>
-      <w:r>
-        <w:rPr>
-          <w:color w:val="00B050"/>
-          <w:szCs w:val="24"/>
-        </w:rPr>
-        <w:t>Главная страница</w:t>
-      </w:r>
-    </w:p>
-    <w:p>
-      <w:pPr>
-        <w:spacing w:after="0" w:line="360" w:lineRule="auto"/>
-        <w:jc w:val="both"/>
-        <w:rPr>
-          <w:color w:val="00B050"/>
-          <w:szCs w:val="24"/>
-        </w:rPr>
-      </w:pPr>
-      <w:r>
-        <w:rPr>
-          <w:color w:val="00B050"/>
-          <w:szCs w:val="24"/>
-        </w:rPr>
-        <w:t>Каталог товаров</w:t>
-      </w:r>
-      <w:r>
-        <w:rPr>
-          <w:color w:val="00B050"/>
-          <w:szCs w:val="24"/>
-        </w:rPr>
-        <w:t xml:space="preserve"> (</w:t>
-      </w:r>
-      <w:proofErr w:type="spellStart"/>
-      <w:r>
+        <w:spacing w:after="0" w:line="360" w:lineRule="auto"/>
+        <w:jc w:val="both"/>
         <w:rPr>
           <w:color w:val="00B050"/>
           <w:szCs w:val="24"/>
           <w:lang w:val="en-US"/>
         </w:rPr>
-        <w:t>webtest</w:t>
-      </w:r>
-      <w:proofErr w:type="spellEnd"/>
-      <w:r>
-        <w:rPr>
-          <w:color w:val="00B050"/>
-          <w:szCs w:val="24"/>
-        </w:rPr>
-        <w:t xml:space="preserve"> – </w:t>
+      </w:pPr>
+      <w:r>
+        <w:rPr>
+          <w:color w:val="00B050"/>
+          <w:szCs w:val="24"/>
+        </w:rPr>
+        <w:t>Подробнее</w:t>
       </w:r>
       <w:r>
         <w:rPr>
@@ -546,14 +549,14 @@
           <w:szCs w:val="24"/>
           <w:lang w:val="en-US"/>
         </w:rPr>
-        <w:t>views</w:t>
-      </w:r>
-      <w:r>
-        <w:rPr>
-          <w:color w:val="00B050"/>
-          <w:szCs w:val="24"/>
-        </w:rPr>
-        <w:t xml:space="preserve"> – </w:t>
+        <w:t xml:space="preserve"> </w:t>
+      </w:r>
+      <w:r>
+        <w:rPr>
+          <w:color w:val="00B050"/>
+          <w:szCs w:val="24"/>
+        </w:rPr>
+        <w:t>о</w:t>
       </w:r>
       <w:r>
         <w:rPr>
@@ -561,14 +564,14 @@
           <w:szCs w:val="24"/>
           <w:lang w:val="en-US"/>
         </w:rPr>
-        <w:t>product</w:t>
-      </w:r>
-      <w:r>
-        <w:rPr>
-          <w:color w:val="00B050"/>
-          <w:szCs w:val="24"/>
-        </w:rPr>
-        <w:t xml:space="preserve"> – </w:t>
+        <w:t xml:space="preserve"> </w:t>
+      </w:r>
+      <w:r>
+        <w:rPr>
+          <w:color w:val="00B050"/>
+          <w:szCs w:val="24"/>
+        </w:rPr>
+        <w:t>товаре</w:t>
       </w:r>
       <w:r>
         <w:rPr>
@@ -576,89 +579,7 @@
           <w:szCs w:val="24"/>
           <w:lang w:val="en-US"/>
         </w:rPr>
-        <w:t>index</w:t>
-      </w:r>
-      <w:r>
-        <w:rPr>
-          <w:color w:val="00B050"/>
-          <w:szCs w:val="24"/>
-        </w:rPr>
-        <w:t>)</w:t>
-      </w:r>
-    </w:p>
-    <w:p>
-      <w:pPr>
-        <w:spacing w:after="0" w:line="360" w:lineRule="auto"/>
-        <w:jc w:val="both"/>
-        <w:rPr>
-          <w:color w:val="00B050"/>
-          <w:szCs w:val="24"/>
-          <w:lang w:val="en-US"/>
-        </w:rPr>
-      </w:pPr>
-      <w:r>
-        <w:rPr>
-          <w:color w:val="00B050"/>
-          <w:szCs w:val="24"/>
-        </w:rPr>
-        <w:lastRenderedPageBreak/>
-        <w:t>Подробнее</w:t>
-      </w:r>
-      <w:r>
-        <w:rPr>
-          <w:color w:val="00B050"/>
-          <w:szCs w:val="24"/>
-          <w:lang w:val="en-US"/>
-        </w:rPr>
-        <w:t xml:space="preserve"> </w:t>
-      </w:r>
-      <w:r>
-        <w:rPr>
-          <w:color w:val="00B050"/>
-          <w:szCs w:val="24"/>
-        </w:rPr>
-        <w:t>о</w:t>
-      </w:r>
-      <w:r>
-        <w:rPr>
-          <w:color w:val="00B050"/>
-          <w:szCs w:val="24"/>
-          <w:lang w:val="en-US"/>
-        </w:rPr>
-        <w:t xml:space="preserve"> </w:t>
-      </w:r>
-      <w:r>
-        <w:rPr>
-          <w:color w:val="00B050"/>
-          <w:szCs w:val="24"/>
-        </w:rPr>
-        <w:t>товаре</w:t>
-      </w:r>
-      <w:r>
-        <w:rPr>
-          <w:color w:val="00B050"/>
-          <w:szCs w:val="24"/>
-          <w:lang w:val="en-US"/>
-        </w:rPr>
-        <w:t xml:space="preserve"> (</w:t>
-      </w:r>
-      <w:proofErr w:type="spellStart"/>
-      <w:r>
-        <w:rPr>
-          <w:color w:val="00B050"/>
-          <w:szCs w:val="24"/>
-          <w:lang w:val="en-US"/>
-        </w:rPr>
-        <w:t>webtest</w:t>
-      </w:r>
-      <w:proofErr w:type="spellEnd"/>
-      <w:r>
-        <w:rPr>
-          <w:color w:val="00B050"/>
-          <w:szCs w:val="24"/>
-          <w:lang w:val="en-US"/>
-        </w:rPr>
-        <w:t xml:space="preserve"> – views – product – index)</w:t>
+        <w:t xml:space="preserve"> (webtest – views – product – index)</w:t>
       </w:r>
     </w:p>
     <w:p>
@@ -852,6 +773,7 @@
         <w:rPr>
           <w:color w:val="00B050"/>
         </w:rPr>
+        <w:lastRenderedPageBreak/>
         <w:t>Как заказать нашу продукцию (описание оформления заказов, предоставление ссылок на соц. сети и почту)</w:t>
       </w:r>
     </w:p>
@@ -868,19 +790,11 @@
           <w:color w:val="00B050"/>
         </w:rPr>
       </w:pPr>
-      <w:proofErr w:type="spellStart"/>
-      <w:r>
-        <w:rPr>
-          <w:color w:val="00B050"/>
-        </w:rPr>
-        <w:t>Превьюшка</w:t>
-      </w:r>
-      <w:proofErr w:type="spellEnd"/>
-      <w:r>
-        <w:rPr>
-          <w:color w:val="00B050"/>
-        </w:rPr>
-        <w:t>, как на аналогов нет</w:t>
+      <w:r>
+        <w:rPr>
+          <w:color w:val="00B050"/>
+        </w:rPr>
+        <w:t>Превьюшка, как на аналогов нет</w:t>
       </w:r>
     </w:p>
     <w:p>
@@ -1288,7 +1202,6 @@
           <w:color w:val="00B050"/>
           <w:highlight w:val="yellow"/>
         </w:rPr>
-        <w:lastRenderedPageBreak/>
         <w:t>Подробнее о товаре:</w:t>
       </w:r>
     </w:p>
@@ -1319,21 +1232,7 @@
         <w:rPr>
           <w:color w:val="00B050"/>
         </w:rPr>
-        <w:t xml:space="preserve">Как с </w:t>
-      </w:r>
-      <w:proofErr w:type="spellStart"/>
-      <w:r>
-        <w:rPr>
-          <w:color w:val="00B050"/>
-        </w:rPr>
-        <w:t>вебтеста</w:t>
-      </w:r>
-      <w:proofErr w:type="spellEnd"/>
-      <w:r>
-        <w:rPr>
-          <w:color w:val="00B050"/>
-        </w:rPr>
-        <w:t xml:space="preserve"> пока что взять</w:t>
+        <w:t>Как с вебтеста пока что взять</w:t>
       </w:r>
     </w:p>
     <w:p>
@@ -1365,14 +1264,12 @@
       <w:r>
         <w:t xml:space="preserve">Сайт </w:t>
       </w:r>
-      <w:proofErr w:type="spellStart"/>
       <w:r>
         <w:rPr>
           <w:lang w:val="en-US"/>
         </w:rPr>
         <w:t>inwave</w:t>
       </w:r>
-      <w:proofErr w:type="spellEnd"/>
     </w:p>
     <w:p>
       <w:pPr>
@@ -1397,14 +1294,12 @@
           <w:color w:val="00B050"/>
         </w:rPr>
       </w:pPr>
-      <w:proofErr w:type="spellStart"/>
       <w:r>
         <w:rPr>
           <w:color w:val="00B050"/>
         </w:rPr>
         <w:t>Вебтест</w:t>
       </w:r>
-      <w:proofErr w:type="spellEnd"/>
     </w:p>
     <w:p>
       <w:pPr>

</xml_diff>

<commit_message>
Added & Authorization & Registration
</commit_message>
<xml_diff>
--- a/Информационный сайт отдела.docx
+++ b/Информационный сайт отдела.docx
@@ -74,6 +74,7 @@
         </w:rPr>
         <w:t xml:space="preserve"> (чат в </w:t>
       </w:r>
+      <w:proofErr w:type="spellStart"/>
       <w:r>
         <w:rPr>
           <w:sz w:val="32"/>
@@ -82,6 +83,7 @@
         </w:rPr>
         <w:t>Qwen</w:t>
       </w:r>
+      <w:proofErr w:type="spellEnd"/>
       <w:r>
         <w:rPr>
           <w:sz w:val="32"/>
@@ -163,15 +165,7 @@
           <w:sz w:val="32"/>
           <w:szCs w:val="32"/>
         </w:rPr>
-        <w:t xml:space="preserve"> </w:t>
-      </w:r>
-      <w:r>
-        <w:rPr>
-          <w:color w:val="00B050"/>
-          <w:sz w:val="32"/>
-          <w:szCs w:val="32"/>
-        </w:rPr>
-        <w:t>новостей</w:t>
+        <w:t xml:space="preserve"> новостей</w:t>
       </w:r>
       <w:r>
         <w:rPr>
@@ -185,14 +179,7 @@
           <w:sz w:val="32"/>
           <w:szCs w:val="32"/>
         </w:rPr>
-        <w:t>, для пользователей (если будем делать авторизацию/регистрацию)</w:t>
-      </w:r>
-      <w:r>
-        <w:rPr>
-          <w:sz w:val="32"/>
-          <w:szCs w:val="32"/>
-        </w:rPr>
-        <w:t>))</w:t>
+        <w:t>)</w:t>
       </w:r>
     </w:p>
     <w:p>
@@ -205,17 +192,44 @@
         <w:spacing w:after="0" w:line="360" w:lineRule="auto"/>
         <w:jc w:val="both"/>
         <w:rPr>
-          <w:sz w:val="32"/>
-          <w:szCs w:val="32"/>
-        </w:rPr>
-      </w:pPr>
-      <w:r>
-        <w:rPr>
-          <w:color w:val="00B050"/>
-          <w:sz w:val="32"/>
-          <w:szCs w:val="32"/>
-        </w:rPr>
-        <w:t>При переходе на другую страницу тема меняется (если была переключена на светлую – становится темная)</w:t>
+          <w:color w:val="FF0000"/>
+          <w:sz w:val="32"/>
+          <w:szCs w:val="32"/>
+        </w:rPr>
+      </w:pPr>
+      <w:r>
+        <w:rPr>
+          <w:color w:val="FF0000"/>
+          <w:sz w:val="32"/>
+          <w:szCs w:val="32"/>
+        </w:rPr>
+        <w:t xml:space="preserve">В </w:t>
+      </w:r>
+      <w:proofErr w:type="spellStart"/>
+      <w:r>
+        <w:rPr>
+          <w:color w:val="FF0000"/>
+          <w:sz w:val="32"/>
+          <w:szCs w:val="32"/>
+        </w:rPr>
+        <w:t>телеграм</w:t>
+      </w:r>
+      <w:proofErr w:type="spellEnd"/>
+      <w:r>
+        <w:rPr>
+          <w:color w:val="FF0000"/>
+          <w:sz w:val="32"/>
+          <w:szCs w:val="32"/>
+        </w:rPr>
+        <w:t>-</w:t>
+      </w:r>
+      <w:r>
+        <w:rPr>
+          <w:color w:val="FF0000"/>
+          <w:sz w:val="32"/>
+          <w:szCs w:val="32"/>
+        </w:rPr>
+        <w:t>бота добавить пару функций (услуги и прочее)</w:t>
       </w:r>
     </w:p>
     <w:p>
@@ -228,243 +242,265 @@
         <w:spacing w:after="0" w:line="360" w:lineRule="auto"/>
         <w:jc w:val="both"/>
         <w:rPr>
+          <w:szCs w:val="24"/>
+        </w:rPr>
+      </w:pPr>
+      <w:r>
+        <w:rPr>
           <w:color w:val="FF0000"/>
           <w:sz w:val="32"/>
           <w:szCs w:val="32"/>
         </w:rPr>
-      </w:pPr>
-      <w:r>
-        <w:rPr>
-          <w:sz w:val="32"/>
-          <w:szCs w:val="32"/>
-          <w:highlight w:val="yellow"/>
-        </w:rPr>
-        <w:t>В хедере добавить кнопки типа услуг, контактов, продукции и т.д.</w:t>
-      </w:r>
-      <w:r>
-        <w:rPr>
-          <w:sz w:val="32"/>
-          <w:szCs w:val="32"/>
-          <w:highlight w:val="yellow"/>
-        </w:rPr>
-        <w:t xml:space="preserve"> (см. </w:t>
-      </w:r>
-      <w:r>
-        <w:rPr>
-          <w:sz w:val="32"/>
-          <w:szCs w:val="32"/>
-          <w:highlight w:val="yellow"/>
+        <w:t>Не должно быть</w:t>
+      </w:r>
+      <w:r>
+        <w:rPr>
+          <w:color w:val="FF0000"/>
+          <w:sz w:val="32"/>
+          <w:szCs w:val="32"/>
+        </w:rPr>
+        <w:t xml:space="preserve"> битых ссылок</w:t>
+      </w:r>
+      <w:r>
+        <w:rPr>
+          <w:color w:val="FF0000"/>
+          <w:sz w:val="32"/>
+          <w:szCs w:val="32"/>
+        </w:rPr>
+        <w:t xml:space="preserve"> (</w:t>
+      </w:r>
+      <w:r>
+        <w:rPr>
+          <w:color w:val="FF0000"/>
+          <w:sz w:val="32"/>
+          <w:szCs w:val="32"/>
+        </w:rPr>
+        <w:t xml:space="preserve">страницы «О </w:t>
+      </w:r>
+      <w:r>
+        <w:rPr>
+          <w:color w:val="FF0000"/>
+          <w:sz w:val="32"/>
+          <w:szCs w:val="32"/>
+        </w:rPr>
+        <w:t>компании»</w:t>
+      </w:r>
+      <w:r>
+        <w:rPr>
+          <w:color w:val="FF0000"/>
+          <w:sz w:val="32"/>
+          <w:szCs w:val="32"/>
+        </w:rPr>
+        <w:t>, «Услуги», «Доставка», «Сервис», «Служба поддержки»</w:t>
+      </w:r>
+      <w:r>
+        <w:rPr>
+          <w:color w:val="FF0000"/>
+          <w:sz w:val="32"/>
+          <w:szCs w:val="32"/>
+        </w:rPr>
+        <w:t xml:space="preserve">, </w:t>
+      </w:r>
+      <w:r>
+        <w:rPr>
+          <w:color w:val="FF0000"/>
+          <w:sz w:val="32"/>
+          <w:szCs w:val="32"/>
+        </w:rPr>
+        <w:t>а также ссылки на категории товаров из хедера</w:t>
+      </w:r>
+      <w:r>
+        <w:rPr>
+          <w:color w:val="FF0000"/>
+          <w:sz w:val="32"/>
+          <w:szCs w:val="32"/>
+        </w:rPr>
+        <w:t>)</w:t>
+      </w:r>
+    </w:p>
+    <w:p>
+      <w:pPr>
+        <w:spacing w:after="0" w:line="360" w:lineRule="auto"/>
+        <w:jc w:val="both"/>
+        <w:rPr>
+          <w:szCs w:val="24"/>
+        </w:rPr>
+      </w:pPr>
+    </w:p>
+    <w:p>
+      <w:pPr>
+        <w:spacing w:after="0" w:line="360" w:lineRule="auto"/>
+        <w:jc w:val="both"/>
+        <w:rPr>
+          <w:szCs w:val="24"/>
+        </w:rPr>
+      </w:pPr>
+      <w:r>
+        <w:rPr>
+          <w:szCs w:val="24"/>
+        </w:rPr>
+        <w:t>Страницы:</w:t>
+      </w:r>
+    </w:p>
+    <w:p>
+      <w:pPr>
+        <w:spacing w:after="0" w:line="360" w:lineRule="auto"/>
+        <w:jc w:val="both"/>
+        <w:rPr>
+          <w:color w:val="00B050"/>
+          <w:szCs w:val="24"/>
+        </w:rPr>
+      </w:pPr>
+      <w:r>
+        <w:rPr>
+          <w:color w:val="00B050"/>
+          <w:szCs w:val="24"/>
+        </w:rPr>
+        <w:t>Главная страница</w:t>
+      </w:r>
+    </w:p>
+    <w:p>
+      <w:pPr>
+        <w:spacing w:after="0" w:line="360" w:lineRule="auto"/>
+        <w:jc w:val="both"/>
+        <w:rPr>
+          <w:color w:val="00B050"/>
+          <w:szCs w:val="24"/>
+        </w:rPr>
+      </w:pPr>
+      <w:r>
+        <w:rPr>
+          <w:color w:val="00B050"/>
+          <w:szCs w:val="24"/>
+        </w:rPr>
+        <w:t>Каталог товаров</w:t>
+      </w:r>
+      <w:r>
+        <w:rPr>
+          <w:color w:val="00B050"/>
+          <w:szCs w:val="24"/>
+        </w:rPr>
+        <w:t xml:space="preserve"> (</w:t>
+      </w:r>
+      <w:proofErr w:type="spellStart"/>
+      <w:r>
+        <w:rPr>
+          <w:color w:val="00B050"/>
+          <w:szCs w:val="24"/>
           <w:lang w:val="en-US"/>
         </w:rPr>
-        <w:t>INWAVE</w:t>
-      </w:r>
-      <w:r>
-        <w:rPr>
-          <w:sz w:val="32"/>
-          <w:szCs w:val="32"/>
-          <w:highlight w:val="yellow"/>
+        <w:t>webtest</w:t>
+      </w:r>
+      <w:proofErr w:type="spellEnd"/>
+      <w:r>
+        <w:rPr>
+          <w:color w:val="00B050"/>
+          <w:szCs w:val="24"/>
+        </w:rPr>
+        <w:t xml:space="preserve"> – </w:t>
+      </w:r>
+      <w:r>
+        <w:rPr>
+          <w:color w:val="00B050"/>
+          <w:szCs w:val="24"/>
+          <w:lang w:val="en-US"/>
+        </w:rPr>
+        <w:t>views</w:t>
+      </w:r>
+      <w:r>
+        <w:rPr>
+          <w:color w:val="00B050"/>
+          <w:szCs w:val="24"/>
+        </w:rPr>
+        <w:t xml:space="preserve"> – </w:t>
+      </w:r>
+      <w:r>
+        <w:rPr>
+          <w:color w:val="00B050"/>
+          <w:szCs w:val="24"/>
+          <w:lang w:val="en-US"/>
+        </w:rPr>
+        <w:t>product</w:t>
+      </w:r>
+      <w:r>
+        <w:rPr>
+          <w:color w:val="00B050"/>
+          <w:szCs w:val="24"/>
+        </w:rPr>
+        <w:t xml:space="preserve"> – </w:t>
+      </w:r>
+      <w:r>
+        <w:rPr>
+          <w:color w:val="00B050"/>
+          <w:szCs w:val="24"/>
+          <w:lang w:val="en-US"/>
+        </w:rPr>
+        <w:t>index</w:t>
+      </w:r>
+      <w:r>
+        <w:rPr>
+          <w:color w:val="00B050"/>
+          <w:szCs w:val="24"/>
         </w:rPr>
         <w:t>)</w:t>
       </w:r>
-      <w:r>
-        <w:rPr>
-          <w:sz w:val="32"/>
-          <w:szCs w:val="32"/>
-          <w:highlight w:val="yellow"/>
-        </w:rPr>
-        <w:t xml:space="preserve"> (обговорить)</w:t>
-      </w:r>
-    </w:p>
-    <w:p>
-      <w:pPr>
-        <w:pStyle w:val="a3"/>
-        <w:numPr>
-          <w:ilvl w:val="0"/>
-          <w:numId w:val="4"/>
-        </w:numPr>
-        <w:spacing w:after="0" w:line="360" w:lineRule="auto"/>
-        <w:jc w:val="both"/>
-        <w:rPr>
-          <w:color w:val="FF0000"/>
-          <w:sz w:val="32"/>
-          <w:szCs w:val="32"/>
-        </w:rPr>
-      </w:pPr>
-      <w:r>
-        <w:rPr>
-          <w:color w:val="FF0000"/>
-          <w:sz w:val="32"/>
-          <w:szCs w:val="32"/>
-        </w:rPr>
-        <w:t xml:space="preserve">В </w:t>
-      </w:r>
-      <w:r>
-        <w:rPr>
-          <w:color w:val="FF0000"/>
-          <w:sz w:val="32"/>
-          <w:szCs w:val="32"/>
-        </w:rPr>
-        <w:t>телеграм-</w:t>
-      </w:r>
-      <w:r>
-        <w:rPr>
-          <w:color w:val="FF0000"/>
-          <w:sz w:val="32"/>
-          <w:szCs w:val="32"/>
-        </w:rPr>
-        <w:t>бота добавить пару функций (услуги и прочее)</w:t>
-      </w:r>
-    </w:p>
-    <w:p>
-      <w:pPr>
-        <w:pStyle w:val="a3"/>
-        <w:numPr>
-          <w:ilvl w:val="0"/>
-          <w:numId w:val="4"/>
-        </w:numPr>
-        <w:spacing w:after="0" w:line="360" w:lineRule="auto"/>
-        <w:jc w:val="both"/>
-        <w:rPr>
-          <w:szCs w:val="24"/>
-        </w:rPr>
-      </w:pPr>
-      <w:r>
-        <w:rPr>
-          <w:color w:val="FF0000"/>
-          <w:sz w:val="32"/>
-          <w:szCs w:val="32"/>
-        </w:rPr>
-        <w:t>Не должно быть</w:t>
-      </w:r>
-      <w:r>
-        <w:rPr>
-          <w:color w:val="FF0000"/>
-          <w:sz w:val="32"/>
-          <w:szCs w:val="32"/>
-        </w:rPr>
-        <w:t xml:space="preserve"> битых ссылок</w:t>
-      </w:r>
-      <w:r>
-        <w:rPr>
-          <w:color w:val="FF0000"/>
-          <w:sz w:val="32"/>
-          <w:szCs w:val="32"/>
+    </w:p>
+    <w:p>
+      <w:pPr>
+        <w:spacing w:after="0" w:line="360" w:lineRule="auto"/>
+        <w:jc w:val="both"/>
+        <w:rPr>
+          <w:color w:val="00B050"/>
+          <w:szCs w:val="24"/>
+          <w:lang w:val="en-US"/>
+        </w:rPr>
+      </w:pPr>
+      <w:r>
+        <w:rPr>
+          <w:color w:val="00B050"/>
+          <w:szCs w:val="24"/>
+        </w:rPr>
+        <w:t>Подробнее</w:t>
+      </w:r>
+      <w:r>
+        <w:rPr>
+          <w:color w:val="00B050"/>
+          <w:szCs w:val="24"/>
+          <w:lang w:val="en-US"/>
+        </w:rPr>
+        <w:t xml:space="preserve"> </w:t>
+      </w:r>
+      <w:r>
+        <w:rPr>
+          <w:color w:val="00B050"/>
+          <w:szCs w:val="24"/>
+        </w:rPr>
+        <w:t>о</w:t>
+      </w:r>
+      <w:r>
+        <w:rPr>
+          <w:color w:val="00B050"/>
+          <w:szCs w:val="24"/>
+          <w:lang w:val="en-US"/>
+        </w:rPr>
+        <w:t xml:space="preserve"> </w:t>
+      </w:r>
+      <w:r>
+        <w:rPr>
+          <w:color w:val="00B050"/>
+          <w:szCs w:val="24"/>
+        </w:rPr>
+        <w:t>товаре</w:t>
+      </w:r>
+      <w:r>
+        <w:rPr>
+          <w:color w:val="00B050"/>
+          <w:szCs w:val="24"/>
+          <w:lang w:val="en-US"/>
         </w:rPr>
         <w:t xml:space="preserve"> (</w:t>
       </w:r>
-      <w:r>
-        <w:rPr>
-          <w:color w:val="FF0000"/>
-          <w:sz w:val="32"/>
-          <w:szCs w:val="32"/>
-        </w:rPr>
-        <w:t xml:space="preserve">страницы «О </w:t>
-      </w:r>
-      <w:r>
-        <w:rPr>
-          <w:color w:val="FF0000"/>
-          <w:sz w:val="32"/>
-          <w:szCs w:val="32"/>
-        </w:rPr>
-        <w:t>компании»</w:t>
-      </w:r>
-      <w:r>
-        <w:rPr>
-          <w:color w:val="FF0000"/>
-          <w:sz w:val="32"/>
-          <w:szCs w:val="32"/>
-        </w:rPr>
-        <w:t>, «Услуги», «Доставка», «Сервис», «Служба поддержки»</w:t>
-      </w:r>
-      <w:r>
-        <w:rPr>
-          <w:color w:val="FF0000"/>
-          <w:sz w:val="32"/>
-          <w:szCs w:val="32"/>
-        </w:rPr>
-        <w:t xml:space="preserve">, </w:t>
-      </w:r>
-      <w:r>
-        <w:rPr>
-          <w:color w:val="FF0000"/>
-          <w:sz w:val="32"/>
-          <w:szCs w:val="32"/>
-        </w:rPr>
-        <w:t>а также ссылки на категории товаров из хедера</w:t>
-      </w:r>
-      <w:r>
-        <w:rPr>
-          <w:color w:val="FF0000"/>
-          <w:sz w:val="32"/>
-          <w:szCs w:val="32"/>
-        </w:rPr>
-        <w:t>)</w:t>
-      </w:r>
-    </w:p>
-    <w:p>
-      <w:pPr>
-        <w:spacing w:after="0" w:line="360" w:lineRule="auto"/>
-        <w:jc w:val="both"/>
-        <w:rPr>
-          <w:szCs w:val="24"/>
-        </w:rPr>
-      </w:pPr>
-    </w:p>
-    <w:p>
-      <w:pPr>
-        <w:spacing w:after="0" w:line="360" w:lineRule="auto"/>
-        <w:jc w:val="both"/>
-        <w:rPr>
-          <w:szCs w:val="24"/>
-        </w:rPr>
-      </w:pPr>
-      <w:r>
-        <w:rPr>
-          <w:szCs w:val="24"/>
-        </w:rPr>
-        <w:t>Страницы:</w:t>
-      </w:r>
-    </w:p>
-    <w:p>
-      <w:pPr>
-        <w:spacing w:after="0" w:line="360" w:lineRule="auto"/>
-        <w:jc w:val="both"/>
-        <w:rPr>
-          <w:color w:val="00B050"/>
-          <w:szCs w:val="24"/>
-        </w:rPr>
-      </w:pPr>
-      <w:r>
-        <w:rPr>
-          <w:color w:val="00B050"/>
-          <w:szCs w:val="24"/>
-        </w:rPr>
-        <w:t>Главная страница</w:t>
-      </w:r>
-    </w:p>
-    <w:p>
-      <w:pPr>
-        <w:spacing w:after="0" w:line="360" w:lineRule="auto"/>
-        <w:jc w:val="both"/>
-        <w:rPr>
-          <w:color w:val="00B050"/>
-          <w:szCs w:val="24"/>
-        </w:rPr>
-      </w:pPr>
-      <w:r>
-        <w:rPr>
-          <w:color w:val="00B050"/>
-          <w:szCs w:val="24"/>
-        </w:rPr>
-        <w:t>Каталог товаров</w:t>
-      </w:r>
-      <w:r>
-        <w:rPr>
-          <w:color w:val="00B050"/>
-          <w:szCs w:val="24"/>
-        </w:rPr>
-        <w:t xml:space="preserve"> (</w:t>
-      </w:r>
+      <w:proofErr w:type="spellStart"/>
       <w:r>
         <w:rPr>
           <w:color w:val="00B050"/>
@@ -473,113 +509,14 @@
         </w:rPr>
         <w:t>webtest</w:t>
       </w:r>
-      <w:r>
-        <w:rPr>
-          <w:color w:val="00B050"/>
-          <w:szCs w:val="24"/>
-        </w:rPr>
-        <w:t xml:space="preserve"> – </w:t>
-      </w:r>
+      <w:proofErr w:type="spellEnd"/>
       <w:r>
         <w:rPr>
           <w:color w:val="00B050"/>
           <w:szCs w:val="24"/>
           <w:lang w:val="en-US"/>
         </w:rPr>
-        <w:t>views</w:t>
-      </w:r>
-      <w:r>
-        <w:rPr>
-          <w:color w:val="00B050"/>
-          <w:szCs w:val="24"/>
-        </w:rPr>
-        <w:t xml:space="preserve"> – </w:t>
-      </w:r>
-      <w:r>
-        <w:rPr>
-          <w:color w:val="00B050"/>
-          <w:szCs w:val="24"/>
-          <w:lang w:val="en-US"/>
-        </w:rPr>
-        <w:t>product</w:t>
-      </w:r>
-      <w:r>
-        <w:rPr>
-          <w:color w:val="00B050"/>
-          <w:szCs w:val="24"/>
-        </w:rPr>
-        <w:t xml:space="preserve"> – </w:t>
-      </w:r>
-      <w:r>
-        <w:rPr>
-          <w:color w:val="00B050"/>
-          <w:szCs w:val="24"/>
-          <w:lang w:val="en-US"/>
-        </w:rPr>
-        <w:t>index</w:t>
-      </w:r>
-      <w:r>
-        <w:rPr>
-          <w:color w:val="00B050"/>
-          <w:szCs w:val="24"/>
-        </w:rPr>
-        <w:t>)</w:t>
-      </w:r>
-    </w:p>
-    <w:p>
-      <w:pPr>
-        <w:spacing w:after="0" w:line="360" w:lineRule="auto"/>
-        <w:jc w:val="both"/>
-        <w:rPr>
-          <w:color w:val="00B050"/>
-          <w:szCs w:val="24"/>
-          <w:lang w:val="en-US"/>
-        </w:rPr>
-      </w:pPr>
-      <w:r>
-        <w:rPr>
-          <w:color w:val="00B050"/>
-          <w:szCs w:val="24"/>
-        </w:rPr>
-        <w:t>Подробнее</w:t>
-      </w:r>
-      <w:r>
-        <w:rPr>
-          <w:color w:val="00B050"/>
-          <w:szCs w:val="24"/>
-          <w:lang w:val="en-US"/>
-        </w:rPr>
-        <w:t xml:space="preserve"> </w:t>
-      </w:r>
-      <w:r>
-        <w:rPr>
-          <w:color w:val="00B050"/>
-          <w:szCs w:val="24"/>
-        </w:rPr>
-        <w:t>о</w:t>
-      </w:r>
-      <w:r>
-        <w:rPr>
-          <w:color w:val="00B050"/>
-          <w:szCs w:val="24"/>
-          <w:lang w:val="en-US"/>
-        </w:rPr>
-        <w:t xml:space="preserve"> </w:t>
-      </w:r>
-      <w:r>
-        <w:rPr>
-          <w:color w:val="00B050"/>
-          <w:szCs w:val="24"/>
-        </w:rPr>
-        <w:t>товаре</w:t>
-      </w:r>
-      <w:r>
-        <w:rPr>
-          <w:color w:val="00B050"/>
-          <w:szCs w:val="24"/>
-          <w:lang w:val="en-US"/>
-        </w:rPr>
-        <w:t xml:space="preserve"> (webtest – views – product – index)</w:t>
+        <w:t xml:space="preserve"> – views – product – index)</w:t>
       </w:r>
     </w:p>
     <w:p>
@@ -773,7 +710,6 @@
         <w:rPr>
           <w:color w:val="00B050"/>
         </w:rPr>
-        <w:lastRenderedPageBreak/>
         <w:t>Как заказать нашу продукцию (описание оформления заказов, предоставление ссылок на соц. сети и почту)</w:t>
       </w:r>
     </w:p>
@@ -790,11 +726,19 @@
           <w:color w:val="00B050"/>
         </w:rPr>
       </w:pPr>
-      <w:r>
-        <w:rPr>
-          <w:color w:val="00B050"/>
-        </w:rPr>
-        <w:t>Превьюшка, как на аналогов нет</w:t>
+      <w:proofErr w:type="spellStart"/>
+      <w:r>
+        <w:rPr>
+          <w:color w:val="00B050"/>
+        </w:rPr>
+        <w:t>Превьюшка</w:t>
+      </w:r>
+      <w:proofErr w:type="spellEnd"/>
+      <w:r>
+        <w:rPr>
+          <w:color w:val="00B050"/>
+        </w:rPr>
+        <w:t>, как на аналогов нет</w:t>
       </w:r>
     </w:p>
     <w:p>
@@ -892,6 +836,7 @@
         <w:jc w:val="both"/>
       </w:pPr>
       <w:r>
+        <w:lastRenderedPageBreak/>
         <w:t>Нижнее поле:</w:t>
       </w:r>
     </w:p>
@@ -1232,7 +1177,21 @@
         <w:rPr>
           <w:color w:val="00B050"/>
         </w:rPr>
-        <w:t>Как с вебтеста пока что взять</w:t>
+        <w:t xml:space="preserve">Как с </w:t>
+      </w:r>
+      <w:proofErr w:type="spellStart"/>
+      <w:r>
+        <w:rPr>
+          <w:color w:val="00B050"/>
+        </w:rPr>
+        <w:t>вебтеста</w:t>
+      </w:r>
+      <w:proofErr w:type="spellEnd"/>
+      <w:r>
+        <w:rPr>
+          <w:color w:val="00B050"/>
+        </w:rPr>
+        <w:t xml:space="preserve"> пока что взять</w:t>
       </w:r>
     </w:p>
     <w:p>
@@ -1264,12 +1223,14 @@
       <w:r>
         <w:t xml:space="preserve">Сайт </w:t>
       </w:r>
+      <w:proofErr w:type="spellStart"/>
       <w:r>
         <w:rPr>
           <w:lang w:val="en-US"/>
         </w:rPr>
         <w:t>inwave</w:t>
       </w:r>
+      <w:proofErr w:type="spellEnd"/>
     </w:p>
     <w:p>
       <w:pPr>
@@ -1294,12 +1255,14 @@
           <w:color w:val="00B050"/>
         </w:rPr>
       </w:pPr>
+      <w:proofErr w:type="spellStart"/>
       <w:r>
         <w:rPr>
           <w:color w:val="00B050"/>
         </w:rPr>
         <w:t>Вебтест</w:t>
       </w:r>
+      <w:proofErr w:type="spellEnd"/>
     </w:p>
     <w:p>
       <w:pPr>

</xml_diff>

<commit_message>
Added news to Admin Area
</commit_message>
<xml_diff>
--- a/Информационный сайт отдела.docx
+++ b/Информационный сайт отдела.docx
@@ -36,96 +36,6 @@
           <w:szCs w:val="40"/>
         </w:rPr>
         <w:t>:</w:t>
-      </w:r>
-    </w:p>
-    <w:p>
-      <w:pPr>
-        <w:pStyle w:val="a3"/>
-        <w:numPr>
-          <w:ilvl w:val="0"/>
-          <w:numId w:val="4"/>
-        </w:numPr>
-        <w:spacing w:after="0" w:line="360" w:lineRule="auto"/>
-        <w:jc w:val="both"/>
-        <w:rPr>
-          <w:color w:val="00B050"/>
-          <w:sz w:val="32"/>
-          <w:szCs w:val="32"/>
-        </w:rPr>
-      </w:pPr>
-      <w:r>
-        <w:rPr>
-          <w:sz w:val="32"/>
-          <w:szCs w:val="32"/>
-        </w:rPr>
-        <w:t xml:space="preserve">Создать БД </w:t>
-      </w:r>
-      <w:r>
-        <w:rPr>
-          <w:sz w:val="32"/>
-          <w:szCs w:val="32"/>
-        </w:rPr>
-        <w:t xml:space="preserve">для сайта (таблицу для </w:t>
-      </w:r>
-      <w:r>
-        <w:rPr>
-          <w:color w:val="00B050"/>
-          <w:sz w:val="32"/>
-          <w:szCs w:val="32"/>
-        </w:rPr>
-        <w:t>товаров</w:t>
-      </w:r>
-      <w:r>
-        <w:rPr>
-          <w:sz w:val="32"/>
-          <w:szCs w:val="32"/>
-        </w:rPr>
-        <w:t>,</w:t>
-      </w:r>
-      <w:r>
-        <w:rPr>
-          <w:sz w:val="32"/>
-          <w:szCs w:val="32"/>
-        </w:rPr>
-        <w:t xml:space="preserve"> </w:t>
-      </w:r>
-      <w:r>
-        <w:rPr>
-          <w:color w:val="00B050"/>
-          <w:sz w:val="32"/>
-          <w:szCs w:val="32"/>
-        </w:rPr>
-        <w:t>корзины</w:t>
-      </w:r>
-      <w:r>
-        <w:rPr>
-          <w:color w:val="00B050"/>
-          <w:sz w:val="32"/>
-          <w:szCs w:val="32"/>
-        </w:rPr>
-        <w:t>,</w:t>
-      </w:r>
-      <w:r>
-        <w:rPr>
-          <w:color w:val="00B050"/>
-          <w:sz w:val="32"/>
-          <w:szCs w:val="32"/>
-        </w:rPr>
-        <w:t xml:space="preserve"> новостей</w:t>
-      </w:r>
-      <w:r>
-        <w:rPr>
-          <w:sz w:val="32"/>
-          <w:szCs w:val="32"/>
-        </w:rPr>
-        <w:t xml:space="preserve"> новинок</w:t>
-      </w:r>
-      <w:r>
-        <w:rPr>
-          <w:sz w:val="32"/>
-          <w:szCs w:val="32"/>
-        </w:rPr>
-        <w:t>)</w:t>
       </w:r>
     </w:p>
     <w:p>
@@ -177,7 +87,15 @@
           <w:sz w:val="32"/>
           <w:szCs w:val="32"/>
         </w:rPr>
-        <w:t>В админе сделать добавление новостей</w:t>
+        <w:t xml:space="preserve">В админе сделать </w:t>
+      </w:r>
+      <w:r>
+        <w:rPr>
+          <w:color w:val="000000"/>
+          <w:sz w:val="32"/>
+          <w:szCs w:val="32"/>
+        </w:rPr>
+        <w:t>установку новостей и новых товаров на главной странице</w:t>
       </w:r>
     </w:p>
     <w:p>
@@ -202,60 +120,9 @@
           <w:color w:val="000000"/>
           <w:sz w:val="32"/>
           <w:szCs w:val="32"/>
-        </w:rPr>
-        <w:t>Доделать следующие кнопки:</w:t>
-      </w:r>
-    </w:p>
-    <w:p>
-      <w:pPr>
-        <w:pStyle w:val="a3"/>
-        <w:autoSpaceDE w:val="0"/>
-        <w:autoSpaceDN w:val="0"/>
-        <w:adjustRightInd w:val="0"/>
-        <w:spacing w:after="0" w:line="360" w:lineRule="auto"/>
-        <w:rPr>
-          <w:color w:val="000000"/>
-          <w:sz w:val="32"/>
-          <w:szCs w:val="32"/>
-        </w:rPr>
-      </w:pPr>
-      <w:r>
-        <w:rPr>
-          <w:color w:val="000000"/>
-          <w:sz w:val="32"/>
-          <w:szCs w:val="32"/>
-        </w:rPr>
-        <w:t>ссылки и кнопки в футере (о компании, услуги, служба поддержки, сервис, доставка)</w:t>
-      </w:r>
-      <w:r>
-        <w:rPr>
-          <w:color w:val="000000"/>
-          <w:sz w:val="32"/>
-          <w:szCs w:val="32"/>
-        </w:rPr>
-        <w:t>;</w:t>
-      </w:r>
-    </w:p>
-    <w:p>
-      <w:pPr>
-        <w:pStyle w:val="a3"/>
-        <w:autoSpaceDE w:val="0"/>
-        <w:autoSpaceDN w:val="0"/>
-        <w:adjustRightInd w:val="0"/>
-        <w:spacing w:after="0" w:line="360" w:lineRule="auto"/>
-        <w:rPr>
-          <w:color w:val="000000"/>
-          <w:sz w:val="32"/>
-          <w:szCs w:val="32"/>
-        </w:rPr>
-      </w:pPr>
-      <w:r>
-        <w:rPr>
-          <w:color w:val="000000"/>
-          <w:sz w:val="32"/>
-          <w:szCs w:val="32"/>
-        </w:rPr>
-        <w:t>разобраться с каталогом сверху (посмотреть кнопки и нужны ли они вообще)</w:t>
+          <w:highlight w:val="yellow"/>
+        </w:rPr>
+        <w:t>Доделать ссылки и кнопки в футере (о компании, услуги, служба поддержки, сервис, доставка);</w:t>
       </w:r>
     </w:p>
     <w:p>
@@ -277,11 +144,24 @@
       </w:pPr>
       <w:r>
         <w:rPr>
-          <w:color w:val="000000"/>
           <w:sz w:val="32"/>
           <w:szCs w:val="32"/>
         </w:rPr>
-        <w:t>При движении колёсиком мыши вверх появляется хедер, при движении его вниз - исчезает</w:t>
+        <w:t xml:space="preserve">В </w:t>
+      </w:r>
+      <w:r>
+        <w:rPr>
+          <w:sz w:val="32"/>
+          <w:szCs w:val="32"/>
+        </w:rPr>
+        <w:t>телеграм-</w:t>
+      </w:r>
+      <w:r>
+        <w:rPr>
+          <w:sz w:val="32"/>
+          <w:szCs w:val="32"/>
+        </w:rPr>
+        <w:t>бота добавить пару функций (услуги и прочее)</w:t>
       </w:r>
     </w:p>
     <w:p>
@@ -291,54 +171,186 @@
           <w:ilvl w:val="0"/>
           <w:numId w:val="4"/>
         </w:numPr>
-        <w:spacing w:after="0" w:line="360" w:lineRule="auto"/>
-        <w:jc w:val="both"/>
-        <w:rPr>
-          <w:szCs w:val="24"/>
-        </w:rPr>
-      </w:pPr>
-      <w:r>
-        <w:rPr>
-          <w:color w:val="FF0000"/>
+        <w:autoSpaceDE w:val="0"/>
+        <w:autoSpaceDN w:val="0"/>
+        <w:adjustRightInd w:val="0"/>
+        <w:spacing w:after="0" w:line="360" w:lineRule="auto"/>
+        <w:rPr>
+          <w:color w:val="000000"/>
           <w:sz w:val="32"/>
           <w:szCs w:val="32"/>
         </w:rPr>
-        <w:t xml:space="preserve">В </w:t>
-      </w:r>
-      <w:proofErr w:type="spellStart"/>
-      <w:r>
-        <w:rPr>
-          <w:color w:val="FF0000"/>
+      </w:pPr>
+      <w:r>
+        <w:rPr>
           <w:sz w:val="32"/>
           <w:szCs w:val="32"/>
         </w:rPr>
-        <w:t>телеграм</w:t>
-      </w:r>
-      <w:proofErr w:type="spellEnd"/>
-      <w:r>
-        <w:rPr>
-          <w:color w:val="FF0000"/>
+        <w:t>Сделать кнопку с админа «Технический перерыв» для юзеров</w:t>
+      </w:r>
+    </w:p>
+    <w:p>
+      <w:pPr>
+        <w:pStyle w:val="a3"/>
+        <w:numPr>
+          <w:ilvl w:val="0"/>
+          <w:numId w:val="4"/>
+        </w:numPr>
+        <w:autoSpaceDE w:val="0"/>
+        <w:autoSpaceDN w:val="0"/>
+        <w:adjustRightInd w:val="0"/>
+        <w:spacing w:after="0" w:line="360" w:lineRule="auto"/>
+        <w:rPr>
+          <w:color w:val="000000"/>
           <w:sz w:val="32"/>
           <w:szCs w:val="32"/>
         </w:rPr>
-        <w:t>-</w:t>
-      </w:r>
-      <w:r>
-        <w:rPr>
-          <w:color w:val="FF0000"/>
+      </w:pPr>
+      <w:r>
+        <w:rPr>
           <w:sz w:val="32"/>
           <w:szCs w:val="32"/>
         </w:rPr>
-        <w:t>бота добавить</w:t>
-      </w:r>
-      <w:r>
-        <w:rPr>
-          <w:color w:val="FF0000"/>
+        <w:t xml:space="preserve">После оформления заказа сделать кнопку-ссылку на «О заказе», также сделать кнопку-ссылку «Показать </w:t>
+      </w:r>
+      <w:r>
+        <w:rPr>
           <w:sz w:val="32"/>
           <w:szCs w:val="32"/>
         </w:rPr>
-        <w:t xml:space="preserve"> пару функций (услуги и прочее)</w:t>
-      </w:r>
+        <w:t>предварительный счёт</w:t>
+      </w:r>
+      <w:r>
+        <w:rPr>
+          <w:sz w:val="32"/>
+          <w:szCs w:val="32"/>
+        </w:rPr>
+        <w:t>»</w:t>
+      </w:r>
+    </w:p>
+    <w:p>
+      <w:pPr>
+        <w:spacing w:after="0" w:line="360" w:lineRule="auto"/>
+        <w:jc w:val="both"/>
+        <w:rPr>
+          <w:szCs w:val="24"/>
+        </w:rPr>
+      </w:pPr>
+    </w:p>
+    <w:p>
+      <w:pPr>
+        <w:spacing w:after="0" w:line="360" w:lineRule="auto"/>
+        <w:jc w:val="both"/>
+        <w:rPr>
+          <w:color w:val="FF0000"/>
+          <w:sz w:val="40"/>
+          <w:szCs w:val="40"/>
+        </w:rPr>
+      </w:pPr>
+      <w:r>
+        <w:rPr>
+          <w:color w:val="FF0000"/>
+          <w:sz w:val="40"/>
+          <w:szCs w:val="40"/>
+        </w:rPr>
+        <w:t>Про оформление:</w:t>
+      </w:r>
+    </w:p>
+    <w:p>
+      <w:pPr>
+        <w:pStyle w:val="a3"/>
+        <w:numPr>
+          <w:ilvl w:val="0"/>
+          <w:numId w:val="5"/>
+        </w:numPr>
+        <w:autoSpaceDE w:val="0"/>
+        <w:autoSpaceDN w:val="0"/>
+        <w:adjustRightInd w:val="0"/>
+        <w:spacing w:after="0" w:line="360" w:lineRule="auto"/>
+        <w:rPr>
+          <w:color w:val="000000"/>
+          <w:sz w:val="32"/>
+          <w:szCs w:val="32"/>
+        </w:rPr>
+      </w:pPr>
+      <w:r>
+        <w:rPr>
+          <w:color w:val="000000"/>
+          <w:sz w:val="32"/>
+          <w:szCs w:val="32"/>
+        </w:rPr>
+        <w:t xml:space="preserve">При движении колёсиком мыши вверх появляется хедер, при движении его вниз </w:t>
+      </w:r>
+      <w:r>
+        <w:rPr>
+          <w:color w:val="000000"/>
+          <w:sz w:val="32"/>
+          <w:szCs w:val="32"/>
+        </w:rPr>
+        <w:t>–</w:t>
+      </w:r>
+      <w:r>
+        <w:rPr>
+          <w:color w:val="000000"/>
+          <w:sz w:val="32"/>
+          <w:szCs w:val="32"/>
+        </w:rPr>
+        <w:t xml:space="preserve"> исчезает</w:t>
+      </w:r>
+    </w:p>
+    <w:p>
+      <w:pPr>
+        <w:pStyle w:val="a3"/>
+        <w:numPr>
+          <w:ilvl w:val="0"/>
+          <w:numId w:val="5"/>
+        </w:numPr>
+        <w:autoSpaceDE w:val="0"/>
+        <w:autoSpaceDN w:val="0"/>
+        <w:adjustRightInd w:val="0"/>
+        <w:spacing w:after="0" w:line="360" w:lineRule="auto"/>
+        <w:rPr>
+          <w:color w:val="000000"/>
+          <w:sz w:val="32"/>
+          <w:szCs w:val="32"/>
+        </w:rPr>
+      </w:pPr>
+      <w:r>
+        <w:rPr>
+          <w:color w:val="000000"/>
+          <w:sz w:val="32"/>
+          <w:szCs w:val="32"/>
+        </w:rPr>
+        <w:t xml:space="preserve">Сделать оформление кнопки корзины как в </w:t>
+      </w:r>
+      <w:proofErr w:type="spellStart"/>
+      <w:r>
+        <w:rPr>
+          <w:color w:val="000000"/>
+          <w:sz w:val="32"/>
+          <w:szCs w:val="32"/>
+        </w:rPr>
+        <w:t>вебтесте</w:t>
+      </w:r>
+      <w:proofErr w:type="spellEnd"/>
+    </w:p>
+    <w:p>
+      <w:pPr>
+        <w:spacing w:after="0" w:line="360" w:lineRule="auto"/>
+        <w:jc w:val="both"/>
+        <w:rPr>
+          <w:szCs w:val="24"/>
+        </w:rPr>
+      </w:pPr>
+    </w:p>
+    <w:p>
+      <w:pPr>
+        <w:spacing w:after="0" w:line="360" w:lineRule="auto"/>
+        <w:jc w:val="both"/>
+        <w:rPr>
+          <w:szCs w:val="24"/>
+        </w:rPr>
+      </w:pPr>
     </w:p>
     <w:p>
       <w:pPr>
@@ -637,6 +649,7 @@
         <w:rPr>
           <w:color w:val="00B050"/>
         </w:rPr>
+        <w:lastRenderedPageBreak/>
         <w:t>Кнопка меню;</w:t>
       </w:r>
     </w:p>
@@ -732,7 +745,6 @@
         <w:rPr>
           <w:color w:val="00B050"/>
         </w:rPr>
-        <w:lastRenderedPageBreak/>
         <w:t>Как заказать нашу продукцию (описание оформления заказов, предоставление ссылок на соц. сети и почту)</w:t>
       </w:r>
     </w:p>
@@ -1266,6 +1278,7 @@
         <w:rPr>
           <w:color w:val="00B050"/>
         </w:rPr>
+        <w:lastRenderedPageBreak/>
         <w:t>Контакты:</w:t>
       </w:r>
     </w:p>
@@ -1666,6 +1679,95 @@
       </w:pPr>
     </w:lvl>
   </w:abstractNum>
+  <w:abstractNum w:abstractNumId="4" w15:restartNumberingAfterBreak="0">
+    <w:nsid w:val="62F5108D"/>
+    <w:multiLevelType w:val="hybridMultilevel"/>
+    <w:tmpl w:val="4E72ECF8"/>
+    <w:lvl w:ilvl="0" w:tplc="FFFFFFFF">
+      <w:start w:val="1"/>
+      <w:numFmt w:val="decimal"/>
+      <w:lvlText w:val="%1)"/>
+      <w:lvlJc w:val="left"/>
+      <w:pPr>
+        <w:ind w:left="720" w:hanging="360"/>
+      </w:pPr>
+      <w:rPr>
+        <w:rFonts w:hint="default"/>
+      </w:rPr>
+    </w:lvl>
+    <w:lvl w:ilvl="1" w:tplc="FFFFFFFF" w:tentative="1">
+      <w:start w:val="1"/>
+      <w:numFmt w:val="lowerLetter"/>
+      <w:lvlText w:val="%2."/>
+      <w:lvlJc w:val="left"/>
+      <w:pPr>
+        <w:ind w:left="1440" w:hanging="360"/>
+      </w:pPr>
+    </w:lvl>
+    <w:lvl w:ilvl="2" w:tplc="FFFFFFFF" w:tentative="1">
+      <w:start w:val="1"/>
+      <w:numFmt w:val="lowerRoman"/>
+      <w:lvlText w:val="%3."/>
+      <w:lvlJc w:val="right"/>
+      <w:pPr>
+        <w:ind w:left="2160" w:hanging="180"/>
+      </w:pPr>
+    </w:lvl>
+    <w:lvl w:ilvl="3" w:tplc="FFFFFFFF" w:tentative="1">
+      <w:start w:val="1"/>
+      <w:numFmt w:val="decimal"/>
+      <w:lvlText w:val="%4."/>
+      <w:lvlJc w:val="left"/>
+      <w:pPr>
+        <w:ind w:left="2880" w:hanging="360"/>
+      </w:pPr>
+    </w:lvl>
+    <w:lvl w:ilvl="4" w:tplc="FFFFFFFF" w:tentative="1">
+      <w:start w:val="1"/>
+      <w:numFmt w:val="lowerLetter"/>
+      <w:lvlText w:val="%5."/>
+      <w:lvlJc w:val="left"/>
+      <w:pPr>
+        <w:ind w:left="3600" w:hanging="360"/>
+      </w:pPr>
+    </w:lvl>
+    <w:lvl w:ilvl="5" w:tplc="FFFFFFFF" w:tentative="1">
+      <w:start w:val="1"/>
+      <w:numFmt w:val="lowerRoman"/>
+      <w:lvlText w:val="%6."/>
+      <w:lvlJc w:val="right"/>
+      <w:pPr>
+        <w:ind w:left="4320" w:hanging="180"/>
+      </w:pPr>
+    </w:lvl>
+    <w:lvl w:ilvl="6" w:tplc="FFFFFFFF" w:tentative="1">
+      <w:start w:val="1"/>
+      <w:numFmt w:val="decimal"/>
+      <w:lvlText w:val="%7."/>
+      <w:lvlJc w:val="left"/>
+      <w:pPr>
+        <w:ind w:left="5040" w:hanging="360"/>
+      </w:pPr>
+    </w:lvl>
+    <w:lvl w:ilvl="7" w:tplc="FFFFFFFF" w:tentative="1">
+      <w:start w:val="1"/>
+      <w:numFmt w:val="lowerLetter"/>
+      <w:lvlText w:val="%8."/>
+      <w:lvlJc w:val="left"/>
+      <w:pPr>
+        <w:ind w:left="5760" w:hanging="360"/>
+      </w:pPr>
+    </w:lvl>
+    <w:lvl w:ilvl="8" w:tplc="FFFFFFFF" w:tentative="1">
+      <w:start w:val="1"/>
+      <w:numFmt w:val="lowerRoman"/>
+      <w:lvlText w:val="%9."/>
+      <w:lvlJc w:val="right"/>
+      <w:pPr>
+        <w:ind w:left="6480" w:hanging="180"/>
+      </w:pPr>
+    </w:lvl>
+  </w:abstractNum>
   <w:num w:numId="1" w16cid:durableId="1746996332">
     <w:abstractNumId w:val="1"/>
   </w:num>
@@ -1677,6 +1779,9 @@
   </w:num>
   <w:num w:numId="4" w16cid:durableId="626665661">
     <w:abstractNumId w:val="2"/>
+  </w:num>
+  <w:num w:numId="5" w16cid:durableId="479539073">
+    <w:abstractNumId w:val="4"/>
   </w:num>
 </w:numbering>
 </file>

</xml_diff>

<commit_message>
Added Setting new product and news on the main page
</commit_message>
<xml_diff>
--- a/Информационный сайт отдела.docx
+++ b/Информационный сайт отдела.docx
@@ -95,7 +95,7 @@
           <w:sz w:val="32"/>
           <w:szCs w:val="32"/>
         </w:rPr>
-        <w:t>установку новостей и новых товаров на главной странице</w:t>
+        <w:t>установку новых товаров на главной странице</w:t>
       </w:r>
     </w:p>
     <w:p>
@@ -211,21 +211,28 @@
           <w:sz w:val="32"/>
           <w:szCs w:val="32"/>
         </w:rPr>
-        <w:t xml:space="preserve">После оформления заказа сделать кнопку-ссылку на «О заказе», также сделать кнопку-ссылку «Показать </w:t>
-      </w:r>
-      <w:r>
-        <w:rPr>
-          <w:sz w:val="32"/>
-          <w:szCs w:val="32"/>
-        </w:rPr>
-        <w:t>предварительный счёт</w:t>
-      </w:r>
-      <w:r>
-        <w:rPr>
-          <w:sz w:val="32"/>
-          <w:szCs w:val="32"/>
-        </w:rPr>
-        <w:t>»</w:t>
+        <w:t>После оформления заказа сделать кнопку-ссылку на «О заказе»</w:t>
+      </w:r>
+      <w:r>
+        <w:rPr>
+          <w:sz w:val="32"/>
+          <w:szCs w:val="32"/>
+        </w:rPr>
+        <w:t xml:space="preserve"> (</w:t>
+      </w:r>
+      <w:r>
+        <w:rPr>
+          <w:sz w:val="32"/>
+          <w:szCs w:val="32"/>
+        </w:rPr>
+        <w:t>или переход в личный кабинет</w:t>
+      </w:r>
+      <w:r>
+        <w:rPr>
+          <w:sz w:val="32"/>
+          <w:szCs w:val="32"/>
+        </w:rPr>
+        <w:t>)</w:t>
       </w:r>
     </w:p>
     <w:p>
@@ -321,18 +328,8 @@
           <w:sz w:val="32"/>
           <w:szCs w:val="32"/>
         </w:rPr>
-        <w:t xml:space="preserve">Сделать оформление кнопки корзины как в </w:t>
-      </w:r>
-      <w:proofErr w:type="spellStart"/>
-      <w:r>
-        <w:rPr>
-          <w:color w:val="000000"/>
-          <w:sz w:val="32"/>
-          <w:szCs w:val="32"/>
-        </w:rPr>
-        <w:t>вебтесте</w:t>
-      </w:r>
-      <w:proofErr w:type="spellEnd"/>
+        <w:t>Сделать оформление кнопки корзины как в вебтесте</w:t>
+      </w:r>
     </w:p>
     <w:p>
       <w:pPr>
@@ -416,7 +413,6 @@
         </w:rPr>
         <w:t xml:space="preserve"> (</w:t>
       </w:r>
-      <w:proofErr w:type="spellStart"/>
       <w:r>
         <w:rPr>
           <w:color w:val="00B050"/>
@@ -425,7 +421,6 @@
         </w:rPr>
         <w:t>webtest</w:t>
       </w:r>
-      <w:proofErr w:type="spellEnd"/>
       <w:r>
         <w:rPr>
           <w:color w:val="00B050"/>
@@ -532,113 +527,715 @@
           <w:szCs w:val="24"/>
           <w:lang w:val="en-US"/>
         </w:rPr>
-        <w:t xml:space="preserve"> (</w:t>
-      </w:r>
-      <w:proofErr w:type="spellStart"/>
+        <w:t xml:space="preserve"> (webtest – views – product – index)</w:t>
+      </w:r>
+    </w:p>
+    <w:p>
+      <w:pPr>
+        <w:spacing w:after="0" w:line="360" w:lineRule="auto"/>
+        <w:jc w:val="both"/>
+        <w:rPr>
+          <w:szCs w:val="24"/>
+        </w:rPr>
+      </w:pPr>
+      <w:r>
+        <w:rPr>
+          <w:szCs w:val="24"/>
+        </w:rPr>
+        <w:t>Страница под каждую категорию товаров</w:t>
+      </w:r>
+      <w:r>
+        <w:rPr>
+          <w:szCs w:val="24"/>
+        </w:rPr>
+        <w:t xml:space="preserve"> </w:t>
+      </w:r>
+      <w:r>
+        <w:rPr>
+          <w:szCs w:val="24"/>
+        </w:rPr>
+        <w:t>-?????</w:t>
+      </w:r>
+    </w:p>
+    <w:p>
+      <w:pPr>
+        <w:spacing w:after="0" w:line="360" w:lineRule="auto"/>
+        <w:jc w:val="both"/>
+        <w:rPr>
+          <w:color w:val="FF0000"/>
+          <w:sz w:val="32"/>
+          <w:szCs w:val="32"/>
+        </w:rPr>
+      </w:pPr>
+    </w:p>
+    <w:p>
+      <w:pPr>
+        <w:spacing w:after="0" w:line="360" w:lineRule="auto"/>
+        <w:jc w:val="both"/>
+      </w:pPr>
+      <w:r>
+        <w:rPr>
+          <w:highlight w:val="yellow"/>
+        </w:rPr>
+        <w:t>Главная страница:</w:t>
+      </w:r>
+    </w:p>
+    <w:p>
+      <w:pPr>
+        <w:spacing w:after="0" w:line="360" w:lineRule="auto"/>
+        <w:jc w:val="both"/>
+      </w:pPr>
+      <w:r>
+        <w:t>Заголовок:</w:t>
+      </w:r>
+    </w:p>
+    <w:p>
+      <w:pPr>
+        <w:pStyle w:val="a3"/>
+        <w:numPr>
+          <w:ilvl w:val="0"/>
+          <w:numId w:val="1"/>
+        </w:numPr>
+        <w:spacing w:after="0" w:line="360" w:lineRule="auto"/>
+        <w:jc w:val="both"/>
+        <w:rPr>
+          <w:color w:val="00B050"/>
+        </w:rPr>
+      </w:pPr>
+      <w:r>
+        <w:rPr>
+          <w:color w:val="00B050"/>
+        </w:rPr>
+        <w:t>Иконка-кнопка возврата на домашнюю/главную страницу;</w:t>
+      </w:r>
+    </w:p>
+    <w:p>
+      <w:pPr>
+        <w:pStyle w:val="a3"/>
+        <w:numPr>
+          <w:ilvl w:val="0"/>
+          <w:numId w:val="1"/>
+        </w:numPr>
+        <w:spacing w:after="0" w:line="360" w:lineRule="auto"/>
+        <w:jc w:val="both"/>
+        <w:rPr>
+          <w:color w:val="00B050"/>
+        </w:rPr>
+      </w:pPr>
+      <w:r>
+        <w:rPr>
+          <w:color w:val="00B050"/>
+        </w:rPr>
+        <w:t>Кнопка меню;</w:t>
+      </w:r>
+    </w:p>
+    <w:p>
+      <w:pPr>
+        <w:pStyle w:val="a3"/>
+        <w:numPr>
+          <w:ilvl w:val="0"/>
+          <w:numId w:val="1"/>
+        </w:numPr>
+        <w:spacing w:after="0" w:line="360" w:lineRule="auto"/>
+        <w:jc w:val="both"/>
+        <w:rPr>
+          <w:color w:val="00B050"/>
+        </w:rPr>
+      </w:pPr>
+      <w:r>
+        <w:rPr>
+          <w:color w:val="00B050"/>
+        </w:rPr>
+        <w:lastRenderedPageBreak/>
+        <w:t>Окно поиска;</w:t>
+      </w:r>
+    </w:p>
+    <w:p>
+      <w:pPr>
+        <w:pStyle w:val="a3"/>
+        <w:numPr>
+          <w:ilvl w:val="0"/>
+          <w:numId w:val="1"/>
+        </w:numPr>
+        <w:spacing w:after="0" w:line="360" w:lineRule="auto"/>
+        <w:jc w:val="both"/>
+        <w:rPr>
+          <w:color w:val="00B050"/>
+        </w:rPr>
+      </w:pPr>
+      <w:r>
+        <w:rPr>
+          <w:color w:val="00B050"/>
+        </w:rPr>
+        <w:t>Окно каталога</w:t>
+      </w:r>
+    </w:p>
+    <w:p>
+      <w:pPr>
+        <w:spacing w:after="0" w:line="360" w:lineRule="auto"/>
+        <w:jc w:val="both"/>
+      </w:pPr>
+      <w:r>
+        <w:t>Тело сайта:</w:t>
+      </w:r>
+    </w:p>
+    <w:p>
+      <w:pPr>
+        <w:pStyle w:val="a3"/>
+        <w:numPr>
+          <w:ilvl w:val="0"/>
+          <w:numId w:val="2"/>
+        </w:numPr>
+        <w:spacing w:after="0" w:line="360" w:lineRule="auto"/>
+        <w:jc w:val="both"/>
+        <w:rPr>
+          <w:color w:val="00B050"/>
+        </w:rPr>
+      </w:pPr>
+      <w:r>
+        <w:rPr>
+          <w:color w:val="00B050"/>
+        </w:rPr>
+        <w:t>П</w:t>
+      </w:r>
+      <w:r>
+        <w:rPr>
+          <w:color w:val="00B050"/>
+        </w:rPr>
+        <w:t>роизводим в России (описание проектов с фотографиями)</w:t>
+      </w:r>
+    </w:p>
+    <w:p>
+      <w:pPr>
+        <w:pStyle w:val="a3"/>
+        <w:numPr>
+          <w:ilvl w:val="0"/>
+          <w:numId w:val="2"/>
+        </w:numPr>
+        <w:spacing w:after="0" w:line="360" w:lineRule="auto"/>
+        <w:jc w:val="both"/>
+        <w:rPr>
+          <w:color w:val="00B050"/>
+        </w:rPr>
+      </w:pPr>
+      <w:r>
+        <w:rPr>
+          <w:color w:val="00B050"/>
+        </w:rPr>
+        <w:t>Как заказать нашу продукцию (описание оформления заказов, предоставление ссылок на соц. сети и почту)</w:t>
+      </w:r>
+    </w:p>
+    <w:p>
+      <w:pPr>
+        <w:pStyle w:val="a3"/>
+        <w:numPr>
+          <w:ilvl w:val="0"/>
+          <w:numId w:val="2"/>
+        </w:numPr>
+        <w:spacing w:after="0" w:line="360" w:lineRule="auto"/>
+        <w:jc w:val="both"/>
+        <w:rPr>
+          <w:color w:val="00B050"/>
+        </w:rPr>
+      </w:pPr>
+      <w:r>
+        <w:rPr>
+          <w:color w:val="00B050"/>
+        </w:rPr>
+        <w:t>Превьюшка, как на аналогов нет</w:t>
+      </w:r>
+    </w:p>
+    <w:p>
+      <w:pPr>
+        <w:pStyle w:val="a3"/>
+        <w:numPr>
+          <w:ilvl w:val="0"/>
+          <w:numId w:val="2"/>
+        </w:numPr>
+        <w:spacing w:after="0" w:line="360" w:lineRule="auto"/>
+        <w:jc w:val="both"/>
+        <w:rPr>
+          <w:color w:val="00B050"/>
+        </w:rPr>
+      </w:pPr>
+      <w:r>
+        <w:rPr>
+          <w:color w:val="00B050"/>
+        </w:rPr>
+        <w:t xml:space="preserve">Вода </w:t>
+      </w:r>
+      <w:r>
+        <w:rPr>
+          <w:color w:val="00B050"/>
+        </w:rPr>
+        <w:t>какая-нибудь</w:t>
+      </w:r>
+      <w:r>
+        <w:rPr>
+          <w:color w:val="00B050"/>
+        </w:rPr>
+        <w:t xml:space="preserve"> по типу (Решения, которые реально работают)</w:t>
+      </w:r>
+    </w:p>
+    <w:p>
+      <w:pPr>
+        <w:pStyle w:val="a3"/>
+        <w:numPr>
+          <w:ilvl w:val="0"/>
+          <w:numId w:val="2"/>
+        </w:numPr>
+        <w:spacing w:after="0" w:line="360" w:lineRule="auto"/>
+        <w:jc w:val="both"/>
+        <w:rPr>
+          <w:color w:val="00B050"/>
+          <w:szCs w:val="24"/>
+        </w:rPr>
+      </w:pPr>
+      <w:r>
+        <w:rPr>
+          <w:color w:val="00B050"/>
+          <w:szCs w:val="24"/>
+        </w:rPr>
+        <w:t xml:space="preserve">Новости (смотри сайт </w:t>
+      </w:r>
       <w:r>
         <w:rPr>
           <w:color w:val="00B050"/>
           <w:szCs w:val="24"/>
           <w:lang w:val="en-US"/>
         </w:rPr>
-        <w:t>webtest</w:t>
-      </w:r>
-      <w:proofErr w:type="spellEnd"/>
-      <w:r>
-        <w:rPr>
-          <w:color w:val="00B050"/>
-          <w:szCs w:val="24"/>
+        <w:t>INWAVE</w:t>
+      </w:r>
+      <w:r>
+        <w:rPr>
+          <w:color w:val="00B050"/>
+          <w:szCs w:val="24"/>
+        </w:rPr>
+        <w:t xml:space="preserve"> ближе к концу)</w:t>
+      </w:r>
+    </w:p>
+    <w:p>
+      <w:pPr>
+        <w:pStyle w:val="a3"/>
+        <w:numPr>
+          <w:ilvl w:val="0"/>
+          <w:numId w:val="2"/>
+        </w:numPr>
+        <w:spacing w:after="0" w:line="360" w:lineRule="auto"/>
+        <w:jc w:val="both"/>
+        <w:rPr>
+          <w:color w:val="00B050"/>
+        </w:rPr>
+      </w:pPr>
+      <w:r>
+        <w:rPr>
+          <w:color w:val="00B050"/>
+        </w:rPr>
+        <w:t>У вас остались вопросы?</w:t>
+      </w:r>
+    </w:p>
+    <w:p>
+      <w:pPr>
+        <w:spacing w:after="0" w:line="360" w:lineRule="auto"/>
+        <w:jc w:val="both"/>
+      </w:pPr>
+      <w:r>
+        <w:t>Нижнее поле:</w:t>
+      </w:r>
+    </w:p>
+    <w:p>
+      <w:pPr>
+        <w:pStyle w:val="a3"/>
+        <w:numPr>
+          <w:ilvl w:val="0"/>
+          <w:numId w:val="3"/>
+        </w:numPr>
+        <w:spacing w:after="0" w:line="360" w:lineRule="auto"/>
+        <w:jc w:val="both"/>
+        <w:rPr>
+          <w:color w:val="00B050"/>
+        </w:rPr>
+      </w:pPr>
+      <w:r>
+        <w:rPr>
+          <w:color w:val="00B050"/>
+        </w:rPr>
+        <w:t>Кнопка «На главную»</w:t>
+      </w:r>
+    </w:p>
+    <w:p>
+      <w:pPr>
+        <w:pStyle w:val="a3"/>
+        <w:numPr>
+          <w:ilvl w:val="0"/>
+          <w:numId w:val="3"/>
+        </w:numPr>
+        <w:spacing w:after="0" w:line="360" w:lineRule="auto"/>
+        <w:jc w:val="both"/>
+        <w:rPr>
+          <w:color w:val="00B050"/>
+        </w:rPr>
+      </w:pPr>
+      <w:r>
+        <w:rPr>
+          <w:color w:val="00B050"/>
+        </w:rPr>
+        <w:t xml:space="preserve">Кнопка «О </w:t>
+      </w:r>
+      <w:r>
+        <w:rPr>
+          <w:color w:val="00B050"/>
+        </w:rPr>
+        <w:t>компании</w:t>
+      </w:r>
+      <w:r>
+        <w:rPr>
+          <w:color w:val="00B050"/>
+        </w:rPr>
+        <w:t>»</w:t>
+      </w:r>
+    </w:p>
+    <w:p>
+      <w:pPr>
+        <w:pStyle w:val="a3"/>
+        <w:numPr>
+          <w:ilvl w:val="0"/>
+          <w:numId w:val="3"/>
+        </w:numPr>
+        <w:spacing w:after="0" w:line="360" w:lineRule="auto"/>
+        <w:jc w:val="both"/>
+        <w:rPr>
+          <w:color w:val="00B050"/>
+        </w:rPr>
+      </w:pPr>
+      <w:r>
+        <w:rPr>
+          <w:color w:val="00B050"/>
+        </w:rPr>
+        <w:t>Кнопка «Контакты»</w:t>
+      </w:r>
+    </w:p>
+    <w:p>
+      <w:pPr>
+        <w:pStyle w:val="a3"/>
+        <w:numPr>
+          <w:ilvl w:val="0"/>
+          <w:numId w:val="3"/>
+        </w:numPr>
+        <w:spacing w:after="0" w:line="360" w:lineRule="auto"/>
+        <w:jc w:val="both"/>
+        <w:rPr>
+          <w:color w:val="00B050"/>
+        </w:rPr>
+      </w:pPr>
+      <w:r>
+        <w:rPr>
+          <w:color w:val="00B050"/>
+        </w:rPr>
+        <w:t>Кнопка «</w:t>
+      </w:r>
+      <w:r>
+        <w:rPr>
+          <w:color w:val="00B050"/>
+        </w:rPr>
+        <w:t>Оформление заказа</w:t>
+      </w:r>
+      <w:r>
+        <w:rPr>
+          <w:color w:val="00B050"/>
+        </w:rPr>
+        <w:t>»</w:t>
+      </w:r>
+      <w:r>
+        <w:rPr>
+          <w:color w:val="00B050"/>
+        </w:rPr>
+        <w:t xml:space="preserve"> (переход на новую страницу с окном выбора категории товара (Системы Приемники и анализаторы обстановки, </w:t>
+      </w:r>
+      <w:r>
+        <w:rPr>
+          <w:color w:val="00B050"/>
           <w:lang w:val="en-US"/>
         </w:rPr>
-        <w:t xml:space="preserve"> – views – product – index)</w:t>
-      </w:r>
-    </w:p>
-    <w:p>
-      <w:pPr>
-        <w:spacing w:after="0" w:line="360" w:lineRule="auto"/>
-        <w:jc w:val="both"/>
-        <w:rPr>
-          <w:szCs w:val="24"/>
-        </w:rPr>
-      </w:pPr>
-      <w:r>
-        <w:rPr>
-          <w:szCs w:val="24"/>
-        </w:rPr>
-        <w:t>Страница под каждую категорию товаров</w:t>
-      </w:r>
-      <w:r>
-        <w:rPr>
-          <w:szCs w:val="24"/>
-        </w:rPr>
-        <w:t xml:space="preserve"> </w:t>
-      </w:r>
-      <w:r>
-        <w:rPr>
-          <w:szCs w:val="24"/>
-        </w:rPr>
-        <w:t>-?????</w:t>
-      </w:r>
-    </w:p>
-    <w:p>
-      <w:pPr>
-        <w:spacing w:after="0" w:line="360" w:lineRule="auto"/>
-        <w:jc w:val="both"/>
-        <w:rPr>
-          <w:color w:val="FF0000"/>
-          <w:sz w:val="32"/>
-          <w:szCs w:val="32"/>
-        </w:rPr>
-      </w:pPr>
-    </w:p>
-    <w:p>
-      <w:pPr>
-        <w:spacing w:after="0" w:line="360" w:lineRule="auto"/>
-        <w:jc w:val="both"/>
-      </w:pPr>
-      <w:r>
-        <w:rPr>
+        <w:t>FPV</w:t>
+      </w:r>
+      <w:r>
+        <w:rPr>
+          <w:color w:val="00B050"/>
+        </w:rPr>
+        <w:t xml:space="preserve"> системы, Навигационные решения, Приемо-передатчики))</w:t>
+      </w:r>
+    </w:p>
+    <w:p>
+      <w:pPr>
+        <w:pStyle w:val="a3"/>
+        <w:numPr>
+          <w:ilvl w:val="0"/>
+          <w:numId w:val="3"/>
+        </w:numPr>
+        <w:spacing w:after="0" w:line="360" w:lineRule="auto"/>
+        <w:jc w:val="both"/>
+        <w:rPr>
+          <w:color w:val="00B050"/>
+        </w:rPr>
+      </w:pPr>
+      <w:r>
+        <w:rPr>
+          <w:color w:val="00B050"/>
+        </w:rPr>
+        <w:t>Кнопка «Доставка и оплата» (включает в себя описание сроков отгрузки)</w:t>
+      </w:r>
+    </w:p>
+    <w:p>
+      <w:pPr>
+        <w:pStyle w:val="a3"/>
+        <w:numPr>
+          <w:ilvl w:val="0"/>
+          <w:numId w:val="3"/>
+        </w:numPr>
+        <w:spacing w:after="0" w:line="360" w:lineRule="auto"/>
+        <w:jc w:val="both"/>
+        <w:rPr>
+          <w:color w:val="00B050"/>
+        </w:rPr>
+      </w:pPr>
+      <w:r>
+        <w:rPr>
+          <w:color w:val="00B050"/>
+        </w:rPr>
+        <w:t>Кнопка «Наверх»</w:t>
+      </w:r>
+    </w:p>
+    <w:p>
+      <w:pPr>
+        <w:pStyle w:val="a3"/>
+        <w:numPr>
+          <w:ilvl w:val="0"/>
+          <w:numId w:val="3"/>
+        </w:numPr>
+        <w:spacing w:after="0" w:line="360" w:lineRule="auto"/>
+        <w:jc w:val="both"/>
+        <w:rPr>
+          <w:color w:val="00B050"/>
+        </w:rPr>
+      </w:pPr>
+      <w:r>
+        <w:rPr>
+          <w:color w:val="00B050"/>
+        </w:rPr>
+        <w:t xml:space="preserve">Кнопка </w:t>
+      </w:r>
+      <w:r>
+        <w:rPr>
+          <w:color w:val="00B050"/>
+        </w:rPr>
+        <w:t>Наши испытания или новости</w:t>
+      </w:r>
+    </w:p>
+    <w:p>
+      <w:pPr>
+        <w:pStyle w:val="a3"/>
+        <w:numPr>
+          <w:ilvl w:val="0"/>
+          <w:numId w:val="3"/>
+        </w:numPr>
+        <w:spacing w:after="0" w:line="360" w:lineRule="auto"/>
+        <w:jc w:val="both"/>
+        <w:rPr>
+          <w:color w:val="00B050"/>
+        </w:rPr>
+      </w:pPr>
+      <w:r>
+        <w:rPr>
+          <w:color w:val="00B050"/>
+        </w:rPr>
+        <w:t xml:space="preserve">Кнопка </w:t>
+      </w:r>
+      <w:r>
+        <w:rPr>
+          <w:color w:val="00B050"/>
+        </w:rPr>
+        <w:t>Часто задаваемые вопросы</w:t>
+      </w:r>
+    </w:p>
+    <w:p>
+      <w:pPr>
+        <w:spacing w:after="0" w:line="360" w:lineRule="auto"/>
+        <w:jc w:val="both"/>
+        <w:rPr>
+          <w:color w:val="00B050"/>
+        </w:rPr>
+      </w:pPr>
+    </w:p>
+    <w:p>
+      <w:pPr>
+        <w:spacing w:after="0" w:line="360" w:lineRule="auto"/>
+        <w:jc w:val="both"/>
+        <w:rPr>
+          <w:color w:val="00B050"/>
+        </w:rPr>
+      </w:pPr>
+      <w:r>
+        <w:rPr>
+          <w:color w:val="00B050"/>
           <w:highlight w:val="yellow"/>
         </w:rPr>
-        <w:t>Главная страница:</w:t>
-      </w:r>
-    </w:p>
-    <w:p>
-      <w:pPr>
-        <w:spacing w:after="0" w:line="360" w:lineRule="auto"/>
-        <w:jc w:val="both"/>
-      </w:pPr>
-      <w:r>
-        <w:t>Заголовок:</w:t>
-      </w:r>
-    </w:p>
-    <w:p>
-      <w:pPr>
-        <w:pStyle w:val="a3"/>
-        <w:numPr>
-          <w:ilvl w:val="0"/>
-          <w:numId w:val="1"/>
-        </w:numPr>
-        <w:spacing w:after="0" w:line="360" w:lineRule="auto"/>
-        <w:jc w:val="both"/>
-        <w:rPr>
-          <w:color w:val="00B050"/>
-        </w:rPr>
-      </w:pPr>
-      <w:r>
-        <w:rPr>
-          <w:color w:val="00B050"/>
-        </w:rPr>
-        <w:t>Иконка-кнопка возврата на домашнюю/главную страницу;</w:t>
-      </w:r>
-    </w:p>
-    <w:p>
-      <w:pPr>
-        <w:pStyle w:val="a3"/>
-        <w:numPr>
-          <w:ilvl w:val="0"/>
-          <w:numId w:val="1"/>
-        </w:numPr>
+        <w:t>Каталог товаров:</w:t>
+      </w:r>
+    </w:p>
+    <w:p>
+      <w:pPr>
+        <w:spacing w:after="0" w:line="360" w:lineRule="auto"/>
+        <w:jc w:val="both"/>
+        <w:rPr>
+          <w:color w:val="00B050"/>
+        </w:rPr>
+      </w:pPr>
+      <w:r>
+        <w:rPr>
+          <w:color w:val="00B050"/>
+        </w:rPr>
+        <w:t>Заголовок и нижнее поле не меняются;</w:t>
+      </w:r>
+    </w:p>
+    <w:p>
+      <w:pPr>
+        <w:spacing w:after="0" w:line="360" w:lineRule="auto"/>
+        <w:jc w:val="both"/>
+        <w:rPr>
+          <w:color w:val="00B050"/>
+        </w:rPr>
+      </w:pPr>
+      <w:r>
+        <w:rPr>
+          <w:color w:val="00B050"/>
+        </w:rPr>
+        <w:t>Тело сайта:</w:t>
+      </w:r>
+    </w:p>
+    <w:p>
+      <w:pPr>
+        <w:spacing w:after="0" w:line="360" w:lineRule="auto"/>
+        <w:jc w:val="both"/>
+        <w:rPr>
+          <w:color w:val="00B050"/>
+        </w:rPr>
+      </w:pPr>
+      <w:r>
+        <w:rPr>
+          <w:color w:val="00B050"/>
+        </w:rPr>
+        <w:t>Отображение товаров как в наших новинках, по 3-4 в ряд, с кнопкой подробнее как в новинках</w:t>
+      </w:r>
+    </w:p>
+    <w:p>
+      <w:pPr>
+        <w:spacing w:after="0" w:line="360" w:lineRule="auto"/>
+        <w:jc w:val="both"/>
+        <w:rPr>
+          <w:color w:val="00B050"/>
+        </w:rPr>
+      </w:pPr>
+    </w:p>
+    <w:p>
+      <w:pPr>
+        <w:spacing w:after="0" w:line="360" w:lineRule="auto"/>
+        <w:jc w:val="both"/>
+        <w:rPr>
+          <w:color w:val="00B050"/>
+        </w:rPr>
+      </w:pPr>
+      <w:r>
+        <w:rPr>
+          <w:color w:val="00B050"/>
+          <w:highlight w:val="yellow"/>
+        </w:rPr>
+        <w:t>Подробнее о товаре:</w:t>
+      </w:r>
+    </w:p>
+    <w:p>
+      <w:pPr>
+        <w:spacing w:after="0" w:line="360" w:lineRule="auto"/>
+        <w:jc w:val="both"/>
+        <w:rPr>
+          <w:color w:val="00B050"/>
+        </w:rPr>
+      </w:pPr>
+      <w:r>
+        <w:rPr>
+          <w:color w:val="00B050"/>
+        </w:rPr>
+        <w:t>Заголовок и нижнее поле не меняются;</w:t>
+      </w:r>
+    </w:p>
+    <w:p>
+      <w:pPr>
+        <w:spacing w:after="0" w:line="360" w:lineRule="auto"/>
+        <w:jc w:val="both"/>
+        <w:rPr>
+          <w:color w:val="00B050"/>
+        </w:rPr>
+      </w:pPr>
+      <w:r>
+        <w:rPr>
+          <w:color w:val="00B050"/>
+        </w:rPr>
+        <w:t>Как с вебтеста пока что взять</w:t>
+      </w:r>
+    </w:p>
+    <w:p>
+      <w:pPr>
+        <w:spacing w:after="0" w:line="360" w:lineRule="auto"/>
+        <w:jc w:val="both"/>
+      </w:pPr>
+    </w:p>
+    <w:p>
+      <w:pPr>
+        <w:spacing w:after="0" w:line="360" w:lineRule="auto"/>
+        <w:jc w:val="both"/>
+      </w:pPr>
+      <w:r>
+        <w:rPr>
+          <w:highlight w:val="yellow"/>
+        </w:rPr>
+        <w:t>Новости:</w:t>
+      </w:r>
+    </w:p>
+    <w:p>
+      <w:pPr>
+        <w:spacing w:after="0" w:line="360" w:lineRule="auto"/>
+        <w:jc w:val="both"/>
+        <w:rPr>
+          <w:lang w:val="en-US"/>
+        </w:rPr>
+      </w:pPr>
+      <w:r>
+        <w:t xml:space="preserve">Сайт </w:t>
+      </w:r>
+      <w:r>
+        <w:rPr>
+          <w:lang w:val="en-US"/>
+        </w:rPr>
+        <w:t>inwave</w:t>
+      </w:r>
+    </w:p>
+    <w:p>
+      <w:pPr>
+        <w:spacing w:after="0" w:line="360" w:lineRule="auto"/>
+        <w:jc w:val="both"/>
+        <w:rPr>
+          <w:color w:val="00B050"/>
+        </w:rPr>
+      </w:pPr>
+      <w:r>
+        <w:rPr>
+          <w:color w:val="00B050"/>
+        </w:rPr>
+        <w:t>Контакты:</w:t>
+      </w:r>
+    </w:p>
+    <w:p>
+      <w:pPr>
         <w:spacing w:after="0" w:line="360" w:lineRule="auto"/>
         <w:jc w:val="both"/>
         <w:rPr>
@@ -650,654 +1247,8 @@
           <w:color w:val="00B050"/>
         </w:rPr>
         <w:lastRenderedPageBreak/>
-        <w:t>Кнопка меню;</w:t>
-      </w:r>
-    </w:p>
-    <w:p>
-      <w:pPr>
-        <w:pStyle w:val="a3"/>
-        <w:numPr>
-          <w:ilvl w:val="0"/>
-          <w:numId w:val="1"/>
-        </w:numPr>
-        <w:spacing w:after="0" w:line="360" w:lineRule="auto"/>
-        <w:jc w:val="both"/>
-        <w:rPr>
-          <w:color w:val="00B050"/>
-        </w:rPr>
-      </w:pPr>
-      <w:r>
-        <w:rPr>
-          <w:color w:val="00B050"/>
-        </w:rPr>
-        <w:t>Окно поиска;</w:t>
-      </w:r>
-    </w:p>
-    <w:p>
-      <w:pPr>
-        <w:pStyle w:val="a3"/>
-        <w:numPr>
-          <w:ilvl w:val="0"/>
-          <w:numId w:val="1"/>
-        </w:numPr>
-        <w:spacing w:after="0" w:line="360" w:lineRule="auto"/>
-        <w:jc w:val="both"/>
-        <w:rPr>
-          <w:color w:val="00B050"/>
-        </w:rPr>
-      </w:pPr>
-      <w:r>
-        <w:rPr>
-          <w:color w:val="00B050"/>
-        </w:rPr>
-        <w:t>Окно каталога</w:t>
-      </w:r>
-    </w:p>
-    <w:p>
-      <w:pPr>
-        <w:spacing w:after="0" w:line="360" w:lineRule="auto"/>
-        <w:jc w:val="both"/>
-      </w:pPr>
-      <w:r>
-        <w:t>Тело сайта:</w:t>
-      </w:r>
-    </w:p>
-    <w:p>
-      <w:pPr>
-        <w:pStyle w:val="a3"/>
-        <w:numPr>
-          <w:ilvl w:val="0"/>
-          <w:numId w:val="2"/>
-        </w:numPr>
-        <w:spacing w:after="0" w:line="360" w:lineRule="auto"/>
-        <w:jc w:val="both"/>
-        <w:rPr>
-          <w:color w:val="00B050"/>
-        </w:rPr>
-      </w:pPr>
-      <w:r>
-        <w:rPr>
-          <w:color w:val="00B050"/>
-        </w:rPr>
-        <w:t>П</w:t>
-      </w:r>
-      <w:r>
-        <w:rPr>
-          <w:color w:val="00B050"/>
-        </w:rPr>
-        <w:t>роизводим в России (описание проектов с фотографиями)</w:t>
-      </w:r>
-    </w:p>
-    <w:p>
-      <w:pPr>
-        <w:pStyle w:val="a3"/>
-        <w:numPr>
-          <w:ilvl w:val="0"/>
-          <w:numId w:val="2"/>
-        </w:numPr>
-        <w:spacing w:after="0" w:line="360" w:lineRule="auto"/>
-        <w:jc w:val="both"/>
-        <w:rPr>
-          <w:color w:val="00B050"/>
-        </w:rPr>
-      </w:pPr>
-      <w:r>
-        <w:rPr>
-          <w:color w:val="00B050"/>
-        </w:rPr>
-        <w:t>Как заказать нашу продукцию (описание оформления заказов, предоставление ссылок на соц. сети и почту)</w:t>
-      </w:r>
-    </w:p>
-    <w:p>
-      <w:pPr>
-        <w:pStyle w:val="a3"/>
-        <w:numPr>
-          <w:ilvl w:val="0"/>
-          <w:numId w:val="2"/>
-        </w:numPr>
-        <w:spacing w:after="0" w:line="360" w:lineRule="auto"/>
-        <w:jc w:val="both"/>
-        <w:rPr>
-          <w:color w:val="00B050"/>
-        </w:rPr>
-      </w:pPr>
-      <w:proofErr w:type="spellStart"/>
-      <w:r>
-        <w:rPr>
-          <w:color w:val="00B050"/>
-        </w:rPr>
-        <w:t>Превьюшка</w:t>
-      </w:r>
-      <w:proofErr w:type="spellEnd"/>
-      <w:r>
-        <w:rPr>
-          <w:color w:val="00B050"/>
-        </w:rPr>
-        <w:t>, как на аналогов нет</w:t>
-      </w:r>
-    </w:p>
-    <w:p>
-      <w:pPr>
-        <w:pStyle w:val="a3"/>
-        <w:numPr>
-          <w:ilvl w:val="0"/>
-          <w:numId w:val="2"/>
-        </w:numPr>
-        <w:spacing w:after="0" w:line="360" w:lineRule="auto"/>
-        <w:jc w:val="both"/>
-        <w:rPr>
-          <w:color w:val="00B050"/>
-        </w:rPr>
-      </w:pPr>
-      <w:r>
-        <w:rPr>
-          <w:color w:val="00B050"/>
-        </w:rPr>
-        <w:t xml:space="preserve">Вода </w:t>
-      </w:r>
-      <w:r>
-        <w:rPr>
-          <w:color w:val="00B050"/>
-        </w:rPr>
-        <w:t>какая-нибудь</w:t>
-      </w:r>
-      <w:r>
-        <w:rPr>
-          <w:color w:val="00B050"/>
-        </w:rPr>
-        <w:t xml:space="preserve"> по типу (Решения, которые реально работают)</w:t>
-      </w:r>
-    </w:p>
-    <w:p>
-      <w:pPr>
-        <w:pStyle w:val="a3"/>
-        <w:numPr>
-          <w:ilvl w:val="0"/>
-          <w:numId w:val="2"/>
-        </w:numPr>
-        <w:spacing w:after="0" w:line="360" w:lineRule="auto"/>
-        <w:jc w:val="both"/>
-        <w:rPr>
-          <w:color w:val="00B050"/>
-          <w:szCs w:val="24"/>
-        </w:rPr>
-      </w:pPr>
-      <w:r>
-        <w:rPr>
-          <w:color w:val="00B050"/>
-          <w:szCs w:val="24"/>
-        </w:rPr>
-        <w:t xml:space="preserve">Новости (смотри сайт </w:t>
-      </w:r>
-      <w:r>
-        <w:rPr>
-          <w:color w:val="00B050"/>
-          <w:szCs w:val="24"/>
-          <w:lang w:val="en-US"/>
-        </w:rPr>
-        <w:t>INWAVE</w:t>
-      </w:r>
-      <w:r>
-        <w:rPr>
-          <w:color w:val="00B050"/>
-          <w:szCs w:val="24"/>
-        </w:rPr>
-        <w:t xml:space="preserve"> ближе к концу)</w:t>
-      </w:r>
-    </w:p>
-    <w:p>
-      <w:pPr>
-        <w:pStyle w:val="a3"/>
-        <w:numPr>
-          <w:ilvl w:val="0"/>
-          <w:numId w:val="2"/>
-        </w:numPr>
-        <w:spacing w:after="0" w:line="360" w:lineRule="auto"/>
-        <w:jc w:val="both"/>
-        <w:rPr>
-          <w:color w:val="00B050"/>
-        </w:rPr>
-      </w:pPr>
-      <w:r>
-        <w:rPr>
-          <w:color w:val="00B050"/>
-        </w:rPr>
-        <w:t>У вас остались вопросы?</w:t>
-      </w:r>
-    </w:p>
-    <w:p>
-      <w:pPr>
-        <w:spacing w:after="0" w:line="360" w:lineRule="auto"/>
-        <w:jc w:val="both"/>
-      </w:pPr>
-      <w:r>
-        <w:t>Нижнее поле:</w:t>
-      </w:r>
-    </w:p>
-    <w:p>
-      <w:pPr>
-        <w:pStyle w:val="a3"/>
-        <w:numPr>
-          <w:ilvl w:val="0"/>
-          <w:numId w:val="3"/>
-        </w:numPr>
-        <w:spacing w:after="0" w:line="360" w:lineRule="auto"/>
-        <w:jc w:val="both"/>
-        <w:rPr>
-          <w:color w:val="00B050"/>
-        </w:rPr>
-      </w:pPr>
-      <w:r>
-        <w:rPr>
-          <w:color w:val="00B050"/>
-        </w:rPr>
-        <w:t>Кнопка «На главную»</w:t>
-      </w:r>
-    </w:p>
-    <w:p>
-      <w:pPr>
-        <w:pStyle w:val="a3"/>
-        <w:numPr>
-          <w:ilvl w:val="0"/>
-          <w:numId w:val="3"/>
-        </w:numPr>
-        <w:spacing w:after="0" w:line="360" w:lineRule="auto"/>
-        <w:jc w:val="both"/>
-        <w:rPr>
-          <w:color w:val="00B050"/>
-        </w:rPr>
-      </w:pPr>
-      <w:r>
-        <w:rPr>
-          <w:color w:val="00B050"/>
-        </w:rPr>
-        <w:t xml:space="preserve">Кнопка «О </w:t>
-      </w:r>
-      <w:r>
-        <w:rPr>
-          <w:color w:val="00B050"/>
-        </w:rPr>
-        <w:t>компании</w:t>
-      </w:r>
-      <w:r>
-        <w:rPr>
-          <w:color w:val="00B050"/>
-        </w:rPr>
-        <w:t>»</w:t>
-      </w:r>
-    </w:p>
-    <w:p>
-      <w:pPr>
-        <w:pStyle w:val="a3"/>
-        <w:numPr>
-          <w:ilvl w:val="0"/>
-          <w:numId w:val="3"/>
-        </w:numPr>
-        <w:spacing w:after="0" w:line="360" w:lineRule="auto"/>
-        <w:jc w:val="both"/>
-        <w:rPr>
-          <w:color w:val="00B050"/>
-        </w:rPr>
-      </w:pPr>
-      <w:r>
-        <w:rPr>
-          <w:color w:val="00B050"/>
-        </w:rPr>
-        <w:t>Кнопка «Контакты»</w:t>
-      </w:r>
-    </w:p>
-    <w:p>
-      <w:pPr>
-        <w:pStyle w:val="a3"/>
-        <w:numPr>
-          <w:ilvl w:val="0"/>
-          <w:numId w:val="3"/>
-        </w:numPr>
-        <w:spacing w:after="0" w:line="360" w:lineRule="auto"/>
-        <w:jc w:val="both"/>
-        <w:rPr>
-          <w:color w:val="00B050"/>
-        </w:rPr>
-      </w:pPr>
-      <w:r>
-        <w:rPr>
-          <w:color w:val="00B050"/>
-        </w:rPr>
-        <w:t>Кнопка «</w:t>
-      </w:r>
-      <w:r>
-        <w:rPr>
-          <w:color w:val="00B050"/>
-        </w:rPr>
-        <w:t>Оформление заказа</w:t>
-      </w:r>
-      <w:r>
-        <w:rPr>
-          <w:color w:val="00B050"/>
-        </w:rPr>
-        <w:t>»</w:t>
-      </w:r>
-      <w:r>
-        <w:rPr>
-          <w:color w:val="00B050"/>
-        </w:rPr>
-        <w:t xml:space="preserve"> (переход на новую страницу с окном выбора категории товара (Системы Приемники и анализаторы обстановки, </w:t>
-      </w:r>
-      <w:r>
-        <w:rPr>
-          <w:color w:val="00B050"/>
-          <w:lang w:val="en-US"/>
-        </w:rPr>
-        <w:t>FPV</w:t>
-      </w:r>
-      <w:r>
-        <w:rPr>
-          <w:color w:val="00B050"/>
-        </w:rPr>
-        <w:t xml:space="preserve"> системы, Навигационные решения, Приемо-передатчики))</w:t>
-      </w:r>
-    </w:p>
-    <w:p>
-      <w:pPr>
-        <w:pStyle w:val="a3"/>
-        <w:numPr>
-          <w:ilvl w:val="0"/>
-          <w:numId w:val="3"/>
-        </w:numPr>
-        <w:spacing w:after="0" w:line="360" w:lineRule="auto"/>
-        <w:jc w:val="both"/>
-        <w:rPr>
-          <w:color w:val="00B050"/>
-        </w:rPr>
-      </w:pPr>
-      <w:r>
-        <w:rPr>
-          <w:color w:val="00B050"/>
-        </w:rPr>
-        <w:t>Кнопка «Доставка и оплата» (включает в себя описание сроков отгрузки)</w:t>
-      </w:r>
-    </w:p>
-    <w:p>
-      <w:pPr>
-        <w:pStyle w:val="a3"/>
-        <w:numPr>
-          <w:ilvl w:val="0"/>
-          <w:numId w:val="3"/>
-        </w:numPr>
-        <w:spacing w:after="0" w:line="360" w:lineRule="auto"/>
-        <w:jc w:val="both"/>
-        <w:rPr>
-          <w:color w:val="00B050"/>
-        </w:rPr>
-      </w:pPr>
-      <w:r>
-        <w:rPr>
-          <w:color w:val="00B050"/>
-        </w:rPr>
-        <w:t>Кнопка «Наверх»</w:t>
-      </w:r>
-    </w:p>
-    <w:p>
-      <w:pPr>
-        <w:pStyle w:val="a3"/>
-        <w:numPr>
-          <w:ilvl w:val="0"/>
-          <w:numId w:val="3"/>
-        </w:numPr>
-        <w:spacing w:after="0" w:line="360" w:lineRule="auto"/>
-        <w:jc w:val="both"/>
-        <w:rPr>
-          <w:color w:val="00B050"/>
-        </w:rPr>
-      </w:pPr>
-      <w:r>
-        <w:rPr>
-          <w:color w:val="00B050"/>
-        </w:rPr>
-        <w:t xml:space="preserve">Кнопка </w:t>
-      </w:r>
-      <w:r>
-        <w:rPr>
-          <w:color w:val="00B050"/>
-        </w:rPr>
-        <w:t>Наши испытания или новости</w:t>
-      </w:r>
-    </w:p>
-    <w:p>
-      <w:pPr>
-        <w:pStyle w:val="a3"/>
-        <w:numPr>
-          <w:ilvl w:val="0"/>
-          <w:numId w:val="3"/>
-        </w:numPr>
-        <w:spacing w:after="0" w:line="360" w:lineRule="auto"/>
-        <w:jc w:val="both"/>
-        <w:rPr>
-          <w:color w:val="00B050"/>
-        </w:rPr>
-      </w:pPr>
-      <w:r>
-        <w:rPr>
-          <w:color w:val="00B050"/>
-        </w:rPr>
-        <w:t xml:space="preserve">Кнопка </w:t>
-      </w:r>
-      <w:r>
-        <w:rPr>
-          <w:color w:val="00B050"/>
-        </w:rPr>
-        <w:t>Часто задаваемые вопросы</w:t>
-      </w:r>
-    </w:p>
-    <w:p>
-      <w:pPr>
-        <w:spacing w:after="0" w:line="360" w:lineRule="auto"/>
-        <w:jc w:val="both"/>
-        <w:rPr>
-          <w:color w:val="00B050"/>
-        </w:rPr>
-      </w:pPr>
-    </w:p>
-    <w:p>
-      <w:pPr>
-        <w:spacing w:after="0" w:line="360" w:lineRule="auto"/>
-        <w:jc w:val="both"/>
-        <w:rPr>
-          <w:color w:val="00B050"/>
-        </w:rPr>
-      </w:pPr>
-      <w:r>
-        <w:rPr>
-          <w:color w:val="00B050"/>
-          <w:highlight w:val="yellow"/>
-        </w:rPr>
-        <w:t>Каталог товаров:</w:t>
-      </w:r>
-    </w:p>
-    <w:p>
-      <w:pPr>
-        <w:spacing w:after="0" w:line="360" w:lineRule="auto"/>
-        <w:jc w:val="both"/>
-        <w:rPr>
-          <w:color w:val="00B050"/>
-        </w:rPr>
-      </w:pPr>
-      <w:r>
-        <w:rPr>
-          <w:color w:val="00B050"/>
-        </w:rPr>
-        <w:t>Заголовок и нижнее поле не меняются;</w:t>
-      </w:r>
-    </w:p>
-    <w:p>
-      <w:pPr>
-        <w:spacing w:after="0" w:line="360" w:lineRule="auto"/>
-        <w:jc w:val="both"/>
-        <w:rPr>
-          <w:color w:val="00B050"/>
-        </w:rPr>
-      </w:pPr>
-      <w:r>
-        <w:rPr>
-          <w:color w:val="00B050"/>
-        </w:rPr>
-        <w:t>Тело сайта:</w:t>
-      </w:r>
-    </w:p>
-    <w:p>
-      <w:pPr>
-        <w:spacing w:after="0" w:line="360" w:lineRule="auto"/>
-        <w:jc w:val="both"/>
-        <w:rPr>
-          <w:color w:val="00B050"/>
-        </w:rPr>
-      </w:pPr>
-      <w:r>
-        <w:rPr>
-          <w:color w:val="00B050"/>
-        </w:rPr>
-        <w:t>Отображение товаров как в наших новинках, по 3-4 в ряд, с кнопкой подробнее как в новинках</w:t>
-      </w:r>
-    </w:p>
-    <w:p>
-      <w:pPr>
-        <w:spacing w:after="0" w:line="360" w:lineRule="auto"/>
-        <w:jc w:val="both"/>
-        <w:rPr>
-          <w:color w:val="00B050"/>
-        </w:rPr>
-      </w:pPr>
-    </w:p>
-    <w:p>
-      <w:pPr>
-        <w:spacing w:after="0" w:line="360" w:lineRule="auto"/>
-        <w:jc w:val="both"/>
-        <w:rPr>
-          <w:color w:val="00B050"/>
-        </w:rPr>
-      </w:pPr>
-      <w:r>
-        <w:rPr>
-          <w:color w:val="00B050"/>
-          <w:highlight w:val="yellow"/>
-        </w:rPr>
-        <w:t>Подробнее о товаре:</w:t>
-      </w:r>
-    </w:p>
-    <w:p>
-      <w:pPr>
-        <w:spacing w:after="0" w:line="360" w:lineRule="auto"/>
-        <w:jc w:val="both"/>
-        <w:rPr>
-          <w:color w:val="00B050"/>
-        </w:rPr>
-      </w:pPr>
-      <w:r>
-        <w:rPr>
-          <w:color w:val="00B050"/>
-        </w:rPr>
-        <w:t>Заголовок и нижнее поле не меняются;</w:t>
-      </w:r>
-    </w:p>
-    <w:p>
-      <w:pPr>
-        <w:spacing w:after="0" w:line="360" w:lineRule="auto"/>
-        <w:jc w:val="both"/>
-        <w:rPr>
-          <w:color w:val="00B050"/>
-        </w:rPr>
-      </w:pPr>
-      <w:r>
-        <w:rPr>
-          <w:color w:val="00B050"/>
-        </w:rPr>
-        <w:t xml:space="preserve">Как с </w:t>
-      </w:r>
-      <w:proofErr w:type="spellStart"/>
-      <w:r>
-        <w:rPr>
-          <w:color w:val="00B050"/>
-        </w:rPr>
-        <w:t>вебтеста</w:t>
-      </w:r>
-      <w:proofErr w:type="spellEnd"/>
-      <w:r>
-        <w:rPr>
-          <w:color w:val="00B050"/>
-        </w:rPr>
-        <w:t xml:space="preserve"> пока что взять</w:t>
-      </w:r>
-    </w:p>
-    <w:p>
-      <w:pPr>
-        <w:spacing w:after="0" w:line="360" w:lineRule="auto"/>
-        <w:jc w:val="both"/>
-      </w:pPr>
-    </w:p>
-    <w:p>
-      <w:pPr>
-        <w:spacing w:after="0" w:line="360" w:lineRule="auto"/>
-        <w:jc w:val="both"/>
-      </w:pPr>
-      <w:r>
-        <w:rPr>
-          <w:highlight w:val="yellow"/>
-        </w:rPr>
-        <w:t>Новости:</w:t>
-      </w:r>
-    </w:p>
-    <w:p>
-      <w:pPr>
-        <w:spacing w:after="0" w:line="360" w:lineRule="auto"/>
-        <w:jc w:val="both"/>
-        <w:rPr>
-          <w:lang w:val="en-US"/>
-        </w:rPr>
-      </w:pPr>
-      <w:r>
-        <w:t xml:space="preserve">Сайт </w:t>
-      </w:r>
-      <w:proofErr w:type="spellStart"/>
-      <w:r>
-        <w:rPr>
-          <w:lang w:val="en-US"/>
-        </w:rPr>
-        <w:t>inwave</w:t>
-      </w:r>
-      <w:proofErr w:type="spellEnd"/>
-    </w:p>
-    <w:p>
-      <w:pPr>
-        <w:spacing w:after="0" w:line="360" w:lineRule="auto"/>
-        <w:jc w:val="both"/>
-        <w:rPr>
-          <w:color w:val="00B050"/>
-        </w:rPr>
-      </w:pPr>
-      <w:r>
-        <w:rPr>
-          <w:color w:val="00B050"/>
-        </w:rPr>
-        <w:lastRenderedPageBreak/>
-        <w:t>Контакты:</w:t>
-      </w:r>
-    </w:p>
-    <w:p>
-      <w:pPr>
-        <w:spacing w:after="0" w:line="360" w:lineRule="auto"/>
-        <w:jc w:val="both"/>
-        <w:rPr>
-          <w:color w:val="00B050"/>
-        </w:rPr>
-      </w:pPr>
-      <w:proofErr w:type="spellStart"/>
-      <w:r>
-        <w:rPr>
-          <w:color w:val="00B050"/>
-        </w:rPr>
         <w:t>Вебтест</w:t>
       </w:r>
-      <w:proofErr w:type="spellEnd"/>
     </w:p>
     <w:p>
       <w:pPr>

</xml_diff>

<commit_message>
Added async & await pattern
</commit_message>
<xml_diff>
--- a/Информационный сайт отдела.docx
+++ b/Информационный сайт отдела.docx
@@ -60,8 +60,9 @@
           <w:color w:val="000000"/>
           <w:sz w:val="32"/>
           <w:szCs w:val="32"/>
-        </w:rPr>
-        <w:t>Переделать всё что можно на асинхронность</w:t>
+          <w:highlight w:val="yellow"/>
+        </w:rPr>
+        <w:t>Доделать ссылки и кнопки в футере (о компании, услуги, служба поддержки, сервис, доставка);</w:t>
       </w:r>
     </w:p>
     <w:p>
@@ -83,19 +84,24 @@
       </w:pPr>
       <w:r>
         <w:rPr>
-          <w:color w:val="000000"/>
           <w:sz w:val="32"/>
           <w:szCs w:val="32"/>
         </w:rPr>
-        <w:t xml:space="preserve">В админе сделать </w:t>
-      </w:r>
-      <w:r>
-        <w:rPr>
-          <w:color w:val="000000"/>
+        <w:t xml:space="preserve">В </w:t>
+      </w:r>
+      <w:r>
+        <w:rPr>
           <w:sz w:val="32"/>
           <w:szCs w:val="32"/>
         </w:rPr>
-        <w:t>установку новых товаров на главной странице</w:t>
+        <w:t>телеграм-</w:t>
+      </w:r>
+      <w:r>
+        <w:rPr>
+          <w:sz w:val="32"/>
+          <w:szCs w:val="32"/>
+        </w:rPr>
+        <w:t>бота добавить пару функций (услуги и прочее)</w:t>
       </w:r>
     </w:p>
     <w:p>
@@ -117,12 +123,10 @@
       </w:pPr>
       <w:r>
         <w:rPr>
-          <w:color w:val="000000"/>
           <w:sz w:val="32"/>
           <w:szCs w:val="32"/>
-          <w:highlight w:val="yellow"/>
-        </w:rPr>
-        <w:t>Доделать ссылки и кнопки в футере (о компании, услуги, служба поддержки, сервис, доставка);</w:t>
+        </w:rPr>
+        <w:t>Сделать кнопку с админа «Технический перерыв» для юзеров</w:t>
       </w:r>
     </w:p>
     <w:p>
@@ -147,70 +151,6 @@
           <w:sz w:val="32"/>
           <w:szCs w:val="32"/>
         </w:rPr>
-        <w:t xml:space="preserve">В </w:t>
-      </w:r>
-      <w:r>
-        <w:rPr>
-          <w:sz w:val="32"/>
-          <w:szCs w:val="32"/>
-        </w:rPr>
-        <w:t>телеграм-</w:t>
-      </w:r>
-      <w:r>
-        <w:rPr>
-          <w:sz w:val="32"/>
-          <w:szCs w:val="32"/>
-        </w:rPr>
-        <w:t>бота добавить пару функций (услуги и прочее)</w:t>
-      </w:r>
-    </w:p>
-    <w:p>
-      <w:pPr>
-        <w:pStyle w:val="a3"/>
-        <w:numPr>
-          <w:ilvl w:val="0"/>
-          <w:numId w:val="4"/>
-        </w:numPr>
-        <w:autoSpaceDE w:val="0"/>
-        <w:autoSpaceDN w:val="0"/>
-        <w:adjustRightInd w:val="0"/>
-        <w:spacing w:after="0" w:line="360" w:lineRule="auto"/>
-        <w:rPr>
-          <w:color w:val="000000"/>
-          <w:sz w:val="32"/>
-          <w:szCs w:val="32"/>
-        </w:rPr>
-      </w:pPr>
-      <w:r>
-        <w:rPr>
-          <w:sz w:val="32"/>
-          <w:szCs w:val="32"/>
-        </w:rPr>
-        <w:t>Сделать кнопку с админа «Технический перерыв» для юзеров</w:t>
-      </w:r>
-    </w:p>
-    <w:p>
-      <w:pPr>
-        <w:pStyle w:val="a3"/>
-        <w:numPr>
-          <w:ilvl w:val="0"/>
-          <w:numId w:val="4"/>
-        </w:numPr>
-        <w:autoSpaceDE w:val="0"/>
-        <w:autoSpaceDN w:val="0"/>
-        <w:adjustRightInd w:val="0"/>
-        <w:spacing w:after="0" w:line="360" w:lineRule="auto"/>
-        <w:rPr>
-          <w:color w:val="000000"/>
-          <w:sz w:val="32"/>
-          <w:szCs w:val="32"/>
-        </w:rPr>
-      </w:pPr>
-      <w:r>
-        <w:rPr>
-          <w:sz w:val="32"/>
-          <w:szCs w:val="32"/>
-        </w:rPr>
         <w:t>После оформления заказа сделать кнопку-ссылку на «О заказе»</w:t>
       </w:r>
       <w:r>
@@ -328,8 +268,18 @@
           <w:sz w:val="32"/>
           <w:szCs w:val="32"/>
         </w:rPr>
-        <w:t>Сделать оформление кнопки корзины как в вебтесте</w:t>
-      </w:r>
+        <w:t xml:space="preserve">Сделать оформление кнопки корзины как в </w:t>
+      </w:r>
+      <w:proofErr w:type="spellStart"/>
+      <w:r>
+        <w:rPr>
+          <w:color w:val="000000"/>
+          <w:sz w:val="32"/>
+          <w:szCs w:val="32"/>
+        </w:rPr>
+        <w:t>вебтесте</w:t>
+      </w:r>
+      <w:proofErr w:type="spellEnd"/>
     </w:p>
     <w:p>
       <w:pPr>
@@ -413,6 +363,7 @@
         </w:rPr>
         <w:t xml:space="preserve"> (</w:t>
       </w:r>
+      <w:proofErr w:type="spellStart"/>
       <w:r>
         <w:rPr>
           <w:color w:val="00B050"/>
@@ -421,6 +372,7 @@
         </w:rPr>
         <w:t>webtest</w:t>
       </w:r>
+      <w:proofErr w:type="spellEnd"/>
       <w:r>
         <w:rPr>
           <w:color w:val="00B050"/>
@@ -527,7 +479,25 @@
           <w:szCs w:val="24"/>
           <w:lang w:val="en-US"/>
         </w:rPr>
-        <w:t xml:space="preserve"> (webtest – views – product – index)</w:t>
+        <w:t xml:space="preserve"> (</w:t>
+      </w:r>
+      <w:proofErr w:type="spellStart"/>
+      <w:r>
+        <w:rPr>
+          <w:color w:val="00B050"/>
+          <w:szCs w:val="24"/>
+          <w:lang w:val="en-US"/>
+        </w:rPr>
+        <w:t>webtest</w:t>
+      </w:r>
+      <w:proofErr w:type="spellEnd"/>
+      <w:r>
+        <w:rPr>
+          <w:color w:val="00B050"/>
+          <w:szCs w:val="24"/>
+          <w:lang w:val="en-US"/>
+        </w:rPr>
+        <w:t xml:space="preserve"> – views – product – index)</w:t>
       </w:r>
     </w:p>
     <w:p>
@@ -646,7 +616,6 @@
         <w:rPr>
           <w:color w:val="00B050"/>
         </w:rPr>
-        <w:lastRenderedPageBreak/>
         <w:t>Окно поиска;</w:t>
       </w:r>
     </w:p>
@@ -722,6 +691,7 @@
         <w:rPr>
           <w:color w:val="00B050"/>
         </w:rPr>
+        <w:lastRenderedPageBreak/>
         <w:t>Как заказать нашу продукцию (описание оформления заказов, предоставление ссылок на соц. сети и почту)</w:t>
       </w:r>
     </w:p>
@@ -738,11 +708,19 @@
           <w:color w:val="00B050"/>
         </w:rPr>
       </w:pPr>
-      <w:r>
-        <w:rPr>
-          <w:color w:val="00B050"/>
-        </w:rPr>
-        <w:t>Превьюшка, как на аналогов нет</w:t>
+      <w:proofErr w:type="spellStart"/>
+      <w:r>
+        <w:rPr>
+          <w:color w:val="00B050"/>
+        </w:rPr>
+        <w:t>Превьюшка</w:t>
+      </w:r>
+      <w:proofErr w:type="spellEnd"/>
+      <w:r>
+        <w:rPr>
+          <w:color w:val="00B050"/>
+        </w:rPr>
+        <w:t>, как на аналогов нет</w:t>
       </w:r>
     </w:p>
     <w:p>
@@ -1180,7 +1158,21 @@
         <w:rPr>
           <w:color w:val="00B050"/>
         </w:rPr>
-        <w:t>Как с вебтеста пока что взять</w:t>
+        <w:t xml:space="preserve">Как с </w:t>
+      </w:r>
+      <w:proofErr w:type="spellStart"/>
+      <w:r>
+        <w:rPr>
+          <w:color w:val="00B050"/>
+        </w:rPr>
+        <w:t>вебтеста</w:t>
+      </w:r>
+      <w:proofErr w:type="spellEnd"/>
+      <w:r>
+        <w:rPr>
+          <w:color w:val="00B050"/>
+        </w:rPr>
+        <w:t xml:space="preserve"> пока что взять</w:t>
       </w:r>
     </w:p>
     <w:p>
@@ -1212,12 +1204,14 @@
       <w:r>
         <w:t xml:space="preserve">Сайт </w:t>
       </w:r>
+      <w:proofErr w:type="spellStart"/>
       <w:r>
         <w:rPr>
           <w:lang w:val="en-US"/>
         </w:rPr>
         <w:t>inwave</w:t>
       </w:r>
+      <w:proofErr w:type="spellEnd"/>
     </w:p>
     <w:p>
       <w:pPr>
@@ -1242,13 +1236,14 @@
           <w:color w:val="00B050"/>
         </w:rPr>
       </w:pPr>
-      <w:r>
-        <w:rPr>
-          <w:color w:val="00B050"/>
-        </w:rPr>
-        <w:lastRenderedPageBreak/>
+      <w:proofErr w:type="spellStart"/>
+      <w:r>
+        <w:rPr>
+          <w:color w:val="00B050"/>
+        </w:rPr>
         <w:t>Вебтест</w:t>
       </w:r>
+      <w:proofErr w:type="spellEnd"/>
     </w:p>
     <w:p>
       <w:pPr>

</xml_diff>

<commit_message>
Realization of the technical break
</commit_message>
<xml_diff>
--- a/Информационный сайт отдела.docx
+++ b/Информационный сайт отдела.docx
@@ -128,6 +128,27 @@
         </w:rPr>
         <w:t>Сделать кнопку с админа «Технический перерыв» для юзеров</w:t>
       </w:r>
+      <w:r>
+        <w:rPr>
+          <w:sz w:val="32"/>
+          <w:szCs w:val="32"/>
+        </w:rPr>
+        <w:t xml:space="preserve"> (</w:t>
+      </w:r>
+      <w:r>
+        <w:rPr>
+          <w:sz w:val="32"/>
+          <w:szCs w:val="32"/>
+        </w:rPr>
+        <w:t>досмотреть эту функцию</w:t>
+      </w:r>
+      <w:r>
+        <w:rPr>
+          <w:sz w:val="32"/>
+          <w:szCs w:val="32"/>
+        </w:rPr>
+        <w:t>)</w:t>
+      </w:r>
     </w:p>
     <w:p>
       <w:pPr>
@@ -150,28 +171,7 @@
           <w:sz w:val="32"/>
           <w:szCs w:val="32"/>
         </w:rPr>
-        <w:t>После оформления заказа сделать кнопку-ссылку на «О заказе»</w:t>
-      </w:r>
-      <w:r>
-        <w:rPr>
-          <w:sz w:val="32"/>
-          <w:szCs w:val="32"/>
-        </w:rPr>
-        <w:t xml:space="preserve"> (или переход в личный кабинет</w:t>
-      </w:r>
-      <w:r>
-        <w:rPr>
-          <w:sz w:val="32"/>
-          <w:szCs w:val="32"/>
-        </w:rPr>
-        <w:t>, там будут заказы</w:t>
-      </w:r>
-      <w:r>
-        <w:rPr>
-          <w:sz w:val="32"/>
-          <w:szCs w:val="32"/>
-        </w:rPr>
-        <w:t>)</w:t>
+        <w:t>Подумать, что ещё нужно в личный кабинет</w:t>
       </w:r>
     </w:p>
     <w:p>
@@ -193,17 +193,8 @@
           <w:sz w:val="32"/>
           <w:szCs w:val="32"/>
         </w:rPr>
-        <w:t xml:space="preserve">Новости в виде поста с картинками как на </w:t>
-      </w:r>
-      <w:proofErr w:type="spellStart"/>
-      <w:r>
-        <w:rPr>
-          <w:sz w:val="32"/>
-          <w:szCs w:val="32"/>
-        </w:rPr>
-        <w:t>хабре</w:t>
-      </w:r>
-      <w:proofErr w:type="spellEnd"/>
+        <w:t>Новости в виде поста с картинками как на хабре</w:t>
+      </w:r>
     </w:p>
     <w:p>
       <w:pPr>
@@ -222,6 +213,7 @@
           <w:color w:val="FF0000"/>
           <w:sz w:val="40"/>
           <w:szCs w:val="40"/>
+          <w:lang w:val="en-US"/>
         </w:rPr>
       </w:pPr>
       <w:r>
@@ -298,18 +290,8 @@
           <w:sz w:val="32"/>
           <w:szCs w:val="32"/>
         </w:rPr>
-        <w:t xml:space="preserve">Сделать оформление кнопки корзины как в </w:t>
-      </w:r>
-      <w:proofErr w:type="spellStart"/>
-      <w:r>
-        <w:rPr>
-          <w:color w:val="000000"/>
-          <w:sz w:val="32"/>
-          <w:szCs w:val="32"/>
-        </w:rPr>
-        <w:t>вебтесте</w:t>
-      </w:r>
-      <w:proofErr w:type="spellEnd"/>
+        <w:t>Сделать оформление кнопки корзины как в вебтесте</w:t>
+      </w:r>
     </w:p>
     <w:p>
       <w:pPr>
@@ -336,6 +318,14 @@
         </w:rPr>
         <w:t>Кнопка написать на почту в самом низу работает плохо</w:t>
       </w:r>
+      <w:r>
+        <w:rPr>
+          <w:color w:val="000000"/>
+          <w:sz w:val="32"/>
+          <w:szCs w:val="32"/>
+        </w:rPr>
+        <w:t xml:space="preserve"> (нужно убрать оттуда копирование)</w:t>
+      </w:r>
     </w:p>
     <w:p>
       <w:pPr>
@@ -419,7 +409,6 @@
         </w:rPr>
         <w:t xml:space="preserve"> (</w:t>
       </w:r>
-      <w:proofErr w:type="spellStart"/>
       <w:r>
         <w:rPr>
           <w:color w:val="00B050"/>
@@ -428,7 +417,6 @@
         </w:rPr>
         <w:t>webtest</w:t>
       </w:r>
-      <w:proofErr w:type="spellEnd"/>
       <w:r>
         <w:rPr>
           <w:color w:val="00B050"/>
@@ -535,739 +523,697 @@
           <w:szCs w:val="24"/>
           <w:lang w:val="en-US"/>
         </w:rPr>
-        <w:t xml:space="preserve"> (</w:t>
-      </w:r>
-      <w:proofErr w:type="spellStart"/>
+        <w:t xml:space="preserve"> (webtest – views – product – index)</w:t>
+      </w:r>
+    </w:p>
+    <w:p>
+      <w:pPr>
+        <w:spacing w:after="0" w:line="360" w:lineRule="auto"/>
+        <w:jc w:val="both"/>
+        <w:rPr>
+          <w:szCs w:val="24"/>
+        </w:rPr>
+      </w:pPr>
+      <w:r>
+        <w:rPr>
+          <w:szCs w:val="24"/>
+        </w:rPr>
+        <w:t>Страница под каждую категорию товаров</w:t>
+      </w:r>
+      <w:r>
+        <w:rPr>
+          <w:szCs w:val="24"/>
+        </w:rPr>
+        <w:t xml:space="preserve"> </w:t>
+      </w:r>
+      <w:r>
+        <w:rPr>
+          <w:szCs w:val="24"/>
+        </w:rPr>
+        <w:t>-?????</w:t>
+      </w:r>
+    </w:p>
+    <w:p>
+      <w:pPr>
+        <w:spacing w:after="0" w:line="360" w:lineRule="auto"/>
+        <w:jc w:val="both"/>
+        <w:rPr>
+          <w:color w:val="FF0000"/>
+          <w:sz w:val="32"/>
+          <w:szCs w:val="32"/>
+        </w:rPr>
+      </w:pPr>
+    </w:p>
+    <w:p>
+      <w:pPr>
+        <w:spacing w:after="0" w:line="360" w:lineRule="auto"/>
+        <w:jc w:val="both"/>
+      </w:pPr>
+      <w:r>
+        <w:rPr>
+          <w:highlight w:val="yellow"/>
+        </w:rPr>
+        <w:t>Главная страница:</w:t>
+      </w:r>
+    </w:p>
+    <w:p>
+      <w:pPr>
+        <w:spacing w:after="0" w:line="360" w:lineRule="auto"/>
+        <w:jc w:val="both"/>
+      </w:pPr>
+      <w:r>
+        <w:t>Заголовок:</w:t>
+      </w:r>
+    </w:p>
+    <w:p>
+      <w:pPr>
+        <w:pStyle w:val="a3"/>
+        <w:numPr>
+          <w:ilvl w:val="0"/>
+          <w:numId w:val="1"/>
+        </w:numPr>
+        <w:spacing w:after="0" w:line="360" w:lineRule="auto"/>
+        <w:jc w:val="both"/>
+        <w:rPr>
+          <w:color w:val="00B050"/>
+        </w:rPr>
+      </w:pPr>
+      <w:r>
+        <w:rPr>
+          <w:color w:val="00B050"/>
+        </w:rPr>
+        <w:t>Иконка-кнопка возврата на домашнюю/главную страницу;</w:t>
+      </w:r>
+    </w:p>
+    <w:p>
+      <w:pPr>
+        <w:pStyle w:val="a3"/>
+        <w:numPr>
+          <w:ilvl w:val="0"/>
+          <w:numId w:val="1"/>
+        </w:numPr>
+        <w:spacing w:after="0" w:line="360" w:lineRule="auto"/>
+        <w:jc w:val="both"/>
+        <w:rPr>
+          <w:color w:val="00B050"/>
+        </w:rPr>
+      </w:pPr>
+      <w:r>
+        <w:rPr>
+          <w:color w:val="00B050"/>
+        </w:rPr>
+        <w:t>Кнопка меню;</w:t>
+      </w:r>
+    </w:p>
+    <w:p>
+      <w:pPr>
+        <w:pStyle w:val="a3"/>
+        <w:numPr>
+          <w:ilvl w:val="0"/>
+          <w:numId w:val="1"/>
+        </w:numPr>
+        <w:spacing w:after="0" w:line="360" w:lineRule="auto"/>
+        <w:jc w:val="both"/>
+        <w:rPr>
+          <w:color w:val="00B050"/>
+        </w:rPr>
+      </w:pPr>
+      <w:r>
+        <w:rPr>
+          <w:color w:val="00B050"/>
+        </w:rPr>
+        <w:t>Окно поиска;</w:t>
+      </w:r>
+    </w:p>
+    <w:p>
+      <w:pPr>
+        <w:pStyle w:val="a3"/>
+        <w:numPr>
+          <w:ilvl w:val="0"/>
+          <w:numId w:val="1"/>
+        </w:numPr>
+        <w:spacing w:after="0" w:line="360" w:lineRule="auto"/>
+        <w:jc w:val="both"/>
+        <w:rPr>
+          <w:color w:val="00B050"/>
+        </w:rPr>
+      </w:pPr>
+      <w:r>
+        <w:rPr>
+          <w:color w:val="00B050"/>
+        </w:rPr>
+        <w:t>Окно каталога</w:t>
+      </w:r>
+    </w:p>
+    <w:p>
+      <w:pPr>
+        <w:spacing w:after="0" w:line="360" w:lineRule="auto"/>
+        <w:jc w:val="both"/>
+      </w:pPr>
+      <w:r>
+        <w:lastRenderedPageBreak/>
+        <w:t>Тело сайта:</w:t>
+      </w:r>
+    </w:p>
+    <w:p>
+      <w:pPr>
+        <w:pStyle w:val="a3"/>
+        <w:numPr>
+          <w:ilvl w:val="0"/>
+          <w:numId w:val="2"/>
+        </w:numPr>
+        <w:spacing w:after="0" w:line="360" w:lineRule="auto"/>
+        <w:jc w:val="both"/>
+        <w:rPr>
+          <w:color w:val="00B050"/>
+        </w:rPr>
+      </w:pPr>
+      <w:r>
+        <w:rPr>
+          <w:color w:val="00B050"/>
+        </w:rPr>
+        <w:t>П</w:t>
+      </w:r>
+      <w:r>
+        <w:rPr>
+          <w:color w:val="00B050"/>
+        </w:rPr>
+        <w:t>роизводим в России (описание проектов с фотографиями)</w:t>
+      </w:r>
+    </w:p>
+    <w:p>
+      <w:pPr>
+        <w:pStyle w:val="a3"/>
+        <w:numPr>
+          <w:ilvl w:val="0"/>
+          <w:numId w:val="2"/>
+        </w:numPr>
+        <w:spacing w:after="0" w:line="360" w:lineRule="auto"/>
+        <w:jc w:val="both"/>
+        <w:rPr>
+          <w:color w:val="00B050"/>
+        </w:rPr>
+      </w:pPr>
+      <w:r>
+        <w:rPr>
+          <w:color w:val="00B050"/>
+        </w:rPr>
+        <w:t>Как заказать нашу продукцию (описание оформления заказов, предоставление ссылок на соц. сети и почту)</w:t>
+      </w:r>
+    </w:p>
+    <w:p>
+      <w:pPr>
+        <w:pStyle w:val="a3"/>
+        <w:numPr>
+          <w:ilvl w:val="0"/>
+          <w:numId w:val="2"/>
+        </w:numPr>
+        <w:spacing w:after="0" w:line="360" w:lineRule="auto"/>
+        <w:jc w:val="both"/>
+        <w:rPr>
+          <w:color w:val="00B050"/>
+        </w:rPr>
+      </w:pPr>
+      <w:r>
+        <w:rPr>
+          <w:color w:val="00B050"/>
+        </w:rPr>
+        <w:t>Превьюшка, как на аналогов нет</w:t>
+      </w:r>
+    </w:p>
+    <w:p>
+      <w:pPr>
+        <w:pStyle w:val="a3"/>
+        <w:numPr>
+          <w:ilvl w:val="0"/>
+          <w:numId w:val="2"/>
+        </w:numPr>
+        <w:spacing w:after="0" w:line="360" w:lineRule="auto"/>
+        <w:jc w:val="both"/>
+        <w:rPr>
+          <w:color w:val="00B050"/>
+        </w:rPr>
+      </w:pPr>
+      <w:r>
+        <w:rPr>
+          <w:color w:val="00B050"/>
+        </w:rPr>
+        <w:t xml:space="preserve">Вода </w:t>
+      </w:r>
+      <w:r>
+        <w:rPr>
+          <w:color w:val="00B050"/>
+        </w:rPr>
+        <w:t>какая-нибудь</w:t>
+      </w:r>
+      <w:r>
+        <w:rPr>
+          <w:color w:val="00B050"/>
+        </w:rPr>
+        <w:t xml:space="preserve"> по типу (Решения, которые реально работают)</w:t>
+      </w:r>
+    </w:p>
+    <w:p>
+      <w:pPr>
+        <w:pStyle w:val="a3"/>
+        <w:numPr>
+          <w:ilvl w:val="0"/>
+          <w:numId w:val="2"/>
+        </w:numPr>
+        <w:spacing w:after="0" w:line="360" w:lineRule="auto"/>
+        <w:jc w:val="both"/>
+        <w:rPr>
+          <w:color w:val="00B050"/>
+          <w:szCs w:val="24"/>
+        </w:rPr>
+      </w:pPr>
+      <w:r>
+        <w:rPr>
+          <w:color w:val="00B050"/>
+          <w:szCs w:val="24"/>
+        </w:rPr>
+        <w:t xml:space="preserve">Новости (смотри сайт </w:t>
+      </w:r>
       <w:r>
         <w:rPr>
           <w:color w:val="00B050"/>
           <w:szCs w:val="24"/>
           <w:lang w:val="en-US"/>
         </w:rPr>
-        <w:t>webtest</w:t>
-      </w:r>
-      <w:proofErr w:type="spellEnd"/>
-      <w:r>
-        <w:rPr>
-          <w:color w:val="00B050"/>
-          <w:szCs w:val="24"/>
+        <w:t>INWAVE</w:t>
+      </w:r>
+      <w:r>
+        <w:rPr>
+          <w:color w:val="00B050"/>
+          <w:szCs w:val="24"/>
+        </w:rPr>
+        <w:t xml:space="preserve"> ближе к концу)</w:t>
+      </w:r>
+    </w:p>
+    <w:p>
+      <w:pPr>
+        <w:pStyle w:val="a3"/>
+        <w:numPr>
+          <w:ilvl w:val="0"/>
+          <w:numId w:val="2"/>
+        </w:numPr>
+        <w:spacing w:after="0" w:line="360" w:lineRule="auto"/>
+        <w:jc w:val="both"/>
+        <w:rPr>
+          <w:color w:val="00B050"/>
+        </w:rPr>
+      </w:pPr>
+      <w:r>
+        <w:rPr>
+          <w:color w:val="00B050"/>
+        </w:rPr>
+        <w:t>У вас остались вопросы?</w:t>
+      </w:r>
+    </w:p>
+    <w:p>
+      <w:pPr>
+        <w:spacing w:after="0" w:line="360" w:lineRule="auto"/>
+        <w:jc w:val="both"/>
+      </w:pPr>
+      <w:r>
+        <w:t>Нижнее поле:</w:t>
+      </w:r>
+    </w:p>
+    <w:p>
+      <w:pPr>
+        <w:pStyle w:val="a3"/>
+        <w:numPr>
+          <w:ilvl w:val="0"/>
+          <w:numId w:val="3"/>
+        </w:numPr>
+        <w:spacing w:after="0" w:line="360" w:lineRule="auto"/>
+        <w:jc w:val="both"/>
+        <w:rPr>
+          <w:color w:val="00B050"/>
+        </w:rPr>
+      </w:pPr>
+      <w:r>
+        <w:rPr>
+          <w:color w:val="00B050"/>
+        </w:rPr>
+        <w:t>Кнопка «На главную»</w:t>
+      </w:r>
+    </w:p>
+    <w:p>
+      <w:pPr>
+        <w:pStyle w:val="a3"/>
+        <w:numPr>
+          <w:ilvl w:val="0"/>
+          <w:numId w:val="3"/>
+        </w:numPr>
+        <w:spacing w:after="0" w:line="360" w:lineRule="auto"/>
+        <w:jc w:val="both"/>
+        <w:rPr>
+          <w:color w:val="00B050"/>
+        </w:rPr>
+      </w:pPr>
+      <w:r>
+        <w:rPr>
+          <w:color w:val="00B050"/>
+        </w:rPr>
+        <w:t xml:space="preserve">Кнопка «О </w:t>
+      </w:r>
+      <w:r>
+        <w:rPr>
+          <w:color w:val="00B050"/>
+        </w:rPr>
+        <w:t>компании</w:t>
+      </w:r>
+      <w:r>
+        <w:rPr>
+          <w:color w:val="00B050"/>
+        </w:rPr>
+        <w:t>»</w:t>
+      </w:r>
+    </w:p>
+    <w:p>
+      <w:pPr>
+        <w:pStyle w:val="a3"/>
+        <w:numPr>
+          <w:ilvl w:val="0"/>
+          <w:numId w:val="3"/>
+        </w:numPr>
+        <w:spacing w:after="0" w:line="360" w:lineRule="auto"/>
+        <w:jc w:val="both"/>
+        <w:rPr>
+          <w:color w:val="00B050"/>
+        </w:rPr>
+      </w:pPr>
+      <w:r>
+        <w:rPr>
+          <w:color w:val="00B050"/>
+        </w:rPr>
+        <w:t>Кнопка «Контакты»</w:t>
+      </w:r>
+    </w:p>
+    <w:p>
+      <w:pPr>
+        <w:pStyle w:val="a3"/>
+        <w:numPr>
+          <w:ilvl w:val="0"/>
+          <w:numId w:val="3"/>
+        </w:numPr>
+        <w:spacing w:after="0" w:line="360" w:lineRule="auto"/>
+        <w:jc w:val="both"/>
+        <w:rPr>
+          <w:color w:val="00B050"/>
+        </w:rPr>
+      </w:pPr>
+      <w:r>
+        <w:rPr>
+          <w:color w:val="00B050"/>
+        </w:rPr>
+        <w:t>Кнопка «</w:t>
+      </w:r>
+      <w:r>
+        <w:rPr>
+          <w:color w:val="00B050"/>
+        </w:rPr>
+        <w:t>Оформление заказа</w:t>
+      </w:r>
+      <w:r>
+        <w:rPr>
+          <w:color w:val="00B050"/>
+        </w:rPr>
+        <w:t>»</w:t>
+      </w:r>
+      <w:r>
+        <w:rPr>
+          <w:color w:val="00B050"/>
+        </w:rPr>
+        <w:t xml:space="preserve"> (переход на новую страницу с окном выбора категории товара (Системы Приемники и анализаторы обстановки, </w:t>
+      </w:r>
+      <w:r>
+        <w:rPr>
+          <w:color w:val="00B050"/>
           <w:lang w:val="en-US"/>
         </w:rPr>
-        <w:t xml:space="preserve"> – views – product – index)</w:t>
-      </w:r>
-    </w:p>
-    <w:p>
-      <w:pPr>
-        <w:spacing w:after="0" w:line="360" w:lineRule="auto"/>
-        <w:jc w:val="both"/>
-        <w:rPr>
-          <w:szCs w:val="24"/>
-        </w:rPr>
-      </w:pPr>
-      <w:r>
-        <w:rPr>
-          <w:szCs w:val="24"/>
-        </w:rPr>
-        <w:t>Страница под каждую категорию товаров</w:t>
-      </w:r>
-      <w:r>
-        <w:rPr>
-          <w:szCs w:val="24"/>
-        </w:rPr>
-        <w:t xml:space="preserve"> </w:t>
-      </w:r>
-      <w:r>
-        <w:rPr>
-          <w:szCs w:val="24"/>
-        </w:rPr>
-        <w:t>-?????</w:t>
-      </w:r>
-    </w:p>
-    <w:p>
-      <w:pPr>
-        <w:spacing w:after="0" w:line="360" w:lineRule="auto"/>
-        <w:jc w:val="both"/>
-        <w:rPr>
-          <w:color w:val="FF0000"/>
-          <w:sz w:val="32"/>
-          <w:szCs w:val="32"/>
-        </w:rPr>
-      </w:pPr>
-    </w:p>
-    <w:p>
-      <w:pPr>
-        <w:spacing w:after="0" w:line="360" w:lineRule="auto"/>
-        <w:jc w:val="both"/>
-      </w:pPr>
-      <w:r>
-        <w:rPr>
+        <w:t>FPV</w:t>
+      </w:r>
+      <w:r>
+        <w:rPr>
+          <w:color w:val="00B050"/>
+        </w:rPr>
+        <w:t xml:space="preserve"> системы, Навигационные решения, Приемо-передатчики))</w:t>
+      </w:r>
+    </w:p>
+    <w:p>
+      <w:pPr>
+        <w:pStyle w:val="a3"/>
+        <w:numPr>
+          <w:ilvl w:val="0"/>
+          <w:numId w:val="3"/>
+        </w:numPr>
+        <w:spacing w:after="0" w:line="360" w:lineRule="auto"/>
+        <w:jc w:val="both"/>
+        <w:rPr>
+          <w:color w:val="00B050"/>
+        </w:rPr>
+      </w:pPr>
+      <w:r>
+        <w:rPr>
+          <w:color w:val="00B050"/>
+        </w:rPr>
+        <w:t>Кнопка «Доставка и оплата» (включает в себя описание сроков отгрузки)</w:t>
+      </w:r>
+    </w:p>
+    <w:p>
+      <w:pPr>
+        <w:pStyle w:val="a3"/>
+        <w:numPr>
+          <w:ilvl w:val="0"/>
+          <w:numId w:val="3"/>
+        </w:numPr>
+        <w:spacing w:after="0" w:line="360" w:lineRule="auto"/>
+        <w:jc w:val="both"/>
+        <w:rPr>
+          <w:color w:val="00B050"/>
+        </w:rPr>
+      </w:pPr>
+      <w:r>
+        <w:rPr>
+          <w:color w:val="00B050"/>
+        </w:rPr>
+        <w:t>Кнопка «Наверх»</w:t>
+      </w:r>
+    </w:p>
+    <w:p>
+      <w:pPr>
+        <w:pStyle w:val="a3"/>
+        <w:numPr>
+          <w:ilvl w:val="0"/>
+          <w:numId w:val="3"/>
+        </w:numPr>
+        <w:spacing w:after="0" w:line="360" w:lineRule="auto"/>
+        <w:jc w:val="both"/>
+        <w:rPr>
+          <w:color w:val="00B050"/>
+        </w:rPr>
+      </w:pPr>
+      <w:r>
+        <w:rPr>
+          <w:color w:val="00B050"/>
+        </w:rPr>
+        <w:t xml:space="preserve">Кнопка </w:t>
+      </w:r>
+      <w:r>
+        <w:rPr>
+          <w:color w:val="00B050"/>
+        </w:rPr>
+        <w:t>Наши испытания или новости</w:t>
+      </w:r>
+    </w:p>
+    <w:p>
+      <w:pPr>
+        <w:pStyle w:val="a3"/>
+        <w:numPr>
+          <w:ilvl w:val="0"/>
+          <w:numId w:val="3"/>
+        </w:numPr>
+        <w:spacing w:after="0" w:line="360" w:lineRule="auto"/>
+        <w:jc w:val="both"/>
+        <w:rPr>
+          <w:color w:val="00B050"/>
+        </w:rPr>
+      </w:pPr>
+      <w:r>
+        <w:rPr>
+          <w:color w:val="00B050"/>
+        </w:rPr>
+        <w:t xml:space="preserve">Кнопка </w:t>
+      </w:r>
+      <w:r>
+        <w:rPr>
+          <w:color w:val="00B050"/>
+        </w:rPr>
+        <w:t>Часто задаваемые вопросы</w:t>
+      </w:r>
+    </w:p>
+    <w:p>
+      <w:pPr>
+        <w:spacing w:after="0" w:line="360" w:lineRule="auto"/>
+        <w:jc w:val="both"/>
+        <w:rPr>
+          <w:color w:val="00B050"/>
+        </w:rPr>
+      </w:pPr>
+    </w:p>
+    <w:p>
+      <w:pPr>
+        <w:spacing w:after="0" w:line="360" w:lineRule="auto"/>
+        <w:jc w:val="both"/>
+        <w:rPr>
+          <w:color w:val="00B050"/>
+        </w:rPr>
+      </w:pPr>
+      <w:r>
+        <w:rPr>
+          <w:color w:val="00B050"/>
           <w:highlight w:val="yellow"/>
         </w:rPr>
-        <w:t>Главная страница:</w:t>
-      </w:r>
-    </w:p>
-    <w:p>
-      <w:pPr>
-        <w:spacing w:after="0" w:line="360" w:lineRule="auto"/>
-        <w:jc w:val="both"/>
-      </w:pPr>
-      <w:r>
-        <w:t>Заголовок:</w:t>
-      </w:r>
-    </w:p>
-    <w:p>
-      <w:pPr>
-        <w:pStyle w:val="a3"/>
-        <w:numPr>
-          <w:ilvl w:val="0"/>
-          <w:numId w:val="1"/>
-        </w:numPr>
-        <w:spacing w:after="0" w:line="360" w:lineRule="auto"/>
-        <w:jc w:val="both"/>
-        <w:rPr>
-          <w:color w:val="00B050"/>
-        </w:rPr>
-      </w:pPr>
-      <w:r>
-        <w:rPr>
-          <w:color w:val="00B050"/>
-        </w:rPr>
-        <w:t>Иконка-кнопка возврата на домашнюю/главную страницу;</w:t>
-      </w:r>
-    </w:p>
-    <w:p>
-      <w:pPr>
-        <w:pStyle w:val="a3"/>
-        <w:numPr>
-          <w:ilvl w:val="0"/>
-          <w:numId w:val="1"/>
-        </w:numPr>
-        <w:spacing w:after="0" w:line="360" w:lineRule="auto"/>
-        <w:jc w:val="both"/>
-        <w:rPr>
-          <w:color w:val="00B050"/>
-        </w:rPr>
-      </w:pPr>
-      <w:r>
-        <w:rPr>
-          <w:color w:val="00B050"/>
-        </w:rPr>
-        <w:t>Кнопка меню;</w:t>
-      </w:r>
-    </w:p>
-    <w:p>
-      <w:pPr>
-        <w:pStyle w:val="a3"/>
-        <w:numPr>
-          <w:ilvl w:val="0"/>
-          <w:numId w:val="1"/>
-        </w:numPr>
-        <w:spacing w:after="0" w:line="360" w:lineRule="auto"/>
-        <w:jc w:val="both"/>
-        <w:rPr>
-          <w:color w:val="00B050"/>
-        </w:rPr>
-      </w:pPr>
-      <w:r>
-        <w:rPr>
-          <w:color w:val="00B050"/>
-        </w:rPr>
-        <w:t>Окно поиска;</w:t>
-      </w:r>
-    </w:p>
-    <w:p>
-      <w:pPr>
-        <w:pStyle w:val="a3"/>
-        <w:numPr>
-          <w:ilvl w:val="0"/>
-          <w:numId w:val="1"/>
-        </w:numPr>
-        <w:spacing w:after="0" w:line="360" w:lineRule="auto"/>
-        <w:jc w:val="both"/>
-        <w:rPr>
-          <w:color w:val="00B050"/>
-        </w:rPr>
-      </w:pPr>
-      <w:r>
-        <w:rPr>
-          <w:color w:val="00B050"/>
-        </w:rPr>
-        <w:t>Окно каталога</w:t>
-      </w:r>
-    </w:p>
-    <w:p>
-      <w:pPr>
-        <w:spacing w:after="0" w:line="360" w:lineRule="auto"/>
-        <w:jc w:val="both"/>
-      </w:pPr>
-      <w:r>
+        <w:t>Каталог товаров:</w:t>
+      </w:r>
+    </w:p>
+    <w:p>
+      <w:pPr>
+        <w:spacing w:after="0" w:line="360" w:lineRule="auto"/>
+        <w:jc w:val="both"/>
+        <w:rPr>
+          <w:color w:val="00B050"/>
+        </w:rPr>
+      </w:pPr>
+      <w:r>
+        <w:rPr>
+          <w:color w:val="00B050"/>
+        </w:rPr>
+        <w:t>Заголовок и нижнее поле не меняются;</w:t>
+      </w:r>
+    </w:p>
+    <w:p>
+      <w:pPr>
+        <w:spacing w:after="0" w:line="360" w:lineRule="auto"/>
+        <w:jc w:val="both"/>
+        <w:rPr>
+          <w:color w:val="00B050"/>
+        </w:rPr>
+      </w:pPr>
+      <w:r>
+        <w:rPr>
+          <w:color w:val="00B050"/>
+        </w:rPr>
         <w:t>Тело сайта:</w:t>
       </w:r>
     </w:p>
     <w:p>
       <w:pPr>
-        <w:pStyle w:val="a3"/>
-        <w:numPr>
-          <w:ilvl w:val="0"/>
-          <w:numId w:val="2"/>
-        </w:numPr>
-        <w:spacing w:after="0" w:line="360" w:lineRule="auto"/>
-        <w:jc w:val="both"/>
-        <w:rPr>
-          <w:color w:val="00B050"/>
-        </w:rPr>
-      </w:pPr>
-      <w:r>
-        <w:rPr>
-          <w:color w:val="00B050"/>
-        </w:rPr>
-        <w:lastRenderedPageBreak/>
-        <w:t>П</w:t>
-      </w:r>
-      <w:r>
-        <w:rPr>
-          <w:color w:val="00B050"/>
-        </w:rPr>
-        <w:t>роизводим в России (описание проектов с фотографиями)</w:t>
-      </w:r>
-    </w:p>
-    <w:p>
-      <w:pPr>
-        <w:pStyle w:val="a3"/>
-        <w:numPr>
-          <w:ilvl w:val="0"/>
-          <w:numId w:val="2"/>
-        </w:numPr>
-        <w:spacing w:after="0" w:line="360" w:lineRule="auto"/>
-        <w:jc w:val="both"/>
-        <w:rPr>
-          <w:color w:val="00B050"/>
-        </w:rPr>
-      </w:pPr>
-      <w:r>
-        <w:rPr>
-          <w:color w:val="00B050"/>
-        </w:rPr>
-        <w:t>Как заказать нашу продукцию (описание оформления заказов, предоставление ссылок на соц. сети и почту)</w:t>
-      </w:r>
-    </w:p>
-    <w:p>
-      <w:pPr>
-        <w:pStyle w:val="a3"/>
-        <w:numPr>
-          <w:ilvl w:val="0"/>
-          <w:numId w:val="2"/>
-        </w:numPr>
-        <w:spacing w:after="0" w:line="360" w:lineRule="auto"/>
-        <w:jc w:val="both"/>
-        <w:rPr>
-          <w:color w:val="00B050"/>
-        </w:rPr>
-      </w:pPr>
-      <w:proofErr w:type="spellStart"/>
-      <w:r>
-        <w:rPr>
-          <w:color w:val="00B050"/>
-        </w:rPr>
-        <w:t>Превьюшка</w:t>
-      </w:r>
-      <w:proofErr w:type="spellEnd"/>
-      <w:r>
-        <w:rPr>
-          <w:color w:val="00B050"/>
-        </w:rPr>
-        <w:t>, как на аналогов нет</w:t>
-      </w:r>
-    </w:p>
-    <w:p>
-      <w:pPr>
-        <w:pStyle w:val="a3"/>
-        <w:numPr>
-          <w:ilvl w:val="0"/>
-          <w:numId w:val="2"/>
-        </w:numPr>
-        <w:spacing w:after="0" w:line="360" w:lineRule="auto"/>
-        <w:jc w:val="both"/>
-        <w:rPr>
-          <w:color w:val="00B050"/>
-        </w:rPr>
-      </w:pPr>
-      <w:r>
-        <w:rPr>
-          <w:color w:val="00B050"/>
-        </w:rPr>
-        <w:t xml:space="preserve">Вода </w:t>
-      </w:r>
-      <w:r>
-        <w:rPr>
-          <w:color w:val="00B050"/>
-        </w:rPr>
-        <w:t>какая-нибудь</w:t>
-      </w:r>
-      <w:r>
-        <w:rPr>
-          <w:color w:val="00B050"/>
-        </w:rPr>
-        <w:t xml:space="preserve"> по типу (Решения, которые реально работают)</w:t>
-      </w:r>
-    </w:p>
-    <w:p>
-      <w:pPr>
-        <w:pStyle w:val="a3"/>
-        <w:numPr>
-          <w:ilvl w:val="0"/>
-          <w:numId w:val="2"/>
-        </w:numPr>
-        <w:spacing w:after="0" w:line="360" w:lineRule="auto"/>
-        <w:jc w:val="both"/>
-        <w:rPr>
-          <w:color w:val="00B050"/>
-          <w:szCs w:val="24"/>
-        </w:rPr>
-      </w:pPr>
-      <w:r>
-        <w:rPr>
-          <w:color w:val="00B050"/>
-          <w:szCs w:val="24"/>
-        </w:rPr>
-        <w:t xml:space="preserve">Новости (смотри сайт </w:t>
-      </w:r>
-      <w:r>
-        <w:rPr>
-          <w:color w:val="00B050"/>
-          <w:szCs w:val="24"/>
+        <w:spacing w:after="0" w:line="360" w:lineRule="auto"/>
+        <w:jc w:val="both"/>
+        <w:rPr>
+          <w:color w:val="00B050"/>
+        </w:rPr>
+      </w:pPr>
+      <w:r>
+        <w:rPr>
+          <w:color w:val="00B050"/>
+        </w:rPr>
+        <w:t>Отображение товаров как в наших новинках, по 3-4 в ряд, с кнопкой подробнее как в новинках</w:t>
+      </w:r>
+    </w:p>
+    <w:p>
+      <w:pPr>
+        <w:spacing w:after="0" w:line="360" w:lineRule="auto"/>
+        <w:jc w:val="both"/>
+        <w:rPr>
+          <w:color w:val="00B050"/>
+        </w:rPr>
+      </w:pPr>
+    </w:p>
+    <w:p>
+      <w:pPr>
+        <w:spacing w:after="0" w:line="360" w:lineRule="auto"/>
+        <w:jc w:val="both"/>
+        <w:rPr>
+          <w:color w:val="00B050"/>
+        </w:rPr>
+      </w:pPr>
+      <w:r>
+        <w:rPr>
+          <w:color w:val="00B050"/>
+          <w:highlight w:val="yellow"/>
+        </w:rPr>
+        <w:t>Подробнее о товаре:</w:t>
+      </w:r>
+    </w:p>
+    <w:p>
+      <w:pPr>
+        <w:spacing w:after="0" w:line="360" w:lineRule="auto"/>
+        <w:jc w:val="both"/>
+        <w:rPr>
+          <w:color w:val="00B050"/>
+        </w:rPr>
+      </w:pPr>
+      <w:r>
+        <w:rPr>
+          <w:color w:val="00B050"/>
+        </w:rPr>
+        <w:t>Заголовок и нижнее поле не меняются;</w:t>
+      </w:r>
+    </w:p>
+    <w:p>
+      <w:pPr>
+        <w:spacing w:after="0" w:line="360" w:lineRule="auto"/>
+        <w:jc w:val="both"/>
+        <w:rPr>
+          <w:color w:val="00B050"/>
+        </w:rPr>
+      </w:pPr>
+      <w:r>
+        <w:rPr>
+          <w:color w:val="00B050"/>
+        </w:rPr>
+        <w:t>Как с вебтеста пока что взять</w:t>
+      </w:r>
+    </w:p>
+    <w:p>
+      <w:pPr>
+        <w:spacing w:after="0" w:line="360" w:lineRule="auto"/>
+        <w:jc w:val="both"/>
+      </w:pPr>
+    </w:p>
+    <w:p>
+      <w:pPr>
+        <w:spacing w:after="0" w:line="360" w:lineRule="auto"/>
+        <w:jc w:val="both"/>
+      </w:pPr>
+      <w:r>
+        <w:rPr>
+          <w:highlight w:val="yellow"/>
+        </w:rPr>
+        <w:t>Новости:</w:t>
+      </w:r>
+    </w:p>
+    <w:p>
+      <w:pPr>
+        <w:spacing w:after="0" w:line="360" w:lineRule="auto"/>
+        <w:jc w:val="both"/>
+        <w:rPr>
+          <w:color w:val="00B050"/>
+        </w:rPr>
+      </w:pPr>
+      <w:r>
+        <w:t xml:space="preserve">Сайт </w:t>
+      </w:r>
+      <w:r>
+        <w:rPr>
           <w:lang w:val="en-US"/>
         </w:rPr>
-        <w:t>INWAVE</w:t>
-      </w:r>
-      <w:r>
-        <w:rPr>
-          <w:color w:val="00B050"/>
-          <w:szCs w:val="24"/>
-        </w:rPr>
-        <w:t xml:space="preserve"> ближе к концу)</w:t>
-      </w:r>
-    </w:p>
-    <w:p>
-      <w:pPr>
-        <w:pStyle w:val="a3"/>
-        <w:numPr>
-          <w:ilvl w:val="0"/>
-          <w:numId w:val="2"/>
-        </w:numPr>
-        <w:spacing w:after="0" w:line="360" w:lineRule="auto"/>
-        <w:jc w:val="both"/>
-        <w:rPr>
-          <w:color w:val="00B050"/>
-        </w:rPr>
-      </w:pPr>
-      <w:r>
-        <w:rPr>
-          <w:color w:val="00B050"/>
-        </w:rPr>
-        <w:t>У вас остались вопросы?</w:t>
-      </w:r>
-    </w:p>
-    <w:p>
-      <w:pPr>
-        <w:spacing w:after="0" w:line="360" w:lineRule="auto"/>
-        <w:jc w:val="both"/>
-      </w:pPr>
-      <w:r>
-        <w:t>Нижнее поле:</w:t>
-      </w:r>
-    </w:p>
-    <w:p>
-      <w:pPr>
-        <w:pStyle w:val="a3"/>
-        <w:numPr>
-          <w:ilvl w:val="0"/>
-          <w:numId w:val="3"/>
-        </w:numPr>
-        <w:spacing w:after="0" w:line="360" w:lineRule="auto"/>
-        <w:jc w:val="both"/>
-        <w:rPr>
-          <w:color w:val="00B050"/>
-        </w:rPr>
-      </w:pPr>
-      <w:r>
-        <w:rPr>
-          <w:color w:val="00B050"/>
-        </w:rPr>
-        <w:t>Кнопка «На главную»</w:t>
-      </w:r>
-    </w:p>
-    <w:p>
-      <w:pPr>
-        <w:pStyle w:val="a3"/>
-        <w:numPr>
-          <w:ilvl w:val="0"/>
-          <w:numId w:val="3"/>
-        </w:numPr>
-        <w:spacing w:after="0" w:line="360" w:lineRule="auto"/>
-        <w:jc w:val="both"/>
-        <w:rPr>
-          <w:color w:val="00B050"/>
-        </w:rPr>
-      </w:pPr>
-      <w:r>
-        <w:rPr>
-          <w:color w:val="00B050"/>
-        </w:rPr>
-        <w:t xml:space="preserve">Кнопка «О </w:t>
-      </w:r>
-      <w:r>
-        <w:rPr>
-          <w:color w:val="00B050"/>
-        </w:rPr>
-        <w:t>компании</w:t>
-      </w:r>
-      <w:r>
-        <w:rPr>
-          <w:color w:val="00B050"/>
-        </w:rPr>
-        <w:t>»</w:t>
-      </w:r>
-    </w:p>
-    <w:p>
-      <w:pPr>
-        <w:pStyle w:val="a3"/>
-        <w:numPr>
-          <w:ilvl w:val="0"/>
-          <w:numId w:val="3"/>
-        </w:numPr>
-        <w:spacing w:after="0" w:line="360" w:lineRule="auto"/>
-        <w:jc w:val="both"/>
-        <w:rPr>
-          <w:color w:val="00B050"/>
-        </w:rPr>
-      </w:pPr>
-      <w:r>
-        <w:rPr>
-          <w:color w:val="00B050"/>
-        </w:rPr>
-        <w:t>Кнопка «Контакты»</w:t>
-      </w:r>
-    </w:p>
-    <w:p>
-      <w:pPr>
-        <w:pStyle w:val="a3"/>
-        <w:numPr>
-          <w:ilvl w:val="0"/>
-          <w:numId w:val="3"/>
-        </w:numPr>
-        <w:spacing w:after="0" w:line="360" w:lineRule="auto"/>
-        <w:jc w:val="both"/>
-        <w:rPr>
-          <w:color w:val="00B050"/>
-        </w:rPr>
-      </w:pPr>
-      <w:r>
-        <w:rPr>
-          <w:color w:val="00B050"/>
-        </w:rPr>
-        <w:t>Кнопка «</w:t>
-      </w:r>
-      <w:r>
-        <w:rPr>
-          <w:color w:val="00B050"/>
-        </w:rPr>
-        <w:t>Оформление заказа</w:t>
-      </w:r>
-      <w:r>
-        <w:rPr>
-          <w:color w:val="00B050"/>
-        </w:rPr>
-        <w:t>»</w:t>
-      </w:r>
-      <w:r>
-        <w:rPr>
-          <w:color w:val="00B050"/>
-        </w:rPr>
-        <w:t xml:space="preserve"> (переход на новую страницу с окном выбора категории товара (Системы Приемники и анализаторы обстановки, </w:t>
-      </w:r>
-      <w:r>
-        <w:rPr>
-          <w:color w:val="00B050"/>
-          <w:lang w:val="en-US"/>
-        </w:rPr>
-        <w:t>FPV</w:t>
-      </w:r>
-      <w:r>
-        <w:rPr>
-          <w:color w:val="00B050"/>
-        </w:rPr>
-        <w:t xml:space="preserve"> системы, Навигационные решения, Приемо-передатчики))</w:t>
-      </w:r>
-    </w:p>
-    <w:p>
-      <w:pPr>
-        <w:pStyle w:val="a3"/>
-        <w:numPr>
-          <w:ilvl w:val="0"/>
-          <w:numId w:val="3"/>
-        </w:numPr>
-        <w:spacing w:after="0" w:line="360" w:lineRule="auto"/>
-        <w:jc w:val="both"/>
-        <w:rPr>
-          <w:color w:val="00B050"/>
-        </w:rPr>
-      </w:pPr>
-      <w:r>
-        <w:rPr>
-          <w:color w:val="00B050"/>
-        </w:rPr>
-        <w:t>Кнопка «Доставка и оплата» (включает в себя описание сроков отгрузки)</w:t>
-      </w:r>
-    </w:p>
-    <w:p>
-      <w:pPr>
-        <w:pStyle w:val="a3"/>
-        <w:numPr>
-          <w:ilvl w:val="0"/>
-          <w:numId w:val="3"/>
-        </w:numPr>
-        <w:spacing w:after="0" w:line="360" w:lineRule="auto"/>
-        <w:jc w:val="both"/>
-        <w:rPr>
-          <w:color w:val="00B050"/>
-        </w:rPr>
-      </w:pPr>
-      <w:r>
-        <w:rPr>
-          <w:color w:val="00B050"/>
-        </w:rPr>
-        <w:t>Кнопка «Наверх»</w:t>
-      </w:r>
-    </w:p>
-    <w:p>
-      <w:pPr>
-        <w:pStyle w:val="a3"/>
-        <w:numPr>
-          <w:ilvl w:val="0"/>
-          <w:numId w:val="3"/>
-        </w:numPr>
-        <w:spacing w:after="0" w:line="360" w:lineRule="auto"/>
-        <w:jc w:val="both"/>
-        <w:rPr>
-          <w:color w:val="00B050"/>
-        </w:rPr>
-      </w:pPr>
-      <w:r>
-        <w:rPr>
-          <w:color w:val="00B050"/>
-        </w:rPr>
-        <w:t xml:space="preserve">Кнопка </w:t>
-      </w:r>
-      <w:r>
-        <w:rPr>
-          <w:color w:val="00B050"/>
-        </w:rPr>
-        <w:t>Наши испытания или новости</w:t>
-      </w:r>
-    </w:p>
-    <w:p>
-      <w:pPr>
-        <w:pStyle w:val="a3"/>
-        <w:numPr>
-          <w:ilvl w:val="0"/>
-          <w:numId w:val="3"/>
-        </w:numPr>
-        <w:spacing w:after="0" w:line="360" w:lineRule="auto"/>
-        <w:jc w:val="both"/>
-        <w:rPr>
-          <w:color w:val="00B050"/>
-        </w:rPr>
-      </w:pPr>
-      <w:r>
-        <w:rPr>
-          <w:color w:val="00B050"/>
-        </w:rPr>
-        <w:t xml:space="preserve">Кнопка </w:t>
-      </w:r>
-      <w:r>
-        <w:rPr>
-          <w:color w:val="00B050"/>
-        </w:rPr>
-        <w:t>Часто задаваемые вопросы</w:t>
-      </w:r>
-    </w:p>
-    <w:p>
-      <w:pPr>
-        <w:spacing w:after="0" w:line="360" w:lineRule="auto"/>
-        <w:jc w:val="both"/>
-        <w:rPr>
-          <w:color w:val="00B050"/>
-        </w:rPr>
-      </w:pPr>
-    </w:p>
-    <w:p>
-      <w:pPr>
-        <w:spacing w:after="0" w:line="360" w:lineRule="auto"/>
-        <w:jc w:val="both"/>
-        <w:rPr>
-          <w:color w:val="00B050"/>
-        </w:rPr>
-      </w:pPr>
-      <w:r>
-        <w:rPr>
-          <w:color w:val="00B050"/>
-          <w:highlight w:val="yellow"/>
-        </w:rPr>
-        <w:t>Каталог товаров:</w:t>
-      </w:r>
-    </w:p>
-    <w:p>
-      <w:pPr>
-        <w:spacing w:after="0" w:line="360" w:lineRule="auto"/>
-        <w:jc w:val="both"/>
-        <w:rPr>
-          <w:color w:val="00B050"/>
-        </w:rPr>
-      </w:pPr>
-      <w:r>
-        <w:rPr>
-          <w:color w:val="00B050"/>
-        </w:rPr>
-        <w:t>Заголовок и нижнее поле не меняются;</w:t>
-      </w:r>
-    </w:p>
-    <w:p>
-      <w:pPr>
-        <w:spacing w:after="0" w:line="360" w:lineRule="auto"/>
-        <w:jc w:val="both"/>
-        <w:rPr>
-          <w:color w:val="00B050"/>
-        </w:rPr>
-      </w:pPr>
-      <w:r>
-        <w:rPr>
-          <w:color w:val="00B050"/>
-        </w:rPr>
-        <w:t>Тело сайта:</w:t>
-      </w:r>
-    </w:p>
-    <w:p>
-      <w:pPr>
-        <w:spacing w:after="0" w:line="360" w:lineRule="auto"/>
-        <w:jc w:val="both"/>
-        <w:rPr>
-          <w:color w:val="00B050"/>
-        </w:rPr>
-      </w:pPr>
-      <w:r>
-        <w:rPr>
-          <w:color w:val="00B050"/>
-        </w:rPr>
-        <w:t>Отображение товаров как в наших новинках, по 3-4 в ряд, с кнопкой подробнее как в новинках</w:t>
-      </w:r>
-    </w:p>
-    <w:p>
-      <w:pPr>
-        <w:spacing w:after="0" w:line="360" w:lineRule="auto"/>
-        <w:jc w:val="both"/>
-        <w:rPr>
-          <w:color w:val="00B050"/>
-        </w:rPr>
-      </w:pPr>
-    </w:p>
-    <w:p>
-      <w:pPr>
-        <w:spacing w:after="0" w:line="360" w:lineRule="auto"/>
-        <w:jc w:val="both"/>
-        <w:rPr>
-          <w:color w:val="00B050"/>
-        </w:rPr>
-      </w:pPr>
-      <w:r>
-        <w:rPr>
-          <w:color w:val="00B050"/>
-          <w:highlight w:val="yellow"/>
-        </w:rPr>
-        <w:t>Подробнее о товаре:</w:t>
-      </w:r>
-    </w:p>
-    <w:p>
-      <w:pPr>
-        <w:spacing w:after="0" w:line="360" w:lineRule="auto"/>
-        <w:jc w:val="both"/>
-        <w:rPr>
-          <w:color w:val="00B050"/>
-        </w:rPr>
-      </w:pPr>
-      <w:r>
-        <w:rPr>
-          <w:color w:val="00B050"/>
-        </w:rPr>
-        <w:t>Заголовок и нижнее поле не меняются;</w:t>
-      </w:r>
-    </w:p>
-    <w:p>
-      <w:pPr>
-        <w:spacing w:after="0" w:line="360" w:lineRule="auto"/>
-        <w:jc w:val="both"/>
-        <w:rPr>
-          <w:color w:val="00B050"/>
-        </w:rPr>
-      </w:pPr>
-      <w:r>
-        <w:rPr>
-          <w:color w:val="00B050"/>
-        </w:rPr>
-        <w:t xml:space="preserve">Как с </w:t>
-      </w:r>
-      <w:proofErr w:type="spellStart"/>
-      <w:r>
-        <w:rPr>
-          <w:color w:val="00B050"/>
-        </w:rPr>
-        <w:t>вебтеста</w:t>
-      </w:r>
-      <w:proofErr w:type="spellEnd"/>
-      <w:r>
-        <w:rPr>
-          <w:color w:val="00B050"/>
-        </w:rPr>
-        <w:t xml:space="preserve"> пока что взять</w:t>
-      </w:r>
-    </w:p>
-    <w:p>
-      <w:pPr>
-        <w:spacing w:after="0" w:line="360" w:lineRule="auto"/>
-        <w:jc w:val="both"/>
-      </w:pPr>
-    </w:p>
-    <w:p>
-      <w:pPr>
-        <w:spacing w:after="0" w:line="360" w:lineRule="auto"/>
-        <w:jc w:val="both"/>
-      </w:pPr>
-      <w:r>
-        <w:rPr>
-          <w:highlight w:val="yellow"/>
-        </w:rPr>
-        <w:t>Новости:</w:t>
-      </w:r>
-    </w:p>
-    <w:p>
-      <w:pPr>
-        <w:spacing w:after="0" w:line="360" w:lineRule="auto"/>
-        <w:jc w:val="both"/>
-        <w:rPr>
-          <w:color w:val="00B050"/>
-        </w:rPr>
-      </w:pPr>
-      <w:r>
-        <w:t xml:space="preserve">Сайт </w:t>
-      </w:r>
-      <w:proofErr w:type="spellStart"/>
-      <w:r>
-        <w:rPr>
-          <w:lang w:val="en-US"/>
-        </w:rPr>
         <w:t>inwave</w:t>
       </w:r>
-      <w:proofErr w:type="spellEnd"/>
     </w:p>
     <w:p>
       <w:pPr>

</xml_diff>

<commit_message>
Added FooterPages (services, about company)
</commit_message>
<xml_diff>
--- a/Информационный сайт отдела.docx
+++ b/Информационный сайт отдела.docx
@@ -16,7 +16,7 @@
         <w:spacing w:after="0" w:line="360" w:lineRule="auto"/>
         <w:jc w:val="both"/>
         <w:rPr>
-          <w:color w:val="FF0000"/>
+          <w:color w:val="000000"/>
           <w:sz w:val="32"/>
           <w:szCs w:val="32"/>
         </w:rPr>
@@ -36,6 +36,43 @@
           <w:szCs w:val="40"/>
         </w:rPr>
         <w:t>:</w:t>
+      </w:r>
+    </w:p>
+    <w:p>
+      <w:pPr>
+        <w:pStyle w:val="a3"/>
+        <w:numPr>
+          <w:ilvl w:val="0"/>
+          <w:numId w:val="4"/>
+        </w:numPr>
+        <w:spacing w:after="0" w:line="360" w:lineRule="auto"/>
+        <w:jc w:val="both"/>
+        <w:rPr>
+          <w:color w:val="000000"/>
+          <w:sz w:val="32"/>
+          <w:szCs w:val="32"/>
+        </w:rPr>
+      </w:pPr>
+      <w:r>
+        <w:rPr>
+          <w:sz w:val="32"/>
+          <w:szCs w:val="32"/>
+        </w:rPr>
+        <w:t xml:space="preserve">В </w:t>
+      </w:r>
+      <w:r>
+        <w:rPr>
+          <w:sz w:val="32"/>
+          <w:szCs w:val="32"/>
+        </w:rPr>
+        <w:t>телеграм-</w:t>
+      </w:r>
+      <w:r>
+        <w:rPr>
+          <w:sz w:val="32"/>
+          <w:szCs w:val="32"/>
+        </w:rPr>
+        <w:t>бота добавить пару функций (услуги и прочее)</w:t>
       </w:r>
     </w:p>
     <w:p>
@@ -50,19 +87,16 @@
         <w:adjustRightInd w:val="0"/>
         <w:spacing w:after="0" w:line="360" w:lineRule="auto"/>
         <w:rPr>
-          <w:color w:val="000000"/>
           <w:sz w:val="32"/>
           <w:szCs w:val="32"/>
         </w:rPr>
       </w:pPr>
       <w:r>
         <w:rPr>
-          <w:color w:val="000000"/>
           <w:sz w:val="32"/>
           <w:szCs w:val="32"/>
-          <w:highlight w:val="yellow"/>
-        </w:rPr>
-        <w:t>Доделать ссылки и кнопки в футере (о компании, услуги);</w:t>
+        </w:rPr>
+        <w:t>Подумать, что ещё нужно в личный кабинет</w:t>
       </w:r>
     </w:p>
     <w:p>
@@ -72,12 +106,9 @@
           <w:ilvl w:val="0"/>
           <w:numId w:val="4"/>
         </w:numPr>
-        <w:autoSpaceDE w:val="0"/>
-        <w:autoSpaceDN w:val="0"/>
-        <w:adjustRightInd w:val="0"/>
-        <w:spacing w:after="0" w:line="360" w:lineRule="auto"/>
-        <w:rPr>
-          <w:color w:val="000000"/>
+        <w:spacing w:after="0" w:line="360" w:lineRule="auto"/>
+        <w:jc w:val="both"/>
+        <w:rPr>
           <w:sz w:val="32"/>
           <w:szCs w:val="32"/>
         </w:rPr>
@@ -87,114 +118,17 @@
           <w:sz w:val="32"/>
           <w:szCs w:val="32"/>
         </w:rPr>
-        <w:t xml:space="preserve">В </w:t>
-      </w:r>
+        <w:t xml:space="preserve">Новости в виде поста с картинками как на </w:t>
+      </w:r>
+      <w:proofErr w:type="spellStart"/>
       <w:r>
         <w:rPr>
           <w:sz w:val="32"/>
           <w:szCs w:val="32"/>
         </w:rPr>
-        <w:t>телеграм-</w:t>
-      </w:r>
-      <w:r>
-        <w:rPr>
-          <w:sz w:val="32"/>
-          <w:szCs w:val="32"/>
-        </w:rPr>
-        <w:t>бота добавить пару функций (услуги и прочее)</w:t>
-      </w:r>
-    </w:p>
-    <w:p>
-      <w:pPr>
-        <w:pStyle w:val="a3"/>
-        <w:numPr>
-          <w:ilvl w:val="0"/>
-          <w:numId w:val="4"/>
-        </w:numPr>
-        <w:autoSpaceDE w:val="0"/>
-        <w:autoSpaceDN w:val="0"/>
-        <w:adjustRightInd w:val="0"/>
-        <w:spacing w:after="0" w:line="360" w:lineRule="auto"/>
-        <w:rPr>
-          <w:color w:val="000000"/>
-          <w:sz w:val="32"/>
-          <w:szCs w:val="32"/>
-        </w:rPr>
-      </w:pPr>
-      <w:r>
-        <w:rPr>
-          <w:sz w:val="32"/>
-          <w:szCs w:val="32"/>
-        </w:rPr>
-        <w:t>Сделать кнопку с админа «Технический перерыв» для юзеров</w:t>
-      </w:r>
-      <w:r>
-        <w:rPr>
-          <w:sz w:val="32"/>
-          <w:szCs w:val="32"/>
-        </w:rPr>
-        <w:t xml:space="preserve"> (</w:t>
-      </w:r>
-      <w:r>
-        <w:rPr>
-          <w:sz w:val="32"/>
-          <w:szCs w:val="32"/>
-        </w:rPr>
-        <w:t>досмотреть эту функцию</w:t>
-      </w:r>
-      <w:r>
-        <w:rPr>
-          <w:sz w:val="32"/>
-          <w:szCs w:val="32"/>
-        </w:rPr>
-        <w:t>)</w:t>
-      </w:r>
-    </w:p>
-    <w:p>
-      <w:pPr>
-        <w:pStyle w:val="a3"/>
-        <w:numPr>
-          <w:ilvl w:val="0"/>
-          <w:numId w:val="4"/>
-        </w:numPr>
-        <w:autoSpaceDE w:val="0"/>
-        <w:autoSpaceDN w:val="0"/>
-        <w:adjustRightInd w:val="0"/>
-        <w:spacing w:after="0" w:line="360" w:lineRule="auto"/>
-        <w:rPr>
-          <w:sz w:val="32"/>
-          <w:szCs w:val="32"/>
-        </w:rPr>
-      </w:pPr>
-      <w:r>
-        <w:rPr>
-          <w:sz w:val="32"/>
-          <w:szCs w:val="32"/>
-        </w:rPr>
-        <w:t>Подумать, что ещё нужно в личный кабинет</w:t>
-      </w:r>
-    </w:p>
-    <w:p>
-      <w:pPr>
-        <w:pStyle w:val="a3"/>
-        <w:numPr>
-          <w:ilvl w:val="0"/>
-          <w:numId w:val="4"/>
-        </w:numPr>
-        <w:spacing w:after="0" w:line="360" w:lineRule="auto"/>
-        <w:jc w:val="both"/>
-        <w:rPr>
-          <w:sz w:val="32"/>
-          <w:szCs w:val="32"/>
-        </w:rPr>
-      </w:pPr>
-      <w:r>
-        <w:rPr>
-          <w:sz w:val="32"/>
-          <w:szCs w:val="32"/>
-        </w:rPr>
-        <w:t>Новости в виде поста с картинками как на хабре</w:t>
-      </w:r>
+        <w:t>хабре</w:t>
+      </w:r>
+      <w:proofErr w:type="spellEnd"/>
     </w:p>
     <w:p>
       <w:pPr>
@@ -290,8 +224,18 @@
           <w:sz w:val="32"/>
           <w:szCs w:val="32"/>
         </w:rPr>
-        <w:t>Сделать оформление кнопки корзины как в вебтесте</w:t>
-      </w:r>
+        <w:t xml:space="preserve">Сделать оформление кнопки корзины как в </w:t>
+      </w:r>
+      <w:proofErr w:type="spellStart"/>
+      <w:r>
+        <w:rPr>
+          <w:color w:val="000000"/>
+          <w:sz w:val="32"/>
+          <w:szCs w:val="32"/>
+        </w:rPr>
+        <w:t>вебтесте</w:t>
+      </w:r>
+      <w:proofErr w:type="spellEnd"/>
     </w:p>
     <w:p>
       <w:pPr>
@@ -409,6 +353,7 @@
         </w:rPr>
         <w:t xml:space="preserve"> (</w:t>
       </w:r>
+      <w:proofErr w:type="spellStart"/>
       <w:r>
         <w:rPr>
           <w:color w:val="00B050"/>
@@ -417,6 +362,7 @@
         </w:rPr>
         <w:t>webtest</w:t>
       </w:r>
+      <w:proofErr w:type="spellEnd"/>
       <w:r>
         <w:rPr>
           <w:color w:val="00B050"/>
@@ -523,7 +469,25 @@
           <w:szCs w:val="24"/>
           <w:lang w:val="en-US"/>
         </w:rPr>
-        <w:t xml:space="preserve"> (webtest – views – product – index)</w:t>
+        <w:t xml:space="preserve"> (</w:t>
+      </w:r>
+      <w:proofErr w:type="spellStart"/>
+      <w:r>
+        <w:rPr>
+          <w:color w:val="00B050"/>
+          <w:szCs w:val="24"/>
+          <w:lang w:val="en-US"/>
+        </w:rPr>
+        <w:t>webtest</w:t>
+      </w:r>
+      <w:proofErr w:type="spellEnd"/>
+      <w:r>
+        <w:rPr>
+          <w:color w:val="00B050"/>
+          <w:szCs w:val="24"/>
+          <w:lang w:val="en-US"/>
+        </w:rPr>
+        <w:t xml:space="preserve"> – views – product – index)</w:t>
       </w:r>
     </w:p>
     <w:p>
@@ -671,7 +635,6 @@
         <w:jc w:val="both"/>
       </w:pPr>
       <w:r>
-        <w:lastRenderedPageBreak/>
         <w:t>Тело сайта:</w:t>
       </w:r>
     </w:p>
@@ -734,11 +697,20 @@
           <w:color w:val="00B050"/>
         </w:rPr>
       </w:pPr>
-      <w:r>
-        <w:rPr>
-          <w:color w:val="00B050"/>
-        </w:rPr>
-        <w:t>Превьюшка, как на аналогов нет</w:t>
+      <w:proofErr w:type="spellStart"/>
+      <w:r>
+        <w:rPr>
+          <w:color w:val="00B050"/>
+        </w:rPr>
+        <w:lastRenderedPageBreak/>
+        <w:t>Превьюшка</w:t>
+      </w:r>
+      <w:proofErr w:type="spellEnd"/>
+      <w:r>
+        <w:rPr>
+          <w:color w:val="00B050"/>
+        </w:rPr>
+        <w:t>, как на аналогов нет</w:t>
       </w:r>
     </w:p>
     <w:p>
@@ -1176,7 +1148,21 @@
         <w:rPr>
           <w:color w:val="00B050"/>
         </w:rPr>
-        <w:t>Как с вебтеста пока что взять</w:t>
+        <w:t xml:space="preserve">Как с </w:t>
+      </w:r>
+      <w:proofErr w:type="spellStart"/>
+      <w:r>
+        <w:rPr>
+          <w:color w:val="00B050"/>
+        </w:rPr>
+        <w:t>вебтеста</w:t>
+      </w:r>
+      <w:proofErr w:type="spellEnd"/>
+      <w:r>
+        <w:rPr>
+          <w:color w:val="00B050"/>
+        </w:rPr>
+        <w:t xml:space="preserve"> пока что взять</w:t>
       </w:r>
     </w:p>
     <w:p>
@@ -1208,12 +1194,14 @@
       <w:r>
         <w:t xml:space="preserve">Сайт </w:t>
       </w:r>
+      <w:proofErr w:type="spellStart"/>
       <w:r>
         <w:rPr>
           <w:lang w:val="en-US"/>
         </w:rPr>
         <w:t>inwave</w:t>
       </w:r>
+      <w:proofErr w:type="spellEnd"/>
     </w:p>
     <w:p>
       <w:pPr>

</xml_diff>

<commit_message>
View bill in the user`s cabinet
</commit_message>
<xml_diff>
--- a/Информационный сайт отдела.docx
+++ b/Информационный сайт отдела.docx
@@ -36,43 +36,6 @@
           <w:szCs w:val="40"/>
         </w:rPr>
         <w:t>:</w:t>
-      </w:r>
-    </w:p>
-    <w:p>
-      <w:pPr>
-        <w:pStyle w:val="a3"/>
-        <w:numPr>
-          <w:ilvl w:val="0"/>
-          <w:numId w:val="4"/>
-        </w:numPr>
-        <w:spacing w:after="0" w:line="360" w:lineRule="auto"/>
-        <w:jc w:val="both"/>
-        <w:rPr>
-          <w:color w:val="000000"/>
-          <w:sz w:val="32"/>
-          <w:szCs w:val="32"/>
-        </w:rPr>
-      </w:pPr>
-      <w:r>
-        <w:rPr>
-          <w:sz w:val="32"/>
-          <w:szCs w:val="32"/>
-        </w:rPr>
-        <w:t xml:space="preserve">В </w:t>
-      </w:r>
-      <w:r>
-        <w:rPr>
-          <w:sz w:val="32"/>
-          <w:szCs w:val="32"/>
-        </w:rPr>
-        <w:t>телеграм-</w:t>
-      </w:r>
-      <w:r>
-        <w:rPr>
-          <w:sz w:val="32"/>
-          <w:szCs w:val="32"/>
-        </w:rPr>
-        <w:t>бота добавить пару функций (услуги и прочее)</w:t>
       </w:r>
     </w:p>
     <w:p>
@@ -101,37 +64,6 @@
     </w:p>
     <w:p>
       <w:pPr>
-        <w:pStyle w:val="a3"/>
-        <w:numPr>
-          <w:ilvl w:val="0"/>
-          <w:numId w:val="4"/>
-        </w:numPr>
-        <w:spacing w:after="0" w:line="360" w:lineRule="auto"/>
-        <w:jc w:val="both"/>
-        <w:rPr>
-          <w:sz w:val="32"/>
-          <w:szCs w:val="32"/>
-        </w:rPr>
-      </w:pPr>
-      <w:r>
-        <w:rPr>
-          <w:sz w:val="32"/>
-          <w:szCs w:val="32"/>
-        </w:rPr>
-        <w:t xml:space="preserve">Новости в виде поста с картинками как на </w:t>
-      </w:r>
-      <w:proofErr w:type="spellStart"/>
-      <w:r>
-        <w:rPr>
-          <w:sz w:val="32"/>
-          <w:szCs w:val="32"/>
-        </w:rPr>
-        <w:t>хабре</w:t>
-      </w:r>
-      <w:proofErr w:type="spellEnd"/>
-    </w:p>
-    <w:p>
-      <w:pPr>
         <w:spacing w:after="0" w:line="360" w:lineRule="auto"/>
         <w:jc w:val="both"/>
         <w:rPr>
@@ -242,34 +174,69 @@
         <w:pStyle w:val="a3"/>
         <w:numPr>
           <w:ilvl w:val="0"/>
-          <w:numId w:val="5"/>
+          <w:numId w:val="4"/>
         </w:numPr>
-        <w:autoSpaceDE w:val="0"/>
-        <w:autoSpaceDN w:val="0"/>
-        <w:adjustRightInd w:val="0"/>
-        <w:spacing w:after="0" w:line="360" w:lineRule="auto"/>
+        <w:spacing w:after="0" w:line="360" w:lineRule="auto"/>
+        <w:jc w:val="both"/>
+        <w:rPr>
+          <w:sz w:val="32"/>
+          <w:szCs w:val="32"/>
+        </w:rPr>
+      </w:pPr>
+      <w:r>
         <w:rPr>
           <w:color w:val="000000"/>
           <w:sz w:val="32"/>
           <w:szCs w:val="32"/>
         </w:rPr>
-      </w:pPr>
+        <w:t>Кнопка написать на почту в самом низу работает плохо</w:t>
+      </w:r>
       <w:r>
         <w:rPr>
           <w:color w:val="000000"/>
           <w:sz w:val="32"/>
           <w:szCs w:val="32"/>
         </w:rPr>
-        <w:t>Кнопка написать на почту в самом низу работает плохо</w:t>
-      </w:r>
-      <w:r>
-        <w:rPr>
-          <w:color w:val="000000"/>
+        <w:t xml:space="preserve"> (нужно убрать оттуда копирование)</w:t>
+      </w:r>
+      <w:r>
+        <w:rPr>
           <w:sz w:val="32"/>
           <w:szCs w:val="32"/>
         </w:rPr>
-        <w:t xml:space="preserve"> (нужно убрать оттуда копирование)</w:t>
-      </w:r>
+        <w:t xml:space="preserve"> </w:t>
+      </w:r>
+    </w:p>
+    <w:p>
+      <w:pPr>
+        <w:pStyle w:val="a3"/>
+        <w:numPr>
+          <w:ilvl w:val="0"/>
+          <w:numId w:val="4"/>
+        </w:numPr>
+        <w:spacing w:after="0" w:line="360" w:lineRule="auto"/>
+        <w:jc w:val="both"/>
+        <w:rPr>
+          <w:sz w:val="32"/>
+          <w:szCs w:val="32"/>
+        </w:rPr>
+      </w:pPr>
+      <w:r>
+        <w:rPr>
+          <w:sz w:val="32"/>
+          <w:szCs w:val="32"/>
+        </w:rPr>
+        <w:t xml:space="preserve">Новости в виде поста с картинками как на </w:t>
+      </w:r>
+      <w:proofErr w:type="spellStart"/>
+      <w:r>
+        <w:rPr>
+          <w:sz w:val="32"/>
+          <w:szCs w:val="32"/>
+        </w:rPr>
+        <w:t>хабре</w:t>
+      </w:r>
+      <w:proofErr w:type="spellEnd"/>
     </w:p>
     <w:p>
       <w:pPr>
@@ -702,7 +669,6 @@
         <w:rPr>
           <w:color w:val="00B050"/>
         </w:rPr>
-        <w:lastRenderedPageBreak/>
         <w:t>Превьюшка</w:t>
       </w:r>
       <w:proofErr w:type="spellEnd"/>
@@ -730,6 +696,7 @@
         <w:rPr>
           <w:color w:val="00B050"/>
         </w:rPr>
+        <w:lastRenderedPageBreak/>
         <w:t xml:space="preserve">Вода </w:t>
       </w:r>
       <w:r>

</xml_diff>

<commit_message>
decoration of the whole site
</commit_message>
<xml_diff>
--- a/Информационный сайт отдела.docx
+++ b/Информационный сайт отдела.docx
@@ -94,7 +94,6 @@
         <w:adjustRightInd w:val="0"/>
         <w:spacing w:after="0" w:line="360" w:lineRule="auto"/>
         <w:rPr>
-          <w:color w:val="000000"/>
           <w:sz w:val="32"/>
           <w:szCs w:val="32"/>
         </w:rPr>
@@ -136,162 +135,228 @@
         <w:adjustRightInd w:val="0"/>
         <w:spacing w:after="0" w:line="360" w:lineRule="auto"/>
         <w:rPr>
-          <w:color w:val="000000"/>
           <w:sz w:val="32"/>
           <w:szCs w:val="32"/>
         </w:rPr>
       </w:pPr>
       <w:r>
         <w:rPr>
-          <w:color w:val="000000"/>
           <w:sz w:val="32"/>
           <w:szCs w:val="32"/>
         </w:rPr>
-        <w:t>Сделать оформление кнопки корзины как в вебтесте</w:t>
-      </w:r>
-    </w:p>
-    <w:p>
-      <w:pPr>
-        <w:pStyle w:val="a3"/>
-        <w:numPr>
-          <w:ilvl w:val="0"/>
-          <w:numId w:val="4"/>
-        </w:numPr>
-        <w:spacing w:after="0" w:line="360" w:lineRule="auto"/>
-        <w:jc w:val="both"/>
+        <w:t xml:space="preserve">Новости в виде поста с картинками как на </w:t>
+      </w:r>
+      <w:proofErr w:type="spellStart"/>
+      <w:r>
         <w:rPr>
           <w:sz w:val="32"/>
           <w:szCs w:val="32"/>
         </w:rPr>
-      </w:pPr>
-      <w:r>
-        <w:rPr>
-          <w:color w:val="000000"/>
-          <w:sz w:val="32"/>
-          <w:szCs w:val="32"/>
-        </w:rPr>
-        <w:t>Кнопка написать на почту в самом низу работает плохо</w:t>
-      </w:r>
-      <w:r>
-        <w:rPr>
-          <w:color w:val="000000"/>
-          <w:sz w:val="32"/>
-          <w:szCs w:val="32"/>
-        </w:rPr>
-        <w:t xml:space="preserve"> (нужно убрать оттуда копирование)</w:t>
-      </w:r>
-      <w:r>
-        <w:rPr>
-          <w:sz w:val="32"/>
-          <w:szCs w:val="32"/>
+        <w:t>хабре</w:t>
+      </w:r>
+      <w:proofErr w:type="spellEnd"/>
+    </w:p>
+    <w:p>
+      <w:pPr>
+        <w:spacing w:after="0" w:line="360" w:lineRule="auto"/>
+        <w:jc w:val="both"/>
+        <w:rPr>
+          <w:szCs w:val="24"/>
+        </w:rPr>
+      </w:pPr>
+    </w:p>
+    <w:p>
+      <w:pPr>
+        <w:spacing w:after="0" w:line="360" w:lineRule="auto"/>
+        <w:jc w:val="both"/>
+        <w:rPr>
+          <w:szCs w:val="24"/>
+        </w:rPr>
+      </w:pPr>
+    </w:p>
+    <w:p>
+      <w:pPr>
+        <w:spacing w:after="0" w:line="360" w:lineRule="auto"/>
+        <w:jc w:val="both"/>
+        <w:rPr>
+          <w:szCs w:val="24"/>
+        </w:rPr>
+      </w:pPr>
+    </w:p>
+    <w:p>
+      <w:pPr>
+        <w:spacing w:after="0" w:line="360" w:lineRule="auto"/>
+        <w:jc w:val="both"/>
+        <w:rPr>
+          <w:szCs w:val="24"/>
+        </w:rPr>
+      </w:pPr>
+      <w:r>
+        <w:rPr>
+          <w:szCs w:val="24"/>
+        </w:rPr>
+        <w:t>Страницы:</w:t>
+      </w:r>
+    </w:p>
+    <w:p>
+      <w:pPr>
+        <w:spacing w:after="0" w:line="360" w:lineRule="auto"/>
+        <w:jc w:val="both"/>
+        <w:rPr>
+          <w:color w:val="00B050"/>
+          <w:szCs w:val="24"/>
+        </w:rPr>
+      </w:pPr>
+      <w:r>
+        <w:rPr>
+          <w:color w:val="00B050"/>
+          <w:szCs w:val="24"/>
+        </w:rPr>
+        <w:t>Главная страница</w:t>
+      </w:r>
+    </w:p>
+    <w:p>
+      <w:pPr>
+        <w:spacing w:after="0" w:line="360" w:lineRule="auto"/>
+        <w:jc w:val="both"/>
+        <w:rPr>
+          <w:color w:val="00B050"/>
+          <w:szCs w:val="24"/>
+        </w:rPr>
+      </w:pPr>
+      <w:r>
+        <w:rPr>
+          <w:color w:val="00B050"/>
+          <w:szCs w:val="24"/>
+        </w:rPr>
+        <w:t>Каталог товаров</w:t>
+      </w:r>
+      <w:r>
+        <w:rPr>
+          <w:color w:val="00B050"/>
+          <w:szCs w:val="24"/>
+        </w:rPr>
+        <w:t xml:space="preserve"> (</w:t>
+      </w:r>
+      <w:proofErr w:type="spellStart"/>
+      <w:r>
+        <w:rPr>
+          <w:color w:val="00B050"/>
+          <w:szCs w:val="24"/>
+          <w:lang w:val="en-US"/>
+        </w:rPr>
+        <w:t>webtest</w:t>
+      </w:r>
+      <w:proofErr w:type="spellEnd"/>
+      <w:r>
+        <w:rPr>
+          <w:color w:val="00B050"/>
+          <w:szCs w:val="24"/>
+        </w:rPr>
+        <w:t xml:space="preserve"> – </w:t>
+      </w:r>
+      <w:r>
+        <w:rPr>
+          <w:color w:val="00B050"/>
+          <w:szCs w:val="24"/>
+          <w:lang w:val="en-US"/>
+        </w:rPr>
+        <w:t>views</w:t>
+      </w:r>
+      <w:r>
+        <w:rPr>
+          <w:color w:val="00B050"/>
+          <w:szCs w:val="24"/>
+        </w:rPr>
+        <w:t xml:space="preserve"> – </w:t>
+      </w:r>
+      <w:r>
+        <w:rPr>
+          <w:color w:val="00B050"/>
+          <w:szCs w:val="24"/>
+          <w:lang w:val="en-US"/>
+        </w:rPr>
+        <w:t>product</w:t>
+      </w:r>
+      <w:r>
+        <w:rPr>
+          <w:color w:val="00B050"/>
+          <w:szCs w:val="24"/>
+        </w:rPr>
+        <w:t xml:space="preserve"> – </w:t>
+      </w:r>
+      <w:r>
+        <w:rPr>
+          <w:color w:val="00B050"/>
+          <w:szCs w:val="24"/>
+          <w:lang w:val="en-US"/>
+        </w:rPr>
+        <w:t>index</w:t>
+      </w:r>
+      <w:r>
+        <w:rPr>
+          <w:color w:val="00B050"/>
+          <w:szCs w:val="24"/>
+        </w:rPr>
+        <w:t>)</w:t>
+      </w:r>
+    </w:p>
+    <w:p>
+      <w:pPr>
+        <w:spacing w:after="0" w:line="360" w:lineRule="auto"/>
+        <w:jc w:val="both"/>
+        <w:rPr>
+          <w:color w:val="00B050"/>
+          <w:szCs w:val="24"/>
+          <w:lang w:val="en-US"/>
+        </w:rPr>
+      </w:pPr>
+      <w:r>
+        <w:rPr>
+          <w:color w:val="00B050"/>
+          <w:szCs w:val="24"/>
+        </w:rPr>
+        <w:t>Подробнее</w:t>
+      </w:r>
+      <w:r>
+        <w:rPr>
+          <w:color w:val="00B050"/>
+          <w:szCs w:val="24"/>
+          <w:lang w:val="en-US"/>
         </w:rPr>
         <w:t xml:space="preserve"> </w:t>
       </w:r>
-    </w:p>
-    <w:p>
-      <w:pPr>
-        <w:pStyle w:val="a3"/>
-        <w:numPr>
-          <w:ilvl w:val="0"/>
-          <w:numId w:val="4"/>
-        </w:numPr>
-        <w:spacing w:after="0" w:line="360" w:lineRule="auto"/>
-        <w:jc w:val="both"/>
-        <w:rPr>
-          <w:sz w:val="32"/>
-          <w:szCs w:val="32"/>
-        </w:rPr>
-      </w:pPr>
-      <w:r>
-        <w:rPr>
-          <w:sz w:val="32"/>
-          <w:szCs w:val="32"/>
-        </w:rPr>
-        <w:t>Новости в виде поста с картинками как на хабре</w:t>
-      </w:r>
-    </w:p>
-    <w:p>
-      <w:pPr>
-        <w:spacing w:after="0" w:line="360" w:lineRule="auto"/>
-        <w:jc w:val="both"/>
-        <w:rPr>
-          <w:szCs w:val="24"/>
-        </w:rPr>
-      </w:pPr>
-    </w:p>
-    <w:p>
-      <w:pPr>
-        <w:spacing w:after="0" w:line="360" w:lineRule="auto"/>
-        <w:jc w:val="both"/>
-        <w:rPr>
-          <w:szCs w:val="24"/>
-        </w:rPr>
-      </w:pPr>
-    </w:p>
-    <w:p>
-      <w:pPr>
-        <w:spacing w:after="0" w:line="360" w:lineRule="auto"/>
-        <w:jc w:val="both"/>
-        <w:rPr>
-          <w:szCs w:val="24"/>
-        </w:rPr>
-      </w:pPr>
-    </w:p>
-    <w:p>
-      <w:pPr>
-        <w:spacing w:after="0" w:line="360" w:lineRule="auto"/>
-        <w:jc w:val="both"/>
-        <w:rPr>
-          <w:szCs w:val="24"/>
-        </w:rPr>
-      </w:pPr>
-      <w:r>
-        <w:rPr>
-          <w:szCs w:val="24"/>
-        </w:rPr>
-        <w:t>Страницы:</w:t>
-      </w:r>
-    </w:p>
-    <w:p>
-      <w:pPr>
-        <w:spacing w:after="0" w:line="360" w:lineRule="auto"/>
-        <w:jc w:val="both"/>
-        <w:rPr>
-          <w:color w:val="00B050"/>
-          <w:szCs w:val="24"/>
-        </w:rPr>
-      </w:pPr>
-      <w:r>
-        <w:rPr>
-          <w:color w:val="00B050"/>
-          <w:szCs w:val="24"/>
-        </w:rPr>
-        <w:t>Главная страница</w:t>
-      </w:r>
-    </w:p>
-    <w:p>
-      <w:pPr>
-        <w:spacing w:after="0" w:line="360" w:lineRule="auto"/>
-        <w:jc w:val="both"/>
-        <w:rPr>
-          <w:color w:val="00B050"/>
-          <w:szCs w:val="24"/>
-        </w:rPr>
-      </w:pPr>
-      <w:r>
-        <w:rPr>
-          <w:color w:val="00B050"/>
-          <w:szCs w:val="24"/>
-        </w:rPr>
-        <w:t>Каталог товаров</w:t>
-      </w:r>
-      <w:r>
-        <w:rPr>
-          <w:color w:val="00B050"/>
-          <w:szCs w:val="24"/>
+      <w:r>
+        <w:rPr>
+          <w:color w:val="00B050"/>
+          <w:szCs w:val="24"/>
+        </w:rPr>
+        <w:t>о</w:t>
+      </w:r>
+      <w:r>
+        <w:rPr>
+          <w:color w:val="00B050"/>
+          <w:szCs w:val="24"/>
+          <w:lang w:val="en-US"/>
+        </w:rPr>
+        <w:t xml:space="preserve"> </w:t>
+      </w:r>
+      <w:r>
+        <w:rPr>
+          <w:color w:val="00B050"/>
+          <w:szCs w:val="24"/>
+        </w:rPr>
+        <w:t>товаре</w:t>
+      </w:r>
+      <w:r>
+        <w:rPr>
+          <w:color w:val="00B050"/>
+          <w:szCs w:val="24"/>
+          <w:lang w:val="en-US"/>
         </w:rPr>
         <w:t xml:space="preserve"> (</w:t>
       </w:r>
+      <w:proofErr w:type="spellStart"/>
       <w:r>
         <w:rPr>
           <w:color w:val="00B050"/>
@@ -300,113 +365,14 @@
         </w:rPr>
         <w:t>webtest</w:t>
       </w:r>
-      <w:r>
-        <w:rPr>
-          <w:color w:val="00B050"/>
-          <w:szCs w:val="24"/>
-        </w:rPr>
-        <w:t xml:space="preserve"> – </w:t>
-      </w:r>
+      <w:proofErr w:type="spellEnd"/>
       <w:r>
         <w:rPr>
           <w:color w:val="00B050"/>
           <w:szCs w:val="24"/>
           <w:lang w:val="en-US"/>
         </w:rPr>
-        <w:t>views</w:t>
-      </w:r>
-      <w:r>
-        <w:rPr>
-          <w:color w:val="00B050"/>
-          <w:szCs w:val="24"/>
-        </w:rPr>
-        <w:t xml:space="preserve"> – </w:t>
-      </w:r>
-      <w:r>
-        <w:rPr>
-          <w:color w:val="00B050"/>
-          <w:szCs w:val="24"/>
-          <w:lang w:val="en-US"/>
-        </w:rPr>
-        <w:t>product</w:t>
-      </w:r>
-      <w:r>
-        <w:rPr>
-          <w:color w:val="00B050"/>
-          <w:szCs w:val="24"/>
-        </w:rPr>
-        <w:t xml:space="preserve"> – </w:t>
-      </w:r>
-      <w:r>
-        <w:rPr>
-          <w:color w:val="00B050"/>
-          <w:szCs w:val="24"/>
-          <w:lang w:val="en-US"/>
-        </w:rPr>
-        <w:t>index</w:t>
-      </w:r>
-      <w:r>
-        <w:rPr>
-          <w:color w:val="00B050"/>
-          <w:szCs w:val="24"/>
-        </w:rPr>
-        <w:t>)</w:t>
-      </w:r>
-    </w:p>
-    <w:p>
-      <w:pPr>
-        <w:spacing w:after="0" w:line="360" w:lineRule="auto"/>
-        <w:jc w:val="both"/>
-        <w:rPr>
-          <w:color w:val="00B050"/>
-          <w:szCs w:val="24"/>
-          <w:lang w:val="en-US"/>
-        </w:rPr>
-      </w:pPr>
-      <w:r>
-        <w:rPr>
-          <w:color w:val="00B050"/>
-          <w:szCs w:val="24"/>
-        </w:rPr>
-        <w:t>Подробнее</w:t>
-      </w:r>
-      <w:r>
-        <w:rPr>
-          <w:color w:val="00B050"/>
-          <w:szCs w:val="24"/>
-          <w:lang w:val="en-US"/>
-        </w:rPr>
-        <w:t xml:space="preserve"> </w:t>
-      </w:r>
-      <w:r>
-        <w:rPr>
-          <w:color w:val="00B050"/>
-          <w:szCs w:val="24"/>
-        </w:rPr>
-        <w:t>о</w:t>
-      </w:r>
-      <w:r>
-        <w:rPr>
-          <w:color w:val="00B050"/>
-          <w:szCs w:val="24"/>
-          <w:lang w:val="en-US"/>
-        </w:rPr>
-        <w:t xml:space="preserve"> </w:t>
-      </w:r>
-      <w:r>
-        <w:rPr>
-          <w:color w:val="00B050"/>
-          <w:szCs w:val="24"/>
-        </w:rPr>
-        <w:t>товаре</w:t>
-      </w:r>
-      <w:r>
-        <w:rPr>
-          <w:color w:val="00B050"/>
-          <w:szCs w:val="24"/>
-          <w:lang w:val="en-US"/>
-        </w:rPr>
-        <w:t xml:space="preserve"> (webtest – views – product – index)</w:t>
+        <w:t xml:space="preserve"> – views – product – index)</w:t>
       </w:r>
     </w:p>
     <w:p>
@@ -616,11 +582,19 @@
           <w:color w:val="00B050"/>
         </w:rPr>
       </w:pPr>
-      <w:r>
-        <w:rPr>
-          <w:color w:val="00B050"/>
-        </w:rPr>
-        <w:t>Превьюшка, как на аналогов нет</w:t>
+      <w:proofErr w:type="spellStart"/>
+      <w:r>
+        <w:rPr>
+          <w:color w:val="00B050"/>
+        </w:rPr>
+        <w:t>Превьюшка</w:t>
+      </w:r>
+      <w:proofErr w:type="spellEnd"/>
+      <w:r>
+        <w:rPr>
+          <w:color w:val="00B050"/>
+        </w:rPr>
+        <w:t>, как на аналогов нет</w:t>
       </w:r>
     </w:p>
     <w:p>
@@ -674,7 +648,6 @@
           <w:color w:val="00B050"/>
           <w:szCs w:val="24"/>
         </w:rPr>
-        <w:lastRenderedPageBreak/>
         <w:t xml:space="preserve">Новости (смотри сайт </w:t>
       </w:r>
       <w:r>
@@ -759,6 +732,7 @@
         <w:rPr>
           <w:color w:val="00B050"/>
         </w:rPr>
+        <w:lastRenderedPageBreak/>
         <w:t xml:space="preserve">Кнопка «О </w:t>
       </w:r>
       <w:r>
@@ -1059,7 +1033,21 @@
         <w:rPr>
           <w:color w:val="00B050"/>
         </w:rPr>
-        <w:t>Как с вебтеста пока что взять</w:t>
+        <w:t xml:space="preserve">Как с </w:t>
+      </w:r>
+      <w:proofErr w:type="spellStart"/>
+      <w:r>
+        <w:rPr>
+          <w:color w:val="00B050"/>
+        </w:rPr>
+        <w:t>вебтеста</w:t>
+      </w:r>
+      <w:proofErr w:type="spellEnd"/>
+      <w:r>
+        <w:rPr>
+          <w:color w:val="00B050"/>
+        </w:rPr>
+        <w:t xml:space="preserve"> пока что взять</w:t>
       </w:r>
     </w:p>
     <w:p>
@@ -1091,12 +1079,14 @@
       <w:r>
         <w:t xml:space="preserve">Сайт </w:t>
       </w:r>
+      <w:proofErr w:type="spellStart"/>
       <w:r>
         <w:rPr>
           <w:lang w:val="en-US"/>
         </w:rPr>
         <w:t>inwave</w:t>
       </w:r>
+      <w:proofErr w:type="spellEnd"/>
     </w:p>
     <w:p>
       <w:pPr>

</xml_diff>